<commit_message>
docs(memoria): incorporar figuras de avaliación (MAE, ROC, calibración, curva de olvido, simulación)
</commit_message>
<xml_diff>
--- a/TFM/TFM Galingo Ver 4.0.docx
+++ b/TFM/TFM Galingo Ver 4.0.docx
@@ -13437,6 +13437,370 @@
     </w:p>
     <w:p>
       <w:pPr>
+        <w:pStyle w:val="BodyText"/>
+      </w:pPr>
+      <w:r>
+        <w:rPr>
+          <w:b/>
+          <w:bCs/>
+        </w:rPr>
+        <w:t xml:space="preserve">Figuras.</w:t>
+      </w:r>
+      <w:r>
+        <w:t xml:space="preserve"> </w:t>
+      </w:r>
+      <w:r>
+        <w:t xml:space="preserve">Error de predicción, curva ROC y calibración sobre datos reales:</w:t>
+      </w:r>
+    </w:p>
+    <w:p>
+      <w:pPr>
+        <w:pStyle w:val="CaptionedFigure"/>
+      </w:pPr>
+      <w:r>
+        <w:drawing>
+          <wp:inline>
+            <wp:extent cx="5334000" cy="3556000"/>
+            <wp:effectExtent b="0" l="0" r="0" t="0"/>
+            <wp:docPr descr="Error de predicción HLR vs SM-2 (datos reales)" title="" id="70" name="Picture"/>
+            <a:graphic>
+              <a:graphicData uri="http://schemas.openxmlformats.org/drawingml/2006/picture">
+                <pic:pic>
+                  <pic:nvPicPr>
+                    <pic:cNvPr descr="figuras/fig_mae_rmse.png" id="71" name="Picture"/>
+                    <pic:cNvPicPr>
+                      <a:picLocks noChangeArrowheads="1" noChangeAspect="1"/>
+                    </pic:cNvPicPr>
+                  </pic:nvPicPr>
+                  <pic:blipFill>
+                    <a:blip r:embed="rId69"/>
+                    <a:stretch>
+                      <a:fillRect/>
+                    </a:stretch>
+                  </pic:blipFill>
+                  <pic:spPr bwMode="auto">
+                    <a:xfrm>
+                      <a:off x="0" y="0"/>
+                      <a:ext cx="5334000" cy="3556000"/>
+                    </a:xfrm>
+                    <a:prstGeom prst="rect">
+                      <a:avLst/>
+                    </a:prstGeom>
+                    <a:noFill/>
+                    <a:ln w="9525">
+                      <a:noFill/>
+                      <a:headEnd/>
+                      <a:tailEnd/>
+                    </a:ln>
+                  </pic:spPr>
+                </pic:pic>
+              </a:graphicData>
+            </a:graphic>
+          </wp:inline>
+        </w:drawing>
+      </w:r>
+    </w:p>
+    <w:p>
+      <w:pPr>
+        <w:pStyle w:val="ImageCaption"/>
+      </w:pPr>
+      <w:r>
+        <w:t xml:space="preserve">Error de predicción HLR vs SM-2 (datos reales)</w:t>
+      </w:r>
+    </w:p>
+    <w:p>
+      <w:pPr>
+        <w:pStyle w:val="CaptionedFigure"/>
+      </w:pPr>
+      <w:r>
+        <w:drawing>
+          <wp:inline>
+            <wp:extent cx="4572000" cy="4572000"/>
+            <wp:effectExtent b="0" l="0" r="0" t="0"/>
+            <wp:docPr descr="Curva ROC (datos reales)" title="" id="73" name="Picture"/>
+            <a:graphic>
+              <a:graphicData uri="http://schemas.openxmlformats.org/drawingml/2006/picture">
+                <pic:pic>
+                  <pic:nvPicPr>
+                    <pic:cNvPr descr="figuras/fig_roc.png" id="74" name="Picture"/>
+                    <pic:cNvPicPr>
+                      <a:picLocks noChangeArrowheads="1" noChangeAspect="1"/>
+                    </pic:cNvPicPr>
+                  </pic:nvPicPr>
+                  <pic:blipFill>
+                    <a:blip r:embed="rId72"/>
+                    <a:stretch>
+                      <a:fillRect/>
+                    </a:stretch>
+                  </pic:blipFill>
+                  <pic:spPr bwMode="auto">
+                    <a:xfrm>
+                      <a:off x="0" y="0"/>
+                      <a:ext cx="4572000" cy="4572000"/>
+                    </a:xfrm>
+                    <a:prstGeom prst="rect">
+                      <a:avLst/>
+                    </a:prstGeom>
+                    <a:noFill/>
+                    <a:ln w="9525">
+                      <a:noFill/>
+                      <a:headEnd/>
+                      <a:tailEnd/>
+                    </a:ln>
+                  </pic:spPr>
+                </pic:pic>
+              </a:graphicData>
+            </a:graphic>
+          </wp:inline>
+        </w:drawing>
+      </w:r>
+    </w:p>
+    <w:p>
+      <w:pPr>
+        <w:pStyle w:val="ImageCaption"/>
+      </w:pPr>
+      <w:r>
+        <w:t xml:space="preserve">Curva ROC (datos reales)</w:t>
+      </w:r>
+    </w:p>
+    <w:p>
+      <w:pPr>
+        <w:pStyle w:val="CaptionedFigure"/>
+      </w:pPr>
+      <w:r>
+        <w:drawing>
+          <wp:inline>
+            <wp:extent cx="4572000" cy="4572000"/>
+            <wp:effectExtent b="0" l="0" r="0" t="0"/>
+            <wp:docPr descr="Curva de calibración (datos reales)" title="" id="76" name="Picture"/>
+            <a:graphic>
+              <a:graphicData uri="http://schemas.openxmlformats.org/drawingml/2006/picture">
+                <pic:pic>
+                  <pic:nvPicPr>
+                    <pic:cNvPr descr="figuras/fig_calibracion.png" id="77" name="Picture"/>
+                    <pic:cNvPicPr>
+                      <a:picLocks noChangeArrowheads="1" noChangeAspect="1"/>
+                    </pic:cNvPicPr>
+                  </pic:nvPicPr>
+                  <pic:blipFill>
+                    <a:blip r:embed="rId75"/>
+                    <a:stretch>
+                      <a:fillRect/>
+                    </a:stretch>
+                  </pic:blipFill>
+                  <pic:spPr bwMode="auto">
+                    <a:xfrm>
+                      <a:off x="0" y="0"/>
+                      <a:ext cx="4572000" cy="4572000"/>
+                    </a:xfrm>
+                    <a:prstGeom prst="rect">
+                      <a:avLst/>
+                    </a:prstGeom>
+                    <a:noFill/>
+                    <a:ln w="9525">
+                      <a:noFill/>
+                      <a:headEnd/>
+                      <a:tailEnd/>
+                    </a:ln>
+                  </pic:spPr>
+                </pic:pic>
+              </a:graphicData>
+            </a:graphic>
+          </wp:inline>
+        </w:drawing>
+      </w:r>
+    </w:p>
+    <w:p>
+      <w:pPr>
+        <w:pStyle w:val="ImageCaption"/>
+      </w:pPr>
+      <w:r>
+        <w:t xml:space="preserve">Curva de calibración (datos reales)</w:t>
+      </w:r>
+    </w:p>
+    <w:p>
+      <w:pPr>
+        <w:pStyle w:val="FirstParagraph"/>
+      </w:pPr>
+      <w:r>
+        <w:t xml:space="preserve">Curva de olvido observada frente a la predicha por HLR (datos reales):</w:t>
+      </w:r>
+    </w:p>
+    <w:p>
+      <w:pPr>
+        <w:pStyle w:val="CaptionedFigure"/>
+      </w:pPr>
+      <w:r>
+        <w:drawing>
+          <wp:inline>
+            <wp:extent cx="5334000" cy="3556000"/>
+            <wp:effectExtent b="0" l="0" r="0" t="0"/>
+            <wp:docPr descr="Curva de olvido observada vs predicha" title="" id="79" name="Picture"/>
+            <a:graphic>
+              <a:graphicData uri="http://schemas.openxmlformats.org/drawingml/2006/picture">
+                <pic:pic>
+                  <pic:nvPicPr>
+                    <pic:cNvPr descr="figuras/fig_retencion.png" id="80" name="Picture"/>
+                    <pic:cNvPicPr>
+                      <a:picLocks noChangeArrowheads="1" noChangeAspect="1"/>
+                    </pic:cNvPicPr>
+                  </pic:nvPicPr>
+                  <pic:blipFill>
+                    <a:blip r:embed="rId78"/>
+                    <a:stretch>
+                      <a:fillRect/>
+                    </a:stretch>
+                  </pic:blipFill>
+                  <pic:spPr bwMode="auto">
+                    <a:xfrm>
+                      <a:off x="0" y="0"/>
+                      <a:ext cx="5334000" cy="3556000"/>
+                    </a:xfrm>
+                    <a:prstGeom prst="rect">
+                      <a:avLst/>
+                    </a:prstGeom>
+                    <a:noFill/>
+                    <a:ln w="9525">
+                      <a:noFill/>
+                      <a:headEnd/>
+                      <a:tailEnd/>
+                    </a:ln>
+                  </pic:spPr>
+                </pic:pic>
+              </a:graphicData>
+            </a:graphic>
+          </wp:inline>
+        </w:drawing>
+      </w:r>
+    </w:p>
+    <w:p>
+      <w:pPr>
+        <w:pStyle w:val="ImageCaption"/>
+      </w:pPr>
+      <w:r>
+        <w:t xml:space="preserve">Curva de olvido observada vs predicha</w:t>
+      </w:r>
+    </w:p>
+    <w:p>
+      <w:pPr>
+        <w:pStyle w:val="FirstParagraph"/>
+      </w:pPr>
+      <w:r>
+        <w:t xml:space="preserve">Simulación con verdad conocida (intervalos aleatorios): ROC y calibración:</w:t>
+      </w:r>
+    </w:p>
+    <w:p>
+      <w:pPr>
+        <w:pStyle w:val="CaptionedFigure"/>
+      </w:pPr>
+      <w:r>
+        <w:drawing>
+          <wp:inline>
+            <wp:extent cx="4572000" cy="4572000"/>
+            <wp:effectExtent b="0" l="0" r="0" t="0"/>
+            <wp:docPr descr="Simulación: curva ROC" title="" id="82" name="Picture"/>
+            <a:graphic>
+              <a:graphicData uri="http://schemas.openxmlformats.org/drawingml/2006/picture">
+                <pic:pic>
+                  <pic:nvPicPr>
+                    <pic:cNvPr descr="figuras/sim_roc.png" id="83" name="Picture"/>
+                    <pic:cNvPicPr>
+                      <a:picLocks noChangeArrowheads="1" noChangeAspect="1"/>
+                    </pic:cNvPicPr>
+                  </pic:nvPicPr>
+                  <pic:blipFill>
+                    <a:blip r:embed="rId81"/>
+                    <a:stretch>
+                      <a:fillRect/>
+                    </a:stretch>
+                  </pic:blipFill>
+                  <pic:spPr bwMode="auto">
+                    <a:xfrm>
+                      <a:off x="0" y="0"/>
+                      <a:ext cx="4572000" cy="4572000"/>
+                    </a:xfrm>
+                    <a:prstGeom prst="rect">
+                      <a:avLst/>
+                    </a:prstGeom>
+                    <a:noFill/>
+                    <a:ln w="9525">
+                      <a:noFill/>
+                      <a:headEnd/>
+                      <a:tailEnd/>
+                    </a:ln>
+                  </pic:spPr>
+                </pic:pic>
+              </a:graphicData>
+            </a:graphic>
+          </wp:inline>
+        </w:drawing>
+      </w:r>
+    </w:p>
+    <w:p>
+      <w:pPr>
+        <w:pStyle w:val="ImageCaption"/>
+      </w:pPr>
+      <w:r>
+        <w:t xml:space="preserve">Simulación: curva ROC</w:t>
+      </w:r>
+    </w:p>
+    <w:p>
+      <w:pPr>
+        <w:pStyle w:val="CaptionedFigure"/>
+      </w:pPr>
+      <w:r>
+        <w:drawing>
+          <wp:inline>
+            <wp:extent cx="4572000" cy="4572000"/>
+            <wp:effectExtent b="0" l="0" r="0" t="0"/>
+            <wp:docPr descr="Simulación: calibración" title="" id="85" name="Picture"/>
+            <a:graphic>
+              <a:graphicData uri="http://schemas.openxmlformats.org/drawingml/2006/picture">
+                <pic:pic>
+                  <pic:nvPicPr>
+                    <pic:cNvPr descr="figuras/sim_calibracion.png" id="86" name="Picture"/>
+                    <pic:cNvPicPr>
+                      <a:picLocks noChangeArrowheads="1" noChangeAspect="1"/>
+                    </pic:cNvPicPr>
+                  </pic:nvPicPr>
+                  <pic:blipFill>
+                    <a:blip r:embed="rId84"/>
+                    <a:stretch>
+                      <a:fillRect/>
+                    </a:stretch>
+                  </pic:blipFill>
+                  <pic:spPr bwMode="auto">
+                    <a:xfrm>
+                      <a:off x="0" y="0"/>
+                      <a:ext cx="4572000" cy="4572000"/>
+                    </a:xfrm>
+                    <a:prstGeom prst="rect">
+                      <a:avLst/>
+                    </a:prstGeom>
+                    <a:noFill/>
+                    <a:ln w="9525">
+                      <a:noFill/>
+                      <a:headEnd/>
+                      <a:tailEnd/>
+                    </a:ln>
+                  </pic:spPr>
+                </pic:pic>
+              </a:graphicData>
+            </a:graphic>
+          </wp:inline>
+        </w:drawing>
+      </w:r>
+    </w:p>
+    <w:p>
+      <w:pPr>
+        <w:pStyle w:val="ImageCaption"/>
+      </w:pPr>
+      <w:r>
+        <w:t xml:space="preserve">Simulación: calibración</w:t>
+      </w:r>
+    </w:p>
+    <w:p>
+      <w:pPr>
         <w:pStyle w:val="BlockText"/>
       </w:pPr>
       <w:r>
@@ -13463,11 +13827,11 @@
       <w:pPr>
         <w:pStyle w:val="Heading2"/>
       </w:pPr>
-      <w:bookmarkStart w:id="69" w:name="_3346fc10e65fbc61e848ed09a5edc0f67a01927"/>
+      <w:bookmarkStart w:id="87" w:name="_3346fc10e65fbc61e848ed09a5edc0f67a01927"/>
       <w:r>
         <w:t xml:space="preserve">9.5 Validación de la capa de voz</w:t>
       </w:r>
-      <w:bookmarkEnd w:id="69"/>
+      <w:bookmarkEnd w:id="87"/>
     </w:p>
     <w:p>
       <w:pPr>
@@ -13804,11 +14168,11 @@
       <w:pPr>
         <w:pStyle w:val="Heading2"/>
       </w:pPr>
-      <w:bookmarkStart w:id="70" w:name="_5d693d5222d672587b7b7ebddc53209f99f7690"/>
+      <w:bookmarkStart w:id="88" w:name="_5d693d5222d672587b7b7ebddc53209f99f7690"/>
       <w:r>
         <w:t xml:space="preserve">9.6 Estado de las hipótesis</w:t>
       </w:r>
-      <w:bookmarkEnd w:id="70"/>
+      <w:bookmarkEnd w:id="88"/>
     </w:p>
     <w:p>
       <w:pPr>
@@ -13875,11 +14239,11 @@
       <w:pPr>
         <w:pStyle w:val="Heading2"/>
       </w:pPr>
-      <w:bookmarkStart w:id="71" w:name="_f23831c7b6a366a42d7fc1a798d379c198c1953"/>
+      <w:bookmarkStart w:id="89" w:name="_f23831c7b6a366a42d7fc1a798d379c198c1953"/>
       <w:r>
         <w:t xml:space="preserve">9.7 Interpretación y decisiones derivadas</w:t>
       </w:r>
-      <w:bookmarkEnd w:id="71"/>
+      <w:bookmarkEnd w:id="89"/>
     </w:p>
     <w:p>
       <w:pPr>
@@ -14010,21 +14374,21 @@
       <w:pPr>
         <w:pStyle w:val="Heading1"/>
       </w:pPr>
-      <w:bookmarkStart w:id="72" w:name="_2513f1cfafad6e168e691196780263f573f0e3c"/>
+      <w:bookmarkStart w:id="90" w:name="_2513f1cfafad6e168e691196780263f573f0e3c"/>
       <w:r>
         <w:t xml:space="preserve">10. Verificación y calidad del software</w:t>
       </w:r>
-      <w:bookmarkEnd w:id="72"/>
+      <w:bookmarkEnd w:id="90"/>
     </w:p>
     <w:p>
       <w:pPr>
         <w:pStyle w:val="Heading2"/>
       </w:pPr>
-      <w:bookmarkStart w:id="73" w:name="_a238a5a8cb3f42f967916ed2157f0004aad70b3"/>
+      <w:bookmarkStart w:id="91" w:name="_a238a5a8cb3f42f967916ed2157f0004aad70b3"/>
       <w:r>
         <w:t xml:space="preserve">10.1 Estrategia de verificación</w:t>
       </w:r>
-      <w:bookmarkEnd w:id="73"/>
+      <w:bookmarkEnd w:id="91"/>
     </w:p>
     <w:p>
       <w:pPr>
@@ -14119,11 +14483,11 @@
       <w:pPr>
         <w:pStyle w:val="Heading2"/>
       </w:pPr>
-      <w:bookmarkStart w:id="74" w:name="_7b7a73e0518380d71791912246da32213184fe5"/>
+      <w:bookmarkStart w:id="92" w:name="_7b7a73e0518380d71791912246da32213184fe5"/>
       <w:r>
         <w:t xml:space="preserve">10.2 Matriz de trazabilidad</w:t>
       </w:r>
-      <w:bookmarkEnd w:id="74"/>
+      <w:bookmarkEnd w:id="92"/>
     </w:p>
     <w:p>
       <w:pPr>
@@ -14137,11 +14501,11 @@
       <w:pPr>
         <w:pStyle w:val="Heading2"/>
       </w:pPr>
-      <w:bookmarkStart w:id="75" w:name="_c3afa5a4cc55d0e4e4d7b16bd1a26528b83b09b"/>
+      <w:bookmarkStart w:id="93" w:name="_c3afa5a4cc55d0e4e4d7b16bd1a26528b83b09b"/>
       <w:r>
         <w:t xml:space="preserve">10.3 Cobertura funcional de las pruebas</w:t>
       </w:r>
-      <w:bookmarkEnd w:id="75"/>
+      <w:bookmarkEnd w:id="93"/>
     </w:p>
     <w:p>
       <w:pPr>
@@ -14662,11 +15026,11 @@
       <w:pPr>
         <w:pStyle w:val="Heading2"/>
       </w:pPr>
-      <w:bookmarkStart w:id="76" w:name="_9efd597a2a2908dec8bfb2d064968508b0643b1"/>
+      <w:bookmarkStart w:id="94" w:name="_9efd597a2a2908dec8bfb2d064968508b0643b1"/>
       <w:r>
         <w:t xml:space="preserve">10.4 Prueba de aceptación</w:t>
       </w:r>
-      <w:bookmarkEnd w:id="76"/>
+      <w:bookmarkEnd w:id="94"/>
     </w:p>
     <w:p>
       <w:pPr>
@@ -14680,11 +15044,11 @@
       <w:pPr>
         <w:pStyle w:val="Heading2"/>
       </w:pPr>
-      <w:bookmarkStart w:id="77" w:name="_d4b3cbf0a100ddc80782ec4a69c34c6ec5e08e3"/>
+      <w:bookmarkStart w:id="95" w:name="_d4b3cbf0a100ddc80782ec4a69c34c6ec5e08e3"/>
       <w:r>
         <w:t xml:space="preserve">10.5 Reproducibilidad</w:t>
       </w:r>
-      <w:bookmarkEnd w:id="77"/>
+      <w:bookmarkEnd w:id="95"/>
     </w:p>
     <w:p>
       <w:pPr>
@@ -14711,21 +15075,21 @@
       <w:pPr>
         <w:pStyle w:val="Heading1"/>
       </w:pPr>
-      <w:bookmarkStart w:id="78" w:name="_772b4b57d5248a6aeba453332574a9d19b3abe3"/>
+      <w:bookmarkStart w:id="96" w:name="_772b4b57d5248a6aeba453332574a9d19b3abe3"/>
       <w:r>
         <w:t xml:space="preserve">11. Manual de instalación y uso</w:t>
       </w:r>
-      <w:bookmarkEnd w:id="78"/>
+      <w:bookmarkEnd w:id="96"/>
     </w:p>
     <w:p>
       <w:pPr>
         <w:pStyle w:val="Heading2"/>
       </w:pPr>
-      <w:bookmarkStart w:id="79" w:name="_32e1c626b6469e8b319d0f628f80b3df4b6c190"/>
+      <w:bookmarkStart w:id="97" w:name="_32e1c626b6469e8b319d0f628f80b3df4b6c190"/>
       <w:r>
         <w:t xml:space="preserve">11.1 Requisitos previos</w:t>
       </w:r>
-      <w:bookmarkEnd w:id="79"/>
+      <w:bookmarkEnd w:id="97"/>
     </w:p>
     <w:tbl>
       <w:tblPr>
@@ -14889,11 +15253,11 @@
       <w:pPr>
         <w:pStyle w:val="Heading2"/>
       </w:pPr>
-      <w:bookmarkStart w:id="80" w:name="_26d40383c0ac3a6be887258a6ead949be85ec8e"/>
+      <w:bookmarkStart w:id="98" w:name="_26d40383c0ac3a6be887258a6ead949be85ec8e"/>
       <w:r>
         <w:t xml:space="preserve">11.2 Despliegue del backend</w:t>
       </w:r>
-      <w:bookmarkEnd w:id="80"/>
+      <w:bookmarkEnd w:id="98"/>
     </w:p>
     <w:p>
       <w:pPr>
@@ -15012,11 +15376,11 @@
       <w:pPr>
         <w:pStyle w:val="Heading2"/>
       </w:pPr>
-      <w:bookmarkStart w:id="81" w:name="_a09dc28ef2429b9a8b307ba71f5944e6f01a75d"/>
+      <w:bookmarkStart w:id="99" w:name="_a09dc28ef2429b9a8b307ba71f5944e6f01a75d"/>
       <w:r>
         <w:t xml:space="preserve">11.3 Compilación y distribución de la app</w:t>
       </w:r>
-      <w:bookmarkEnd w:id="81"/>
+      <w:bookmarkEnd w:id="99"/>
     </w:p>
     <w:p>
       <w:pPr>
@@ -15231,11 +15595,11 @@
       <w:pPr>
         <w:pStyle w:val="Heading2"/>
       </w:pPr>
-      <w:bookmarkStart w:id="82" w:name="_uso"/>
+      <w:bookmarkStart w:id="100" w:name="_uso"/>
       <w:r>
         <w:t xml:space="preserve">11.4 Uso</w:t>
       </w:r>
-      <w:bookmarkEnd w:id="82"/>
+      <w:bookmarkEnd w:id="100"/>
     </w:p>
     <w:p>
       <w:pPr>
@@ -15365,11 +15729,11 @@
       <w:pPr>
         <w:pStyle w:val="Heading2"/>
       </w:pPr>
-      <w:bookmarkStart w:id="83" w:name="_f9d7979f00a12ac70d6679942d53aabef91c136"/>
+      <w:bookmarkStart w:id="101" w:name="_f9d7979f00a12ac70d6679942d53aabef91c136"/>
       <w:r>
         <w:t xml:space="preserve">11.5 Resolución de problemas frecuentes</w:t>
       </w:r>
-      <w:bookmarkEnd w:id="83"/>
+      <w:bookmarkEnd w:id="101"/>
     </w:p>
     <w:p>
       <w:pPr>
@@ -15459,11 +15823,11 @@
       <w:pPr>
         <w:pStyle w:val="Heading2"/>
       </w:pPr>
-      <w:bookmarkStart w:id="84" w:name="_bb9cfa87be9c3cbef0faa0d199aa14ac3fc8c0f"/>
+      <w:bookmarkStart w:id="102" w:name="_bb9cfa87be9c3cbef0faa0d199aa14ac3fc8c0f"/>
       <w:r>
         <w:t xml:space="preserve">11.6 Distribución y firma</w:t>
       </w:r>
-      <w:bookmarkEnd w:id="84"/>
+      <w:bookmarkEnd w:id="102"/>
     </w:p>
     <w:p>
       <w:pPr>
@@ -15690,11 +16054,11 @@
       <w:pPr>
         <w:pStyle w:val="Heading2"/>
       </w:pPr>
-      <w:bookmarkStart w:id="85" w:name="_859bc4fee679c939f43223e32d461b92caf4d09"/>
+      <w:bookmarkStart w:id="103" w:name="_859bc4fee679c939f43223e32d461b92caf4d09"/>
       <w:r>
         <w:t xml:space="preserve">11.7 Mantenimiento y operación</w:t>
       </w:r>
-      <w:bookmarkEnd w:id="85"/>
+      <w:bookmarkEnd w:id="103"/>
     </w:p>
     <w:p>
       <w:pPr>
@@ -15895,21 +16259,21 @@
       <w:pPr>
         <w:pStyle w:val="Heading1"/>
       </w:pPr>
-      <w:bookmarkStart w:id="86" w:name="_discusión"/>
+      <w:bookmarkStart w:id="104" w:name="_discusión"/>
       <w:r>
         <w:t xml:space="preserve">12. Discusión</w:t>
       </w:r>
-      <w:bookmarkEnd w:id="86"/>
+      <w:bookmarkEnd w:id="104"/>
     </w:p>
     <w:p>
       <w:pPr>
         <w:pStyle w:val="Heading2"/>
       </w:pPr>
-      <w:bookmarkStart w:id="87" w:name="_fd7f77e59bf56272a41e63540ba2d26cf5734a4"/>
+      <w:bookmarkStart w:id="105" w:name="_fd7f77e59bf56272a41e63540ba2d26cf5734a4"/>
       <w:r>
         <w:t xml:space="preserve">12.1 Lectura conjunta de los resultados</w:t>
       </w:r>
-      <w:bookmarkEnd w:id="87"/>
+      <w:bookmarkEnd w:id="105"/>
     </w:p>
     <w:p>
       <w:pPr>
@@ -16002,11 +16366,11 @@
       <w:pPr>
         <w:pStyle w:val="Heading2"/>
       </w:pPr>
-      <w:bookmarkStart w:id="88" w:name="_c1e80dd9fe2710ea138294612f911dc1203dd13"/>
+      <w:bookmarkStart w:id="106" w:name="_c1e80dd9fe2710ea138294612f911dc1203dd13"/>
       <w:r>
         <w:t xml:space="preserve">12.2 Aportación científica</w:t>
       </w:r>
-      <w:bookmarkEnd w:id="88"/>
+      <w:bookmarkEnd w:id="106"/>
     </w:p>
     <w:p>
       <w:pPr>
@@ -16110,11 +16474,11 @@
       <w:pPr>
         <w:pStyle w:val="Heading2"/>
       </w:pPr>
-      <w:bookmarkStart w:id="89" w:name="_97377cd795e45fa9c1c369ac746690c52bfbbca"/>
+      <w:bookmarkStart w:id="107" w:name="_97377cd795e45fa9c1c369ac746690c52bfbbca"/>
       <w:r>
         <w:t xml:space="preserve">12.3 Aportación de ingeniería</w:t>
       </w:r>
-      <w:bookmarkEnd w:id="89"/>
+      <w:bookmarkEnd w:id="107"/>
     </w:p>
     <w:p>
       <w:pPr>
@@ -16218,11 +16582,11 @@
       <w:pPr>
         <w:pStyle w:val="Heading2"/>
       </w:pPr>
-      <w:bookmarkStart w:id="90" w:name="_limitaciones"/>
+      <w:bookmarkStart w:id="108" w:name="_limitaciones"/>
       <w:r>
         <w:t xml:space="preserve">12.4 Limitaciones</w:t>
       </w:r>
-      <w:bookmarkEnd w:id="90"/>
+      <w:bookmarkEnd w:id="108"/>
     </w:p>
     <w:p>
       <w:pPr>
@@ -16412,11 +16776,11 @@
       <w:pPr>
         <w:pStyle w:val="Heading2"/>
       </w:pPr>
-      <w:bookmarkStart w:id="91" w:name="_484754590e6904425b5c945128e94a523b506e1"/>
+      <w:bookmarkStart w:id="109" w:name="_484754590e6904425b5c945128e94a523b506e1"/>
       <w:r>
         <w:t xml:space="preserve">12.5 Amenazas a la validez</w:t>
       </w:r>
-      <w:bookmarkEnd w:id="91"/>
+      <w:bookmarkEnd w:id="109"/>
     </w:p>
     <w:p>
       <w:pPr>
@@ -16534,11 +16898,11 @@
       <w:pPr>
         <w:pStyle w:val="Heading2"/>
       </w:pPr>
-      <w:bookmarkStart w:id="92" w:name="_b3c47eb9e78423996be7da5327757845106028e"/>
+      <w:bookmarkStart w:id="110" w:name="_b3c47eb9e78423996be7da5327757845106028e"/>
       <w:r>
         <w:t xml:space="preserve">12.6 Consideraciones éticas</w:t>
       </w:r>
-      <w:bookmarkEnd w:id="92"/>
+      <w:bookmarkEnd w:id="110"/>
     </w:p>
     <w:p>
       <w:pPr>
@@ -16623,21 +16987,21 @@
       <w:pPr>
         <w:pStyle w:val="Heading1"/>
       </w:pPr>
-      <w:bookmarkStart w:id="93" w:name="_6e51db4bda71573f47e1320a83c5d87f69a1e6c"/>
+      <w:bookmarkStart w:id="111" w:name="_6e51db4bda71573f47e1320a83c5d87f69a1e6c"/>
       <w:r>
         <w:t xml:space="preserve">13. Conclusiones y trabajo futuro</w:t>
       </w:r>
-      <w:bookmarkEnd w:id="93"/>
+      <w:bookmarkEnd w:id="111"/>
     </w:p>
     <w:p>
       <w:pPr>
         <w:pStyle w:val="Heading2"/>
       </w:pPr>
-      <w:bookmarkStart w:id="94" w:name="_546d1cd1585eb2050ed76988f153a461ff2afc9"/>
+      <w:bookmarkStart w:id="112" w:name="_546d1cd1585eb2050ed76988f153a461ff2afc9"/>
       <w:r>
         <w:t xml:space="preserve">13.1 Conclusiones técnicas</w:t>
       </w:r>
-      <w:bookmarkEnd w:id="94"/>
+      <w:bookmarkEnd w:id="112"/>
     </w:p>
     <w:p>
       <w:pPr>
@@ -16775,11 +17139,11 @@
       <w:pPr>
         <w:pStyle w:val="Heading2"/>
       </w:pPr>
-      <w:bookmarkStart w:id="95" w:name="_7e7fc96c71535c476ee013cf3a121b9b6f9675f"/>
+      <w:bookmarkStart w:id="113" w:name="_7e7fc96c71535c476ee013cf3a121b9b6f9675f"/>
       <w:r>
         <w:t xml:space="preserve">13.2 Conclusiones personales</w:t>
       </w:r>
-      <w:bookmarkEnd w:id="95"/>
+      <w:bookmarkEnd w:id="113"/>
     </w:p>
     <w:p>
       <w:pPr>
@@ -16793,11 +17157,11 @@
       <w:pPr>
         <w:pStyle w:val="Heading2"/>
       </w:pPr>
-      <w:bookmarkStart w:id="96" w:name="_d5950c82479f498c555b2f8a3a996df6d79b37d"/>
+      <w:bookmarkStart w:id="114" w:name="_d5950c82479f498c555b2f8a3a996df6d79b37d"/>
       <w:r>
         <w:t xml:space="preserve">13.3 Trabajo futuro</w:t>
       </w:r>
-      <w:bookmarkEnd w:id="96"/>
+      <w:bookmarkEnd w:id="114"/>
     </w:p>
     <w:p>
       <w:pPr>
@@ -16957,11 +17321,11 @@
       <w:pPr>
         <w:pStyle w:val="Heading1"/>
       </w:pPr>
-      <w:bookmarkStart w:id="97" w:name="_referencias"/>
+      <w:bookmarkStart w:id="115" w:name="_referencias"/>
       <w:r>
         <w:t xml:space="preserve">Referencias</w:t>
       </w:r>
-      <w:bookmarkEnd w:id="97"/>
+      <w:bookmarkEnd w:id="115"/>
     </w:p>
     <w:p>
       <w:pPr>
@@ -17249,21 +17613,21 @@
       <w:pPr>
         <w:pStyle w:val="Heading1"/>
       </w:pPr>
-      <w:bookmarkStart w:id="98" w:name="_anexos"/>
+      <w:bookmarkStart w:id="116" w:name="_anexos"/>
       <w:r>
         <w:t xml:space="preserve">Anexos</w:t>
       </w:r>
-      <w:bookmarkEnd w:id="98"/>
+      <w:bookmarkEnd w:id="116"/>
     </w:p>
     <w:p>
       <w:pPr>
         <w:pStyle w:val="Heading2"/>
       </w:pPr>
-      <w:bookmarkStart w:id="99" w:name="_cb06e7e0ea042027c7d6b3cfe3d16c83d28a26e"/>
+      <w:bookmarkStart w:id="117" w:name="_cb06e7e0ea042027c7d6b3cfe3d16c83d28a26e"/>
       <w:r>
         <w:t xml:space="preserve">Anexo A. Manual de despliegue</w:t>
       </w:r>
-      <w:bookmarkEnd w:id="99"/>
+      <w:bookmarkEnd w:id="117"/>
     </w:p>
     <w:p>
       <w:pPr>
@@ -17355,11 +17719,11 @@
       <w:pPr>
         <w:pStyle w:val="Heading2"/>
       </w:pPr>
-      <w:bookmarkStart w:id="100" w:name="_9462d500f0f59901160d3660486e4af9aa92d48"/>
+      <w:bookmarkStart w:id="118" w:name="_9462d500f0f59901160d3660486e4af9aa92d48"/>
       <w:r>
         <w:t xml:space="preserve">Anexo B. Comandos de reproducción</w:t>
       </w:r>
-      <w:bookmarkEnd w:id="100"/>
+      <w:bookmarkEnd w:id="118"/>
     </w:p>
     <w:p>
       <w:pPr>
@@ -17463,11 +17827,11 @@
       <w:pPr>
         <w:pStyle w:val="Heading2"/>
       </w:pPr>
-      <w:bookmarkStart w:id="101" w:name="_f9b0b437d285cf7775b1298c5655e81e33a4706"/>
+      <w:bookmarkStart w:id="119" w:name="_f9b0b437d285cf7775b1298c5655e81e33a4706"/>
       <w:r>
         <w:t xml:space="preserve">Anexo C. Corpus de evaluación</w:t>
       </w:r>
-      <w:bookmarkEnd w:id="101"/>
+      <w:bookmarkEnd w:id="119"/>
     </w:p>
     <w:p>
       <w:pPr>

</xml_diff>

<commit_message>
docs(memoria): pechar Ver 4.0 (PDF 31 páx con numeración/encabezado, portada, sen emoji, figuras)
</commit_message>
<xml_diff>
--- a/TFM/TFM Galingo Ver 4.0.docx
+++ b/TFM/TFM Galingo Ver 4.0.docx
@@ -4,13 +4,99 @@
   <w:body>
     <w:p>
       <w:pPr>
-        <w:pStyle w:val="Heading1"/>
-      </w:pPr>
-      <w:bookmarkStart w:id="9" w:name="_28b86914498e7bbded0b729d5ec883e46d8738b"/>
-      <w:r>
-        <w:t xml:space="preserve">TFM Galingo — Ver 4.0</w:t>
+        <w:pStyle w:val="FirstParagraph"/>
+      </w:pPr>
+      <w:r>
+        <w:rPr>
+          <w:b/>
+          <w:bCs/>
+        </w:rPr>
+        <w:t xml:space="preserve">Universidade de Vigo</w:t>
+      </w:r>
+      <w:r>
+        <w:t xml:space="preserve"> </w:t>
+      </w:r>
+      <w:r>
+        <w:t xml:space="preserve">·</w:t>
+      </w:r>
+      <w:r>
+        <w:t xml:space="preserve"> </w:t>
+      </w:r>
+      <w:r>
+        <w:rPr>
+          <w:b/>
+          <w:bCs/>
+        </w:rPr>
+        <w:t xml:space="preserve">Escola Superior de Enxeñaría Informática</w:t>
+      </w:r>
+    </w:p>
+    <w:p>
+      <w:pPr>
+        <w:pStyle w:val="BodyText"/>
+      </w:pPr>
+      <w:r>
+        <w:t xml:space="preserve">Memoria del Trabajo de Fin de Máster que presenta</w:t>
+      </w:r>
+      <w:r>
+        <w:t xml:space="preserve"> </w:t>
+      </w:r>
+      <w:r>
+        <w:rPr>
+          <w:b/>
+          <w:bCs/>
+        </w:rPr>
+        <w:t xml:space="preserve">Lester Andre Fernández Cedeño</w:t>
+      </w:r>
+      <w:r>
+        <w:t xml:space="preserve"> </w:t>
+      </w:r>
+      <w:r>
+        <w:t xml:space="preserve">para la obtención del Título de</w:t>
+      </w:r>
+      <w:r>
+        <w:t xml:space="preserve"> </w:t>
+      </w:r>
+      <w:r>
+        <w:rPr>
+          <w:b/>
+          <w:bCs/>
+        </w:rPr>
+        <w:t xml:space="preserve">Máster en Enxeñaría Informática</w:t>
+      </w:r>
+    </w:p>
+    <w:p>
+      <w:pPr>
+        <w:pStyle w:val="Heading2"/>
+      </w:pPr>
+      <w:bookmarkStart w:id="9" w:name="_9bbaa8c9cc8da0ec7932f2f30d72a7c28bac970"/>
+      <w:r>
+        <w:t xml:space="preserve">Diseño, implementación y validación de una plataforma gamificada basada en modelos probabilísticos de repetición espaciada para el aprendizaje del idioma gallego (Galingo)</w:t>
       </w:r>
       <w:bookmarkEnd w:id="9"/>
+    </w:p>
+    <w:p>
+      <w:pPr>
+        <w:pStyle w:val="FirstParagraph"/>
+      </w:pPr>
+      <w:r>
+        <w:t xml:space="preserve">Curso 2025/2026</w:t>
+      </w:r>
+    </w:p>
+    <w:p>
+      <w:pPr>
+        <w:pStyle w:val="BodyText"/>
+      </w:pPr>
+      <w:r>
+        <w:t xml:space="preserve">Trabajo de Fin de Máster Nº: ______</w:t>
+      </w:r>
+    </w:p>
+    <w:p>
+      <w:pPr>
+        <w:pStyle w:val="BodyText"/>
+      </w:pPr>
+      <w:r>
+        <w:t xml:space="preserve">Tutor/a: Francisco Javier Rodríguez · Área de coñecemento: ______ · Departamento: ______</w:t>
+      </w:r>
     </w:p>
     <w:p>
       <w:r>
@@ -21,100 +107,13 @@
     </w:p>
     <w:p>
       <w:pPr>
-        <w:pStyle w:val="FirstParagraph"/>
-      </w:pPr>
-      <w:r>
-        <w:rPr>
-          <w:b/>
-          <w:bCs/>
-        </w:rPr>
-        <w:t xml:space="preserve">Universidade de Vigo</w:t>
-      </w:r>
-      <w:r>
-        <w:t xml:space="preserve"> </w:t>
-      </w:r>
-      <w:r>
-        <w:t xml:space="preserve">·</w:t>
-      </w:r>
-      <w:r>
-        <w:t xml:space="preserve"> </w:t>
-      </w:r>
-      <w:r>
-        <w:rPr>
-          <w:b/>
-          <w:bCs/>
-        </w:rPr>
-        <w:t xml:space="preserve">Escola Superior de Enxeñaría Informática</w:t>
-      </w:r>
-    </w:p>
-    <w:p>
-      <w:pPr>
-        <w:pStyle w:val="BodyText"/>
-      </w:pPr>
-      <w:r>
-        <w:t xml:space="preserve">Memoria del Trabajo de Fin de Máster que presenta</w:t>
-      </w:r>
-      <w:r>
-        <w:t xml:space="preserve"> </w:t>
-      </w:r>
-      <w:r>
-        <w:rPr>
-          <w:b/>
-          <w:bCs/>
-        </w:rPr>
-        <w:t xml:space="preserve">Lester Andre Fernández Cedeño</w:t>
-      </w:r>
-      <w:r>
-        <w:t xml:space="preserve"> </w:t>
-      </w:r>
-      <w:r>
-        <w:t xml:space="preserve">para la obtención del Título de</w:t>
-      </w:r>
-      <w:r>
-        <w:t xml:space="preserve"> </w:t>
-      </w:r>
-      <w:r>
-        <w:rPr>
-          <w:b/>
-          <w:bCs/>
-        </w:rPr>
-        <w:t xml:space="preserve">Máster en Enxeñaría Informática</w:t>
-      </w:r>
-    </w:p>
-    <w:p>
-      <w:pPr>
         <w:pStyle w:val="Heading2"/>
       </w:pPr>
-      <w:bookmarkStart w:id="10" w:name="_9bbaa8c9cc8da0ec7932f2f30d72a7c28bac970"/>
-      <w:r>
-        <w:t xml:space="preserve">Diseño, implementación y validación de una plataforma gamificada basada en modelos probabilísticos de repetición espaciada para el aprendizaje del idioma gallego (Galingo)</w:t>
+      <w:bookmarkStart w:id="10" w:name="_resumen"/>
+      <w:r>
+        <w:t xml:space="preserve">Resumen</w:t>
       </w:r>
       <w:bookmarkEnd w:id="10"/>
-    </w:p>
-    <w:p>
-      <w:pPr>
-        <w:pStyle w:val="FirstParagraph"/>
-      </w:pPr>
-      <w:r>
-        <w:t xml:space="preserve">Curso 2025/2026 · Tutor/a: Francisco Javier Rodríguez</w:t>
-      </w:r>
-    </w:p>
-    <w:p>
-      <w:r>
-        <w:pict>
-          <v:rect style="width:0;height:1.5pt" o:hralign="center" o:hrstd="t" o:hr="t"/>
-        </w:pict>
-      </w:r>
-    </w:p>
-    <w:p>
-      <w:pPr>
-        <w:pStyle w:val="Heading2"/>
-      </w:pPr>
-      <w:bookmarkStart w:id="11" w:name="_resumen"/>
-      <w:r>
-        <w:t xml:space="preserve">Resumen</w:t>
-      </w:r>
-      <w:bookmarkEnd w:id="11"/>
     </w:p>
     <w:p>
       <w:pPr>
@@ -264,11 +263,11 @@
       <w:pPr>
         <w:pStyle w:val="Heading2"/>
       </w:pPr>
-      <w:bookmarkStart w:id="12" w:name="_abstract"/>
+      <w:bookmarkStart w:id="11" w:name="_abstract"/>
       <w:r>
         <w:t xml:space="preserve">Abstract</w:t>
       </w:r>
-      <w:bookmarkEnd w:id="12"/>
+      <w:bookmarkEnd w:id="11"/>
     </w:p>
     <w:p>
       <w:pPr>
@@ -411,11 +410,11 @@
       <w:pPr>
         <w:pStyle w:val="Heading2"/>
       </w:pPr>
-      <w:bookmarkStart w:id="13" w:name="_c032c4e367aa8f78cde3139832b6228dd4af9ce"/>
+      <w:bookmarkStart w:id="12" w:name="_c032c4e367aa8f78cde3139832b6228dd4af9ce"/>
       <w:r>
         <w:t xml:space="preserve">Índice de contenidos</w:t>
       </w:r>
-      <w:bookmarkEnd w:id="13"/>
+      <w:bookmarkEnd w:id="12"/>
     </w:p>
     <w:p>
       <w:pPr>
@@ -433,11 +432,11 @@
       <w:pPr>
         <w:pStyle w:val="Heading2"/>
       </w:pPr>
-      <w:bookmarkStart w:id="14" w:name="_c1849511cf975561bf1093e633b376bd3192aa7"/>
+      <w:bookmarkStart w:id="13" w:name="_c1849511cf975561bf1093e633b376bd3192aa7"/>
       <w:r>
         <w:t xml:space="preserve">Índice de ilustraciones / Índice de tablas</w:t>
       </w:r>
-      <w:bookmarkEnd w:id="14"/>
+      <w:bookmarkEnd w:id="13"/>
     </w:p>
     <w:p>
       <w:pPr>
@@ -462,179 +461,179 @@
       <w:pPr>
         <w:pStyle w:val="Heading1"/>
       </w:pPr>
-      <w:bookmarkStart w:id="15" w:name="_introducción"/>
+      <w:bookmarkStart w:id="14" w:name="_introducción"/>
       <w:r>
         <w:t xml:space="preserve">1. Introducción</w:t>
       </w:r>
+      <w:bookmarkEnd w:id="14"/>
+    </w:p>
+    <w:p>
+      <w:pPr>
+        <w:pStyle w:val="Heading2"/>
+      </w:pPr>
+      <w:bookmarkStart w:id="15" w:name="_a4e580f788686ee0e71478097ba3af9940fe60c"/>
+      <w:r>
+        <w:t xml:space="preserve">1.1 Contexto y motivación</w:t>
+      </w:r>
       <w:bookmarkEnd w:id="15"/>
     </w:p>
     <w:p>
       <w:pPr>
+        <w:pStyle w:val="FirstParagraph"/>
+      </w:pPr>
+      <w:r>
+        <w:t xml:space="preserve">La combinación de ingeniería de software, gamificación y aprendizaje automático ha transformado la manera de aprender una segunda lengua durante la última década. Las plataformas globales de microaprendizaje retienen a las personas usuarias mediante bucles de retroalimentación inmediata, sesiones breves y mecánicas de juego, pero reservan el desarrollo algorítmico avanzado para las lenguas con mayor tamaño de mercado. Las lenguas minorizadas quedan cubiertas por recursos digitales estáticos, fragmentados y sin metodologías de retención adaptativa.</w:t>
+      </w:r>
+    </w:p>
+    <w:p>
+      <w:pPr>
+        <w:pStyle w:val="BodyText"/>
+      </w:pPr>
+      <w:r>
+        <w:t xml:space="preserve">En el caso del gallego, esta desigualdad tecnológica tiene consecuencias sociales concretas. Galicia recibe población migrante de forma continuada, y la lengua propia es un factor central para el</w:t>
+      </w:r>
+      <w:r>
+        <w:t xml:space="preserve"> </w:t>
+      </w:r>
+      <w:r>
+        <w:rPr>
+          <w:b/>
+          <w:bCs/>
+        </w:rPr>
+        <w:t xml:space="preserve">arraigo territorial</w:t>
+      </w:r>
+      <w:r>
+        <w:t xml:space="preserve">, la</w:t>
+      </w:r>
+      <w:r>
+        <w:t xml:space="preserve"> </w:t>
+      </w:r>
+      <w:r>
+        <w:rPr>
+          <w:b/>
+          <w:bCs/>
+        </w:rPr>
+        <w:t xml:space="preserve">inserción laboral</w:t>
+      </w:r>
+      <w:r>
+        <w:t xml:space="preserve"> </w:t>
+      </w:r>
+      <w:r>
+        <w:t xml:space="preserve">y la</w:t>
+      </w:r>
+      <w:r>
+        <w:t xml:space="preserve"> </w:t>
+      </w:r>
+      <w:r>
+        <w:rPr>
+          <w:b/>
+          <w:bCs/>
+        </w:rPr>
+        <w:t xml:space="preserve">cohesión familiar</w:t>
+      </w:r>
+      <w:r>
+        <w:t xml:space="preserve">. La falta de herramientas accesibles para la inmersión lingüística —sobre todo en los niveles iniciales A1/A2— dificulta el aprendizaje progresivo de personas adultas y de menores en edad escolar. El gallego, además, comparte con otras lenguas minorizadas un ecosistema digital limitado: recursos institucionales valiosos pero a menudo desconectados entre sí, y una presencia escasa en las aplicaciones comerciales de aprendizaje.</w:t>
+      </w:r>
+    </w:p>
+    <w:p>
+      <w:pPr>
+        <w:pStyle w:val="BodyText"/>
+      </w:pPr>
+      <w:r>
+        <w:t xml:space="preserve">A esta brecha de contenido se suma una</w:t>
+      </w:r>
+      <w:r>
+        <w:t xml:space="preserve"> </w:t>
+      </w:r>
+      <w:r>
+        <w:rPr>
+          <w:b/>
+          <w:bCs/>
+        </w:rPr>
+        <w:t xml:space="preserve">brecha tecnológica específica</w:t>
+      </w:r>
+      <w:r>
+        <w:t xml:space="preserve">: ni Android ni iOS ofrecen</w:t>
+      </w:r>
+      <w:r>
+        <w:t xml:space="preserve"> </w:t>
+      </w:r>
+      <w:r>
+        <w:rPr>
+          <w:b/>
+          <w:bCs/>
+        </w:rPr>
+        <w:t xml:space="preserve">reconocimiento del habla en gallego</w:t>
+      </w:r>
+      <w:r>
+        <w:t xml:space="preserve"> </w:t>
+      </w:r>
+      <w:r>
+        <w:t xml:space="preserve">de forma nativa. Cualquier aplicación que quiera evaluar la pronunciación —la destreza oral, tradicionalmente la más difícil de practicar sin un docente— se ve forzada a depender de servicios en la nube, lo que exige conexión permanente, introduce latencia y compromete la privacidad del audio. Esta limitación es especialmente relevante para una app de idiomas, donde la voz es un componente esencial.</w:t>
+      </w:r>
+    </w:p>
+    <w:p>
+      <w:pPr>
+        <w:pStyle w:val="BodyText"/>
+      </w:pPr>
+      <w:r>
+        <w:t xml:space="preserve">Galingo nace de aplicar ingeniería de producto e inteligencia artificial a este doble problema:</w:t>
+      </w:r>
+      <w:r>
+        <w:t xml:space="preserve"> </w:t>
+      </w:r>
+      <w:r>
+        <w:rPr>
+          <w:b/>
+          <w:bCs/>
+        </w:rPr>
+        <w:t xml:space="preserve">facilitar el acceso al gallego</w:t>
+      </w:r>
+      <w:r>
+        <w:t xml:space="preserve"> </w:t>
+      </w:r>
+      <w:r>
+        <w:t xml:space="preserve">con una experiencia interactiva y gamificada, y</w:t>
+      </w:r>
+      <w:r>
+        <w:t xml:space="preserve"> </w:t>
+      </w:r>
+      <w:r>
+        <w:rPr>
+          <w:b/>
+          <w:bCs/>
+        </w:rPr>
+        <w:t xml:space="preserve">resolver la voz en el propio dispositivo</w:t>
+      </w:r>
+      <w:r>
+        <w:t xml:space="preserve">, de forma privada y sin conexión. El proyecto se plantea, por tanto, no solo como una interfaz de usuario, sino como una</w:t>
+      </w:r>
+      <w:r>
+        <w:t xml:space="preserve"> </w:t>
+      </w:r>
+      <w:r>
+        <w:rPr>
+          <w:b/>
+          <w:bCs/>
+        </w:rPr>
+        <w:t xml:space="preserve">infraestructura de software</w:t>
+      </w:r>
+      <w:r>
+        <w:t xml:space="preserve"> </w:t>
+      </w:r>
+      <w:r>
+        <w:t xml:space="preserve">que combine un modelo probabilístico de memoria, una arquitectura desacoplada y una capa de voz local, con un coste de operación nulo que lo haga sostenible sin presupuesto.</w:t>
+      </w:r>
+    </w:p>
+    <w:p>
+      <w:pPr>
         <w:pStyle w:val="Heading2"/>
       </w:pPr>
-      <w:bookmarkStart w:id="16" w:name="_a4e580f788686ee0e71478097ba3af9940fe60c"/>
-      <w:r>
-        <w:t xml:space="preserve">1.1 Contexto y motivación</w:t>
+      <w:bookmarkStart w:id="16" w:name="_0a84986c648c5da431cdde7cb22280fbd8ae38f"/>
+      <w:r>
+        <w:t xml:space="preserve">1.2 Formulación del problema</w:t>
       </w:r>
       <w:bookmarkEnd w:id="16"/>
-    </w:p>
-    <w:p>
-      <w:pPr>
-        <w:pStyle w:val="FirstParagraph"/>
-      </w:pPr>
-      <w:r>
-        <w:t xml:space="preserve">La combinación de ingeniería de software, gamificación y aprendizaje automático ha transformado la manera de aprender una segunda lengua durante la última década. Las plataformas globales de microaprendizaje retienen a las personas usuarias mediante bucles de retroalimentación inmediata, sesiones breves y mecánicas de juego, pero reservan el desarrollo algorítmico avanzado para las lenguas con mayor tamaño de mercado. Las lenguas minorizadas quedan cubiertas por recursos digitales estáticos, fragmentados y sin metodologías de retención adaptativa.</w:t>
-      </w:r>
-    </w:p>
-    <w:p>
-      <w:pPr>
-        <w:pStyle w:val="BodyText"/>
-      </w:pPr>
-      <w:r>
-        <w:t xml:space="preserve">En el caso del gallego, esta desigualdad tecnológica tiene consecuencias sociales concretas. Galicia recibe población migrante de forma continuada, y la lengua propia es un factor central para el</w:t>
-      </w:r>
-      <w:r>
-        <w:t xml:space="preserve"> </w:t>
-      </w:r>
-      <w:r>
-        <w:rPr>
-          <w:b/>
-          <w:bCs/>
-        </w:rPr>
-        <w:t xml:space="preserve">arraigo territorial</w:t>
-      </w:r>
-      <w:r>
-        <w:t xml:space="preserve">, la</w:t>
-      </w:r>
-      <w:r>
-        <w:t xml:space="preserve"> </w:t>
-      </w:r>
-      <w:r>
-        <w:rPr>
-          <w:b/>
-          <w:bCs/>
-        </w:rPr>
-        <w:t xml:space="preserve">inserción laboral</w:t>
-      </w:r>
-      <w:r>
-        <w:t xml:space="preserve"> </w:t>
-      </w:r>
-      <w:r>
-        <w:t xml:space="preserve">y la</w:t>
-      </w:r>
-      <w:r>
-        <w:t xml:space="preserve"> </w:t>
-      </w:r>
-      <w:r>
-        <w:rPr>
-          <w:b/>
-          <w:bCs/>
-        </w:rPr>
-        <w:t xml:space="preserve">cohesión familiar</w:t>
-      </w:r>
-      <w:r>
-        <w:t xml:space="preserve">. La falta de herramientas accesibles para la inmersión lingüística —sobre todo en los niveles iniciales A1/A2— dificulta el aprendizaje progresivo de personas adultas y de menores en edad escolar. El gallego, además, comparte con otras lenguas minorizadas un ecosistema digital limitado: recursos institucionales valiosos pero a menudo desconectados entre sí, y una presencia escasa en las aplicaciones comerciales de aprendizaje.</w:t>
-      </w:r>
-    </w:p>
-    <w:p>
-      <w:pPr>
-        <w:pStyle w:val="BodyText"/>
-      </w:pPr>
-      <w:r>
-        <w:t xml:space="preserve">A esta brecha de contenido se suma una</w:t>
-      </w:r>
-      <w:r>
-        <w:t xml:space="preserve"> </w:t>
-      </w:r>
-      <w:r>
-        <w:rPr>
-          <w:b/>
-          <w:bCs/>
-        </w:rPr>
-        <w:t xml:space="preserve">brecha tecnológica específica</w:t>
-      </w:r>
-      <w:r>
-        <w:t xml:space="preserve">: ni Android ni iOS ofrecen</w:t>
-      </w:r>
-      <w:r>
-        <w:t xml:space="preserve"> </w:t>
-      </w:r>
-      <w:r>
-        <w:rPr>
-          <w:b/>
-          <w:bCs/>
-        </w:rPr>
-        <w:t xml:space="preserve">reconocimiento del habla en gallego</w:t>
-      </w:r>
-      <w:r>
-        <w:t xml:space="preserve"> </w:t>
-      </w:r>
-      <w:r>
-        <w:t xml:space="preserve">de forma nativa. Cualquier aplicación que quiera evaluar la pronunciación —la destreza oral, tradicionalmente la más difícil de practicar sin un docente— se ve forzada a depender de servicios en la nube, lo que exige conexión permanente, introduce latencia y compromete la privacidad del audio. Esta limitación es especialmente relevante para una app de idiomas, donde la voz es un componente esencial.</w:t>
-      </w:r>
-    </w:p>
-    <w:p>
-      <w:pPr>
-        <w:pStyle w:val="BodyText"/>
-      </w:pPr>
-      <w:r>
-        <w:t xml:space="preserve">Galingo nace de aplicar ingeniería de producto e inteligencia artificial a este doble problema:</w:t>
-      </w:r>
-      <w:r>
-        <w:t xml:space="preserve"> </w:t>
-      </w:r>
-      <w:r>
-        <w:rPr>
-          <w:b/>
-          <w:bCs/>
-        </w:rPr>
-        <w:t xml:space="preserve">facilitar el acceso al gallego</w:t>
-      </w:r>
-      <w:r>
-        <w:t xml:space="preserve"> </w:t>
-      </w:r>
-      <w:r>
-        <w:t xml:space="preserve">con una experiencia interactiva y gamificada, y</w:t>
-      </w:r>
-      <w:r>
-        <w:t xml:space="preserve"> </w:t>
-      </w:r>
-      <w:r>
-        <w:rPr>
-          <w:b/>
-          <w:bCs/>
-        </w:rPr>
-        <w:t xml:space="preserve">resolver la voz en el propio dispositivo</w:t>
-      </w:r>
-      <w:r>
-        <w:t xml:space="preserve">, de forma privada y sin conexión. El proyecto se plantea, por tanto, no solo como una interfaz de usuario, sino como una</w:t>
-      </w:r>
-      <w:r>
-        <w:t xml:space="preserve"> </w:t>
-      </w:r>
-      <w:r>
-        <w:rPr>
-          <w:b/>
-          <w:bCs/>
-        </w:rPr>
-        <w:t xml:space="preserve">infraestructura de software</w:t>
-      </w:r>
-      <w:r>
-        <w:t xml:space="preserve"> </w:t>
-      </w:r>
-      <w:r>
-        <w:t xml:space="preserve">que combine un modelo probabilístico de memoria, una arquitectura desacoplada y una capa de voz local, con un coste de operación nulo que lo haga sostenible sin presupuesto.</w:t>
-      </w:r>
-    </w:p>
-    <w:p>
-      <w:pPr>
-        <w:pStyle w:val="Heading2"/>
-      </w:pPr>
-      <w:bookmarkStart w:id="17" w:name="_0a84986c648c5da431cdde7cb22280fbd8ae38f"/>
-      <w:r>
-        <w:t xml:space="preserve">1.2 Formulación del problema</w:t>
-      </w:r>
-      <w:bookmarkEnd w:id="17"/>
     </w:p>
     <w:p>
       <w:pPr>
@@ -990,11 +989,11 @@
       <w:pPr>
         <w:pStyle w:val="Heading2"/>
       </w:pPr>
-      <w:bookmarkStart w:id="18" w:name="_contribuciones"/>
+      <w:bookmarkStart w:id="17" w:name="_contribuciones"/>
       <w:r>
         <w:t xml:space="preserve">1.3 Contribuciones</w:t>
       </w:r>
-      <w:bookmarkEnd w:id="18"/>
+      <w:bookmarkEnd w:id="17"/>
     </w:p>
     <w:p>
       <w:pPr>
@@ -1163,11 +1162,11 @@
       <w:pPr>
         <w:pStyle w:val="Heading2"/>
       </w:pPr>
-      <w:bookmarkStart w:id="19" w:name="_78a0b2d558a9cb87b53ed62eebe3a3dd9e76fe9"/>
+      <w:bookmarkStart w:id="18" w:name="_78a0b2d558a9cb87b53ed62eebe3a3dd9e76fe9"/>
       <w:r>
         <w:t xml:space="preserve">1.4 Organización de la memoria</w:t>
       </w:r>
-      <w:bookmarkEnd w:id="19"/>
+      <w:bookmarkEnd w:id="18"/>
     </w:p>
     <w:p>
       <w:pPr>
@@ -1188,21 +1187,21 @@
       <w:pPr>
         <w:pStyle w:val="Heading1"/>
       </w:pPr>
-      <w:bookmarkStart w:id="20" w:name="_26b2de7998f624272c26555d08cc111aab0a025"/>
+      <w:bookmarkStart w:id="19" w:name="_26b2de7998f624272c26555d08cc111aab0a025"/>
       <w:r>
         <w:t xml:space="preserve">2. Fundamentos y estado del arte</w:t>
       </w:r>
+      <w:bookmarkEnd w:id="19"/>
+    </w:p>
+    <w:p>
+      <w:pPr>
+        <w:pStyle w:val="Heading2"/>
+      </w:pPr>
+      <w:bookmarkStart w:id="20" w:name="_b9ebf9099db23438dc9cb713f9c3dc2579c454b"/>
+      <w:r>
+        <w:t xml:space="preserve">2.1 Microaprendizaje y gamificación</w:t>
+      </w:r>
       <w:bookmarkEnd w:id="20"/>
-    </w:p>
-    <w:p>
-      <w:pPr>
-        <w:pStyle w:val="Heading2"/>
-      </w:pPr>
-      <w:bookmarkStart w:id="21" w:name="_b9ebf9099db23438dc9cb713f9c3dc2579c454b"/>
-      <w:r>
-        <w:t xml:space="preserve">2.1 Microaprendizaje y gamificación</w:t>
-      </w:r>
-      <w:bookmarkEnd w:id="21"/>
     </w:p>
     <w:p>
       <w:pPr>
@@ -1374,11 +1373,11 @@
       <w:pPr>
         <w:pStyle w:val="Heading2"/>
       </w:pPr>
-      <w:bookmarkStart w:id="22" w:name="_47d04a688a2ca4ef3f8a458c3180ef72b717490"/>
+      <w:bookmarkStart w:id="21" w:name="_47d04a688a2ca4ef3f8a458c3180ef72b717490"/>
       <w:r>
         <w:t xml:space="preserve">2.2 Repetición espaciada: de la heurística al modelo aprendido</w:t>
       </w:r>
-      <w:bookmarkEnd w:id="22"/>
+      <w:bookmarkEnd w:id="21"/>
     </w:p>
     <w:p>
       <w:pPr>
@@ -2135,11 +2134,11 @@
       <w:pPr>
         <w:pStyle w:val="Heading2"/>
       </w:pPr>
-      <w:bookmarkStart w:id="23" w:name="_83ebd125efd72ad63f8249d3f57b89b04205f5e"/>
+      <w:bookmarkStart w:id="22" w:name="_83ebd125efd72ad63f8249d3f57b89b04205f5e"/>
       <w:r>
         <w:t xml:space="preserve">2.3 Aprendizaje automático aplicado a la memoria del usuario</w:t>
       </w:r>
-      <w:bookmarkEnd w:id="23"/>
+      <w:bookmarkEnd w:id="22"/>
     </w:p>
     <w:p>
       <w:pPr>
@@ -2522,11 +2521,11 @@
       <w:pPr>
         <w:pStyle w:val="Heading2"/>
       </w:pPr>
-      <w:bookmarkStart w:id="24" w:name="_784756cbdf4ffbe52f15fc9581b82469ed75993"/>
+      <w:bookmarkStart w:id="23" w:name="_784756cbdf4ffbe52f15fc9581b82469ed75993"/>
       <w:r>
         <w:t xml:space="preserve">2.4 Reconocimiento y síntesis de voz para lenguas minorizadas</w:t>
       </w:r>
-      <w:bookmarkEnd w:id="24"/>
+      <w:bookmarkEnd w:id="23"/>
     </w:p>
     <w:p>
       <w:pPr>
@@ -2901,11 +2900,11 @@
       <w:pPr>
         <w:pStyle w:val="Heading2"/>
       </w:pPr>
-      <w:bookmarkStart w:id="25" w:name="_0c4109b4b046c7a92f26291d1dff0161edd65de"/>
+      <w:bookmarkStart w:id="24" w:name="_0c4109b4b046c7a92f26291d1dff0161edd65de"/>
       <w:r>
         <w:t xml:space="preserve">2.5 Internacionalización y aprendizaje de segundas lenguas</w:t>
       </w:r>
-      <w:bookmarkEnd w:id="25"/>
+      <w:bookmarkEnd w:id="24"/>
     </w:p>
     <w:p>
       <w:pPr>
@@ -3119,11 +3118,11 @@
       <w:pPr>
         <w:pStyle w:val="Heading2"/>
       </w:pPr>
-      <w:bookmarkStart w:id="26" w:name="_67afe7da9d7d845b84f3aac0d4156c630d39e53"/>
+      <w:bookmarkStart w:id="25" w:name="_67afe7da9d7d845b84f3aac0d4156c630d39e53"/>
       <w:r>
         <w:t xml:space="preserve">2.6 Posicionamiento de Galingo</w:t>
       </w:r>
-      <w:bookmarkEnd w:id="26"/>
+      <w:bookmarkEnd w:id="25"/>
     </w:p>
     <w:p>
       <w:pPr>
@@ -3256,52 +3255,52 @@
       <w:pPr>
         <w:pStyle w:val="Heading1"/>
       </w:pPr>
-      <w:bookmarkStart w:id="27" w:name="_25e9c25b174ff1e331b1f4a5f5dada02af721ca"/>
+      <w:bookmarkStart w:id="26" w:name="_25e9c25b174ff1e331b1f4a5f5dada02af721ca"/>
       <w:r>
         <w:t xml:space="preserve">3. Objetivos, alcance e hipótesis</w:t>
       </w:r>
+      <w:bookmarkEnd w:id="26"/>
+    </w:p>
+    <w:p>
+      <w:pPr>
+        <w:pStyle w:val="Heading2"/>
+      </w:pPr>
+      <w:bookmarkStart w:id="27" w:name="_c64fb550c3e89cc8e7ce1cbb90cf5a950e7566d"/>
+      <w:r>
+        <w:t xml:space="preserve">3.1 Objetivo general</w:t>
+      </w:r>
       <w:bookmarkEnd w:id="27"/>
     </w:p>
     <w:p>
       <w:pPr>
+        <w:pStyle w:val="FirstParagraph"/>
+      </w:pPr>
+      <w:r>
+        <w:t xml:space="preserve">Diseñar, implementar y validar una plataforma multiplataforma,</w:t>
+      </w:r>
+      <w:r>
+        <w:t xml:space="preserve"> </w:t>
+      </w:r>
+      <w:r>
+        <w:rPr>
+          <w:b/>
+          <w:bCs/>
+        </w:rPr>
+        <w:t xml:space="preserve">Galingo</w:t>
+      </w:r>
+      <w:r>
+        <w:t xml:space="preserve">, estructurada bajo el paradigma del microaprendizaje, que integre un algoritmo probabilístico de Regresión de Vida Media entrenado con datos de interacción para optimizar la curva de asimilación del gallego en personas no gallegoparlantes, comparando su rendimiento frente a la heurística clásica SM-2, y que resuelva íntegramente la capa de voz (síntesis y reconocimiento) en el propio dispositivo.</w:t>
+      </w:r>
+    </w:p>
+    <w:p>
+      <w:pPr>
         <w:pStyle w:val="Heading2"/>
       </w:pPr>
-      <w:bookmarkStart w:id="28" w:name="_c64fb550c3e89cc8e7ce1cbb90cf5a950e7566d"/>
-      <w:r>
-        <w:t xml:space="preserve">3.1 Objetivo general</w:t>
+      <w:bookmarkStart w:id="28" w:name="_cb37acc1d3c00bf5df0b06a4f27c7103121ff3b"/>
+      <w:r>
+        <w:t xml:space="preserve">3.2 Objetivos específicos</w:t>
       </w:r>
       <w:bookmarkEnd w:id="28"/>
-    </w:p>
-    <w:p>
-      <w:pPr>
-        <w:pStyle w:val="FirstParagraph"/>
-      </w:pPr>
-      <w:r>
-        <w:t xml:space="preserve">Diseñar, implementar y validar una plataforma multiplataforma,</w:t>
-      </w:r>
-      <w:r>
-        <w:t xml:space="preserve"> </w:t>
-      </w:r>
-      <w:r>
-        <w:rPr>
-          <w:b/>
-          <w:bCs/>
-        </w:rPr>
-        <w:t xml:space="preserve">Galingo</w:t>
-      </w:r>
-      <w:r>
-        <w:t xml:space="preserve">, estructurada bajo el paradigma del microaprendizaje, que integre un algoritmo probabilístico de Regresión de Vida Media entrenado con datos de interacción para optimizar la curva de asimilación del gallego en personas no gallegoparlantes, comparando su rendimiento frente a la heurística clásica SM-2, y que resuelva íntegramente la capa de voz (síntesis y reconocimiento) en el propio dispositivo.</w:t>
-      </w:r>
-    </w:p>
-    <w:p>
-      <w:pPr>
-        <w:pStyle w:val="Heading2"/>
-      </w:pPr>
-      <w:bookmarkStart w:id="29" w:name="_cb37acc1d3c00bf5df0b06a4f27c7103121ff3b"/>
-      <w:r>
-        <w:t xml:space="preserve">3.2 Objetivos específicos</w:t>
-      </w:r>
-      <w:bookmarkEnd w:id="29"/>
     </w:p>
     <w:p>
       <w:pPr>
@@ -3884,11 +3883,11 @@
       <w:pPr>
         <w:pStyle w:val="Heading2"/>
       </w:pPr>
-      <w:bookmarkStart w:id="30" w:name="_hipótesis"/>
+      <w:bookmarkStart w:id="29" w:name="_hipótesis"/>
       <w:r>
         <w:t xml:space="preserve">3.3 Hipótesis</w:t>
       </w:r>
-      <w:bookmarkEnd w:id="30"/>
+      <w:bookmarkEnd w:id="29"/>
     </w:p>
     <w:p>
       <w:pPr>
@@ -3986,11 +3985,11 @@
       <w:pPr>
         <w:pStyle w:val="Heading2"/>
       </w:pPr>
-      <w:bookmarkStart w:id="31" w:name="_e0351b673ac146b78aad24b3e9a23dc7be3c7df"/>
+      <w:bookmarkStart w:id="30" w:name="_e0351b673ac146b78aad24b3e9a23dc7be3c7df"/>
       <w:r>
         <w:t xml:space="preserve">3.4 Alcance y limitaciones</w:t>
       </w:r>
-      <w:bookmarkEnd w:id="31"/>
+      <w:bookmarkEnd w:id="30"/>
     </w:p>
     <w:p>
       <w:pPr>
@@ -4136,21 +4135,21 @@
       <w:pPr>
         <w:pStyle w:val="Heading1"/>
       </w:pPr>
-      <w:bookmarkStart w:id="32" w:name="_0c8e7888687399f9170a1af7e17500df9a98acc"/>
+      <w:bookmarkStart w:id="31" w:name="_0c8e7888687399f9170a1af7e17500df9a98acc"/>
       <w:r>
         <w:t xml:space="preserve">4. Planificación y seguimiento</w:t>
       </w:r>
+      <w:bookmarkEnd w:id="31"/>
+    </w:p>
+    <w:p>
+      <w:pPr>
+        <w:pStyle w:val="Heading2"/>
+      </w:pPr>
+      <w:bookmarkStart w:id="32" w:name="_363a2b465aa2c2fb8694a3d1ee9dfe86206dcb3"/>
+      <w:r>
+        <w:t xml:space="preserve">4.1 Estrategia de trabajo</w:t>
+      </w:r>
       <w:bookmarkEnd w:id="32"/>
-    </w:p>
-    <w:p>
-      <w:pPr>
-        <w:pStyle w:val="Heading2"/>
-      </w:pPr>
-      <w:bookmarkStart w:id="33" w:name="_363a2b465aa2c2fb8694a3d1ee9dfe86206dcb3"/>
-      <w:r>
-        <w:t xml:space="preserve">4.1 Estrategia de trabajo</w:t>
-      </w:r>
-      <w:bookmarkEnd w:id="33"/>
     </w:p>
     <w:p>
       <w:pPr>
@@ -4614,11 +4613,11 @@
       <w:pPr>
         <w:pStyle w:val="Heading2"/>
       </w:pPr>
-      <w:bookmarkStart w:id="34" w:name="_cab94a4a27b9dd7fbb2a47dbc45f91823965d79"/>
+      <w:bookmarkStart w:id="33" w:name="_cab94a4a27b9dd7fbb2a47dbc45f91823965d79"/>
       <w:r>
         <w:t xml:space="preserve">4.2 Hitos y seguimiento</w:t>
       </w:r>
-      <w:bookmarkEnd w:id="34"/>
+      <w:bookmarkEnd w:id="33"/>
     </w:p>
     <w:tbl>
       <w:tblPr>
@@ -4724,7 +4723,7 @@
               <w:pStyle w:val="Compact"/>
             </w:pPr>
             <w:r>
-              <w:t xml:space="preserve">✅</w:t>
+              <w:t xml:space="preserve">Completada</w:t>
             </w:r>
           </w:p>
         </w:tc>
@@ -4785,7 +4784,7 @@
               <w:pStyle w:val="Compact"/>
             </w:pPr>
             <w:r>
-              <w:t xml:space="preserve">✅</w:t>
+              <w:t xml:space="preserve">Completada</w:t>
             </w:r>
           </w:p>
         </w:tc>
@@ -4831,7 +4830,7 @@
               <w:pStyle w:val="Compact"/>
             </w:pPr>
             <w:r>
-              <w:t xml:space="preserve">✅</w:t>
+              <w:t xml:space="preserve">Completada</w:t>
             </w:r>
           </w:p>
         </w:tc>
@@ -4883,7 +4882,7 @@
               <w:pStyle w:val="Compact"/>
             </w:pPr>
             <w:r>
-              <w:t xml:space="preserve">✅</w:t>
+              <w:t xml:space="preserve">Completada</w:t>
             </w:r>
           </w:p>
         </w:tc>
@@ -4935,7 +4934,7 @@
               <w:pStyle w:val="Compact"/>
             </w:pPr>
             <w:r>
-              <w:t xml:space="preserve">✅</w:t>
+              <w:t xml:space="preserve">Completada</w:t>
             </w:r>
           </w:p>
         </w:tc>
@@ -4981,7 +4980,7 @@
               <w:pStyle w:val="Compact"/>
             </w:pPr>
             <w:r>
-              <w:t xml:space="preserve">✅ (ampliación)</w:t>
+              <w:t xml:space="preserve">Completada (ampliación)</w:t>
             </w:r>
           </w:p>
         </w:tc>
@@ -5027,7 +5026,7 @@
               <w:pStyle w:val="Compact"/>
             </w:pPr>
             <w:r>
-              <w:t xml:space="preserve">🟡 en curso</w:t>
+              <w:t xml:space="preserve">En curso</w:t>
             </w:r>
           </w:p>
         </w:tc>
@@ -5073,7 +5072,7 @@
               <w:pStyle w:val="Compact"/>
             </w:pPr>
             <w:r>
-              <w:t xml:space="preserve">🟡 en curso</w:t>
+              <w:t xml:space="preserve">En curso</w:t>
             </w:r>
           </w:p>
         </w:tc>
@@ -5134,11 +5133,11 @@
       <w:pPr>
         <w:pStyle w:val="Heading2"/>
       </w:pPr>
-      <w:bookmarkStart w:id="35" w:name="_c1511168eb73996a5be3708ec63c3c203562090"/>
+      <w:bookmarkStart w:id="34" w:name="_c1511168eb73996a5be3708ec63c3c203562090"/>
       <w:r>
         <w:t xml:space="preserve">4.3 Gestión de riesgos</w:t>
       </w:r>
-      <w:bookmarkEnd w:id="35"/>
+      <w:bookmarkEnd w:id="34"/>
     </w:p>
     <w:tbl>
       <w:tblPr>
@@ -5476,175 +5475,175 @@
       <w:pPr>
         <w:pStyle w:val="Heading1"/>
       </w:pPr>
-      <w:bookmarkStart w:id="36" w:name="_82b299c4f901cbd0451d7cfa19efe6f55e8e1a4"/>
+      <w:bookmarkStart w:id="35" w:name="_82b299c4f901cbd0451d7cfa19efe6f55e8e1a4"/>
       <w:r>
         <w:t xml:space="preserve">5. Metodología y solución propuesta</w:t>
       </w:r>
+      <w:bookmarkEnd w:id="35"/>
+    </w:p>
+    <w:p>
+      <w:pPr>
+        <w:pStyle w:val="Heading2"/>
+      </w:pPr>
+      <w:bookmarkStart w:id="36" w:name="_31f8d20ce5c388c293c54ff19f6536a6c87c652"/>
+      <w:r>
+        <w:t xml:space="preserve">5.1 Visión general</w:t>
+      </w:r>
       <w:bookmarkEnd w:id="36"/>
     </w:p>
     <w:p>
       <w:pPr>
+        <w:pStyle w:val="FirstParagraph"/>
+      </w:pPr>
+      <w:r>
+        <w:t xml:space="preserve">La solución sustituye los intervalos heurísticos fijos por una</w:t>
+      </w:r>
+      <w:r>
+        <w:t xml:space="preserve"> </w:t>
+      </w:r>
+      <w:r>
+        <w:rPr>
+          <w:b/>
+          <w:bCs/>
+        </w:rPr>
+        <w:t xml:space="preserve">función probabilística de pesos entrenada</w:t>
+      </w:r>
+      <w:r>
+        <w:t xml:space="preserve">, orquestada en una arquitectura cliente-servidor, y traslada toda la</w:t>
+      </w:r>
+      <w:r>
+        <w:t xml:space="preserve"> </w:t>
+      </w:r>
+      <w:r>
+        <w:rPr>
+          <w:b/>
+          <w:bCs/>
+        </w:rPr>
+        <w:t xml:space="preserve">capa de voz al dispositivo</w:t>
+      </w:r>
+      <w:r>
+        <w:t xml:space="preserve">. El flujo de datos es:</w:t>
+      </w:r>
+    </w:p>
+    <w:p>
+      <w:pPr>
+        <w:pStyle w:val="SourceCode"/>
+      </w:pPr>
+      <w:r>
+        <w:rPr>
+          <w:rStyle w:val="VerbatimChar"/>
+        </w:rPr>
+        <w:t xml:space="preserve">┌─────────────── Cliente Flutter (offline-first) ───────────────┐</w:t>
+      </w:r>
+      <w:r>
+        <w:br/>
+      </w:r>
+      <w:r>
+        <w:rPr>
+          <w:rStyle w:val="VerbatimChar"/>
+        </w:rPr>
+        <w:t xml:space="preserve">│ UI (8 idiomas) · O Camiño · lecciones · O Laboratorio         │</w:t>
+      </w:r>
+      <w:r>
+        <w:br/>
+      </w:r>
+      <w:r>
+        <w:rPr>
+          <w:rStyle w:val="VerbatimChar"/>
+        </w:rPr>
+        <w:t xml:space="preserve">│ Motor: SM-2 (línea base) + HLR (on-device)                    │</w:t>
+      </w:r>
+      <w:r>
+        <w:br/>
+      </w:r>
+      <w:r>
+        <w:rPr>
+          <w:rStyle w:val="VerbatimChar"/>
+        </w:rPr>
+        <w:t xml:space="preserve">│ Voz: TTS gallego (Proxecto Nós) · ASR on-device (Whisper)     │</w:t>
+      </w:r>
+      <w:r>
+        <w:br/>
+      </w:r>
+      <w:r>
+        <w:rPr>
+          <w:rStyle w:val="VerbatimChar"/>
+        </w:rPr>
+        <w:t xml:space="preserve">│ Cola de telemetría persistente (Hive) + reporte (shake)       │</w:t>
+      </w:r>
+      <w:r>
+        <w:br/>
+      </w:r>
+      <w:r>
+        <w:rPr>
+          <w:rStyle w:val="VerbatimChar"/>
+        </w:rPr>
+        <w:t xml:space="preserve">└───────────────┬──────────────────────────────────▲───────────┘</w:t>
+      </w:r>
+      <w:r>
+        <w:br/>
+      </w:r>
+      <w:r>
+        <w:rPr>
+          <w:rStyle w:val="VerbatimChar"/>
+        </w:rPr>
+        <w:t xml:space="preserve">                │ eventos / feedback (HTTPS)         │ métricas</w:t>
+      </w:r>
+      <w:r>
+        <w:br/>
+      </w:r>
+      <w:r>
+        <w:rPr>
+          <w:rStyle w:val="VerbatimChar"/>
+        </w:rPr>
+        <w:t xml:space="preserve">                ▼                                    │</w:t>
+      </w:r>
+      <w:r>
+        <w:br/>
+      </w:r>
+      <w:r>
+        <w:rPr>
+          <w:rStyle w:val="VerbatimChar"/>
+        </w:rPr>
+        <w:t xml:space="preserve">┌─────────────── Backend FastAPI (nube) ────────────────────────┐</w:t>
+      </w:r>
+      <w:r>
+        <w:br/>
+      </w:r>
+      <w:r>
+        <w:rPr>
+          <w:rStyle w:val="VerbatimChar"/>
+        </w:rPr>
+        <w:t xml:space="preserve">│ /interaccion · /feedback · /sesion · /estado_memoria · /export│</w:t>
+      </w:r>
+      <w:r>
+        <w:br/>
+      </w:r>
+      <w:r>
+        <w:rPr>
+          <w:rStyle w:val="VerbatimChar"/>
+        </w:rPr>
+        <w:t xml:space="preserve">│ PostgreSQL/SQLite · Entrenamiento HLR (scikit-learn)          │</w:t>
+      </w:r>
+      <w:r>
+        <w:br/>
+      </w:r>
+      <w:r>
+        <w:rPr>
+          <w:rStyle w:val="VerbatimChar"/>
+        </w:rPr>
+        <w:t xml:space="preserve">└───────────────────────────────────────────────────────────────┘</w:t>
+      </w:r>
+    </w:p>
+    <w:p>
+      <w:pPr>
         <w:pStyle w:val="Heading2"/>
       </w:pPr>
-      <w:bookmarkStart w:id="37" w:name="_31f8d20ce5c388c293c54ff19f6536a6c87c652"/>
-      <w:r>
-        <w:t xml:space="preserve">5.1 Visión general</w:t>
+      <w:bookmarkStart w:id="37" w:name="_5beba6e99cc46a47bd943ef799c70cfd88a291b"/>
+      <w:r>
+        <w:t xml:space="preserve">5.2 SM-2 como línea base determinista</w:t>
       </w:r>
       <w:bookmarkEnd w:id="37"/>
-    </w:p>
-    <w:p>
-      <w:pPr>
-        <w:pStyle w:val="FirstParagraph"/>
-      </w:pPr>
-      <w:r>
-        <w:t xml:space="preserve">La solución sustituye los intervalos heurísticos fijos por una</w:t>
-      </w:r>
-      <w:r>
-        <w:t xml:space="preserve"> </w:t>
-      </w:r>
-      <w:r>
-        <w:rPr>
-          <w:b/>
-          <w:bCs/>
-        </w:rPr>
-        <w:t xml:space="preserve">función probabilística de pesos entrenada</w:t>
-      </w:r>
-      <w:r>
-        <w:t xml:space="preserve">, orquestada en una arquitectura cliente-servidor, y traslada toda la</w:t>
-      </w:r>
-      <w:r>
-        <w:t xml:space="preserve"> </w:t>
-      </w:r>
-      <w:r>
-        <w:rPr>
-          <w:b/>
-          <w:bCs/>
-        </w:rPr>
-        <w:t xml:space="preserve">capa de voz al dispositivo</w:t>
-      </w:r>
-      <w:r>
-        <w:t xml:space="preserve">. El flujo de datos es:</w:t>
-      </w:r>
-    </w:p>
-    <w:p>
-      <w:pPr>
-        <w:pStyle w:val="SourceCode"/>
-      </w:pPr>
-      <w:r>
-        <w:rPr>
-          <w:rStyle w:val="VerbatimChar"/>
-        </w:rPr>
-        <w:t xml:space="preserve">┌─────────────── Cliente Flutter (offline-first) ───────────────┐</w:t>
-      </w:r>
-      <w:r>
-        <w:br/>
-      </w:r>
-      <w:r>
-        <w:rPr>
-          <w:rStyle w:val="VerbatimChar"/>
-        </w:rPr>
-        <w:t xml:space="preserve">│ UI (8 idiomas) · O Camiño · lecciones · O Laboratorio         │</w:t>
-      </w:r>
-      <w:r>
-        <w:br/>
-      </w:r>
-      <w:r>
-        <w:rPr>
-          <w:rStyle w:val="VerbatimChar"/>
-        </w:rPr>
-        <w:t xml:space="preserve">│ Motor: SM-2 (línea base) + HLR (on-device)                    │</w:t>
-      </w:r>
-      <w:r>
-        <w:br/>
-      </w:r>
-      <w:r>
-        <w:rPr>
-          <w:rStyle w:val="VerbatimChar"/>
-        </w:rPr>
-        <w:t xml:space="preserve">│ Voz: TTS gallego (Proxecto Nós) · ASR on-device (Whisper)     │</w:t>
-      </w:r>
-      <w:r>
-        <w:br/>
-      </w:r>
-      <w:r>
-        <w:rPr>
-          <w:rStyle w:val="VerbatimChar"/>
-        </w:rPr>
-        <w:t xml:space="preserve">│ Cola de telemetría persistente (Hive) + reporte (shake)       │</w:t>
-      </w:r>
-      <w:r>
-        <w:br/>
-      </w:r>
-      <w:r>
-        <w:rPr>
-          <w:rStyle w:val="VerbatimChar"/>
-        </w:rPr>
-        <w:t xml:space="preserve">└───────────────┬──────────────────────────────────▲───────────┘</w:t>
-      </w:r>
-      <w:r>
-        <w:br/>
-      </w:r>
-      <w:r>
-        <w:rPr>
-          <w:rStyle w:val="VerbatimChar"/>
-        </w:rPr>
-        <w:t xml:space="preserve">                │ eventos / feedback (HTTPS)         │ métricas</w:t>
-      </w:r>
-      <w:r>
-        <w:br/>
-      </w:r>
-      <w:r>
-        <w:rPr>
-          <w:rStyle w:val="VerbatimChar"/>
-        </w:rPr>
-        <w:t xml:space="preserve">                ▼                                    │</w:t>
-      </w:r>
-      <w:r>
-        <w:br/>
-      </w:r>
-      <w:r>
-        <w:rPr>
-          <w:rStyle w:val="VerbatimChar"/>
-        </w:rPr>
-        <w:t xml:space="preserve">┌─────────────── Backend FastAPI (nube) ────────────────────────┐</w:t>
-      </w:r>
-      <w:r>
-        <w:br/>
-      </w:r>
-      <w:r>
-        <w:rPr>
-          <w:rStyle w:val="VerbatimChar"/>
-        </w:rPr>
-        <w:t xml:space="preserve">│ /interaccion · /feedback · /sesion · /estado_memoria · /export│</w:t>
-      </w:r>
-      <w:r>
-        <w:br/>
-      </w:r>
-      <w:r>
-        <w:rPr>
-          <w:rStyle w:val="VerbatimChar"/>
-        </w:rPr>
-        <w:t xml:space="preserve">│ PostgreSQL/SQLite · Entrenamiento HLR (scikit-learn)          │</w:t>
-      </w:r>
-      <w:r>
-        <w:br/>
-      </w:r>
-      <w:r>
-        <w:rPr>
-          <w:rStyle w:val="VerbatimChar"/>
-        </w:rPr>
-        <w:t xml:space="preserve">└───────────────────────────────────────────────────────────────┘</w:t>
-      </w:r>
-    </w:p>
-    <w:p>
-      <w:pPr>
-        <w:pStyle w:val="Heading2"/>
-      </w:pPr>
-      <w:bookmarkStart w:id="38" w:name="_5beba6e99cc46a47bd943ef799c70cfd88a291b"/>
-      <w:r>
-        <w:t xml:space="preserve">5.2 SM-2 como línea base determinista</w:t>
-      </w:r>
-      <w:bookmarkEnd w:id="38"/>
     </w:p>
     <w:p>
       <w:pPr>
@@ -6138,11 +6137,11 @@
       <w:pPr>
         <w:pStyle w:val="Heading2"/>
       </w:pPr>
-      <w:bookmarkStart w:id="39" w:name="_65fd049a84a8c16e37fa3b573abe7713f5c0abc"/>
+      <w:bookmarkStart w:id="38" w:name="_65fd049a84a8c16e37fa3b573abe7713f5c0abc"/>
       <w:r>
         <w:t xml:space="preserve">5.3 Modelo HLR</w:t>
       </w:r>
-      <w:bookmarkEnd w:id="39"/>
+      <w:bookmarkEnd w:id="38"/>
     </w:p>
     <w:p>
       <w:pPr>
@@ -7057,11 +7056,11 @@
       <w:pPr>
         <w:pStyle w:val="Heading2"/>
       </w:pPr>
-      <w:bookmarkStart w:id="40" w:name="_6d16239ad5bda8f7a5543ea808b5a6206749b9b"/>
+      <w:bookmarkStart w:id="39" w:name="_6d16239ad5bda8f7a5543ea808b5a6206749b9b"/>
       <w:r>
         <w:t xml:space="preserve">5.4 Planificador de repasos</w:t>
       </w:r>
-      <w:bookmarkEnd w:id="40"/>
+      <w:bookmarkEnd w:id="39"/>
     </w:p>
     <w:p>
       <w:pPr>
@@ -7285,11 +7284,11 @@
       <w:pPr>
         <w:pStyle w:val="Heading2"/>
       </w:pPr>
-      <w:bookmarkStart w:id="41" w:name="_03d29854ec86e61c953a45e9e2a26454cf5ef63"/>
+      <w:bookmarkStart w:id="40" w:name="_03d29854ec86e61c953a45e9e2a26454cf5ef63"/>
       <w:r>
         <w:t xml:space="preserve">5.5 Capa de voz local</w:t>
       </w:r>
-      <w:bookmarkEnd w:id="41"/>
+      <w:bookmarkEnd w:id="40"/>
     </w:p>
     <w:p>
       <w:pPr>
@@ -7503,11 +7502,11 @@
       <w:pPr>
         <w:pStyle w:val="Heading2"/>
       </w:pPr>
-      <w:bookmarkStart w:id="42" w:name="_0808490194110665a374897286d64374743a15e"/>
+      <w:bookmarkStart w:id="41" w:name="_0808490194110665a374897286d64374743a15e"/>
       <w:r>
         <w:t xml:space="preserve">5.6 Internacionalización con lengua objetivo</w:t>
       </w:r>
-      <w:bookmarkEnd w:id="42"/>
+      <w:bookmarkEnd w:id="41"/>
     </w:p>
     <w:p>
       <w:pPr>
@@ -7676,21 +7675,21 @@
       <w:pPr>
         <w:pStyle w:val="Heading1"/>
       </w:pPr>
-      <w:bookmarkStart w:id="43" w:name="_99bfbdf8f7b44aa8e4afb958e47ed8a959b6104"/>
+      <w:bookmarkStart w:id="42" w:name="_99bfbdf8f7b44aa8e4afb958e47ed8a959b6104"/>
       <w:r>
         <w:t xml:space="preserve">6. Arquitectura y diseño de software</w:t>
       </w:r>
+      <w:bookmarkEnd w:id="42"/>
+    </w:p>
+    <w:p>
+      <w:pPr>
+        <w:pStyle w:val="Heading2"/>
+      </w:pPr>
+      <w:bookmarkStart w:id="43" w:name="_f265a152e5497309535d31e4bff43c52ab96bba"/>
+      <w:r>
+        <w:t xml:space="preserve">6.1 Principios arquitectónicos</w:t>
+      </w:r>
       <w:bookmarkEnd w:id="43"/>
-    </w:p>
-    <w:p>
-      <w:pPr>
-        <w:pStyle w:val="Heading2"/>
-      </w:pPr>
-      <w:bookmarkStart w:id="44" w:name="_f265a152e5497309535d31e4bff43c52ab96bba"/>
-      <w:r>
-        <w:t xml:space="preserve">6.1 Principios arquitectónicos</w:t>
-      </w:r>
-      <w:bookmarkEnd w:id="44"/>
     </w:p>
     <w:p>
       <w:pPr>
@@ -7909,11 +7908,11 @@
       <w:pPr>
         <w:pStyle w:val="Heading2"/>
       </w:pPr>
-      <w:bookmarkStart w:id="45" w:name="_3cbb5274010520d0b485f3aeba3938d1aa91e32"/>
+      <w:bookmarkStart w:id="44" w:name="_3cbb5274010520d0b485f3aeba3938d1aa91e32"/>
       <w:r>
         <w:t xml:space="preserve">6.2 Cliente Flutter</w:t>
       </w:r>
-      <w:bookmarkEnd w:id="45"/>
+      <w:bookmarkEnd w:id="44"/>
     </w:p>
     <w:p>
       <w:pPr>
@@ -8394,11 +8393,11 @@
       <w:pPr>
         <w:pStyle w:val="Heading2"/>
       </w:pPr>
-      <w:bookmarkStart w:id="46" w:name="_02a1e940eff33afa5693d2a3694eea632666bb0"/>
+      <w:bookmarkStart w:id="45" w:name="_02a1e940eff33afa5693d2a3694eea632666bb0"/>
       <w:r>
         <w:t xml:space="preserve">6.3 Backend y API</w:t>
       </w:r>
-      <w:bookmarkEnd w:id="46"/>
+      <w:bookmarkEnd w:id="45"/>
     </w:p>
     <w:tbl>
       <w:tblPr>
@@ -8683,11 +8682,11 @@
       <w:pPr>
         <w:pStyle w:val="Heading2"/>
       </w:pPr>
-      <w:bookmarkStart w:id="47" w:name="_a8b35dffc4d1ae7f3adcf3d00251ac590479be0"/>
+      <w:bookmarkStart w:id="46" w:name="_a8b35dffc4d1ae7f3adcf3d00251ac590479be0"/>
       <w:r>
         <w:t xml:space="preserve">6.4 Modelo de datos</w:t>
       </w:r>
-      <w:bookmarkEnd w:id="47"/>
+      <w:bookmarkEnd w:id="46"/>
     </w:p>
     <w:p>
       <w:pPr>
@@ -9310,11 +9309,11 @@
       <w:pPr>
         <w:pStyle w:val="Heading2"/>
       </w:pPr>
-      <w:bookmarkStart w:id="48" w:name="_ad203b9fb72f86eb2aa768bab5d6a7175d7586d"/>
+      <w:bookmarkStart w:id="47" w:name="_ad203b9fb72f86eb2aa768bab5d6a7175d7586d"/>
       <w:r>
         <w:t xml:space="preserve">6.5 Capa de voz</w:t>
       </w:r>
-      <w:bookmarkEnd w:id="48"/>
+      <w:bookmarkEnd w:id="47"/>
     </w:p>
     <w:p>
       <w:pPr>
@@ -9370,11 +9369,11 @@
       <w:pPr>
         <w:pStyle w:val="Heading2"/>
       </w:pPr>
-      <w:bookmarkStart w:id="49" w:name="_955df7ee4dbd1f0f93bb15e94c0a0e2e3ec5637"/>
+      <w:bookmarkStart w:id="48" w:name="_955df7ee4dbd1f0f93bb15e94c0a0e2e3ec5637"/>
       <w:r>
         <w:t xml:space="preserve">6.6 Secuencia de ejecución</w:t>
       </w:r>
-      <w:bookmarkEnd w:id="49"/>
+      <w:bookmarkEnd w:id="48"/>
     </w:p>
     <w:p>
       <w:pPr>
@@ -9619,21 +9618,21 @@
       <w:pPr>
         <w:pStyle w:val="Heading1"/>
       </w:pPr>
-      <w:bookmarkStart w:id="50" w:name="_68823ee350c34069ede6cfaf5ec554b1c0c4faf"/>
+      <w:bookmarkStart w:id="49" w:name="_68823ee350c34069ede6cfaf5ec554b1c0c4faf"/>
       <w:r>
         <w:t xml:space="preserve">7. Tecnologías, datos y reproducibilidad</w:t>
       </w:r>
+      <w:bookmarkEnd w:id="49"/>
+    </w:p>
+    <w:p>
+      <w:pPr>
+        <w:pStyle w:val="Heading2"/>
+      </w:pPr>
+      <w:bookmarkStart w:id="50" w:name="_tecnologías"/>
+      <w:r>
+        <w:t xml:space="preserve">7.1 Tecnologías</w:t>
+      </w:r>
       <w:bookmarkEnd w:id="50"/>
-    </w:p>
-    <w:p>
-      <w:pPr>
-        <w:pStyle w:val="Heading2"/>
-      </w:pPr>
-      <w:bookmarkStart w:id="51" w:name="_tecnologías"/>
-      <w:r>
-        <w:t xml:space="preserve">7.1 Tecnologías</w:t>
-      </w:r>
-      <w:bookmarkEnd w:id="51"/>
     </w:p>
     <w:tbl>
       <w:tblPr>
@@ -10130,11 +10129,11 @@
       <w:pPr>
         <w:pStyle w:val="Heading2"/>
       </w:pPr>
-      <w:bookmarkStart w:id="52" w:name="_3147b02acfc66353c5f03ef9c4f036a76a499be"/>
+      <w:bookmarkStart w:id="51" w:name="_3147b02acfc66353c5f03ef9c4f036a76a499be"/>
       <w:r>
         <w:t xml:space="preserve">7.2 Información externa (productos de terceros)</w:t>
       </w:r>
-      <w:bookmarkEnd w:id="52"/>
+      <w:bookmarkEnd w:id="51"/>
     </w:p>
     <w:p>
       <w:pPr>
@@ -10180,45 +10179,45 @@
       <w:pPr>
         <w:pStyle w:val="Heading2"/>
       </w:pPr>
-      <w:bookmarkStart w:id="53" w:name="_4e6a8b93addb6187b275d06b70a84eaa473fd63"/>
+      <w:bookmarkStart w:id="52" w:name="_4e6a8b93addb6187b275d06b70a84eaa473fd63"/>
       <w:r>
         <w:t xml:space="preserve">7.3 Información interna y persistencia</w:t>
       </w:r>
+      <w:bookmarkEnd w:id="52"/>
+    </w:p>
+    <w:p>
+      <w:pPr>
+        <w:pStyle w:val="FirstParagraph"/>
+      </w:pPr>
+      <w:r>
+        <w:t xml:space="preserve">Datos internos: contenido del curso (JSON), audios generados (TTS), modelos de voz, y datos del usuario (progreso, historial de repetición, cola de telemetría). Los identificadores de usuario son</w:t>
+      </w:r>
+      <w:r>
+        <w:t xml:space="preserve"> </w:t>
+      </w:r>
+      <w:r>
+        <w:rPr>
+          <w:b/>
+          <w:bCs/>
+        </w:rPr>
+        <w:t xml:space="preserve">anónimos</w:t>
+      </w:r>
+      <w:r>
+        <w:t xml:space="preserve"> </w:t>
+      </w:r>
+      <w:r>
+        <w:t xml:space="preserve">(UUID generados en el dispositivo); no se recogen datos personales.</w:t>
+      </w:r>
+    </w:p>
+    <w:p>
+      <w:pPr>
+        <w:pStyle w:val="Heading2"/>
+      </w:pPr>
+      <w:bookmarkStart w:id="53" w:name="_reproducibilidad"/>
+      <w:r>
+        <w:t xml:space="preserve">7.4 Reproducibilidad</w:t>
+      </w:r>
       <w:bookmarkEnd w:id="53"/>
-    </w:p>
-    <w:p>
-      <w:pPr>
-        <w:pStyle w:val="FirstParagraph"/>
-      </w:pPr>
-      <w:r>
-        <w:t xml:space="preserve">Datos internos: contenido del curso (JSON), audios generados (TTS), modelos de voz, y datos del usuario (progreso, historial de repetición, cola de telemetría). Los identificadores de usuario son</w:t>
-      </w:r>
-      <w:r>
-        <w:t xml:space="preserve"> </w:t>
-      </w:r>
-      <w:r>
-        <w:rPr>
-          <w:b/>
-          <w:bCs/>
-        </w:rPr>
-        <w:t xml:space="preserve">anónimos</w:t>
-      </w:r>
-      <w:r>
-        <w:t xml:space="preserve"> </w:t>
-      </w:r>
-      <w:r>
-        <w:t xml:space="preserve">(UUID generados en el dispositivo); no se recogen datos personales.</w:t>
-      </w:r>
-    </w:p>
-    <w:p>
-      <w:pPr>
-        <w:pStyle w:val="Heading2"/>
-      </w:pPr>
-      <w:bookmarkStart w:id="54" w:name="_reproducibilidad"/>
-      <w:r>
-        <w:t xml:space="preserve">7.4 Reproducibilidad</w:t>
-      </w:r>
-      <w:bookmarkEnd w:id="54"/>
     </w:p>
     <w:p>
       <w:pPr>
@@ -10296,11 +10295,11 @@
       <w:pPr>
         <w:pStyle w:val="Heading2"/>
       </w:pPr>
-      <w:bookmarkStart w:id="55" w:name="_0bd7f59c23ac12f5659708fa39a61671645706c"/>
+      <w:bookmarkStart w:id="54" w:name="_0bd7f59c23ac12f5659708fa39a61671645706c"/>
       <w:r>
         <w:t xml:space="preserve">7.5 Consideraciones éticas y de privacidad</w:t>
       </w:r>
-      <w:bookmarkEnd w:id="55"/>
+      <w:bookmarkEnd w:id="54"/>
     </w:p>
     <w:p>
       <w:pPr>
@@ -10407,11 +10406,11 @@
       <w:pPr>
         <w:pStyle w:val="Heading2"/>
       </w:pPr>
-      <w:bookmarkStart w:id="56" w:name="_4c5be055df937968c3647dd0e8a55347dfa566d"/>
+      <w:bookmarkStart w:id="55" w:name="_4c5be055df937968c3647dd0e8a55347dfa566d"/>
       <w:r>
         <w:t xml:space="preserve">7.6 Integración continua y topología de despliegue</w:t>
       </w:r>
-      <w:bookmarkEnd w:id="56"/>
+      <w:bookmarkEnd w:id="55"/>
     </w:p>
     <w:p>
       <w:pPr>
@@ -10621,21 +10620,21 @@
       <w:pPr>
         <w:pStyle w:val="Heading1"/>
       </w:pPr>
-      <w:bookmarkStart w:id="57" w:name="_d41046561997e62fbe8498e48a3a83687a19590"/>
+      <w:bookmarkStart w:id="56" w:name="_d41046561997e62fbe8498e48a3a83687a19590"/>
       <w:r>
         <w:t xml:space="preserve">8. Especificación y análisis de requisitos</w:t>
       </w:r>
+      <w:bookmarkEnd w:id="56"/>
+    </w:p>
+    <w:p>
+      <w:pPr>
+        <w:pStyle w:val="Heading2"/>
+      </w:pPr>
+      <w:bookmarkStart w:id="57" w:name="_actores"/>
+      <w:r>
+        <w:t xml:space="preserve">8.1 Actores</w:t>
+      </w:r>
       <w:bookmarkEnd w:id="57"/>
-    </w:p>
-    <w:p>
-      <w:pPr>
-        <w:pStyle w:val="Heading2"/>
-      </w:pPr>
-      <w:bookmarkStart w:id="58" w:name="_actores"/>
-      <w:r>
-        <w:t xml:space="preserve">8.1 Actores</w:t>
-      </w:r>
-      <w:bookmarkEnd w:id="58"/>
     </w:p>
     <w:p>
       <w:pPr>
@@ -10707,11 +10706,11 @@
       <w:pPr>
         <w:pStyle w:val="Heading2"/>
       </w:pPr>
-      <w:bookmarkStart w:id="59" w:name="_b868ad87e130110be710fbcbe7b3062d1fcd264"/>
+      <w:bookmarkStart w:id="58" w:name="_b868ad87e130110be710fbcbe7b3062d1fcd264"/>
       <w:r>
         <w:t xml:space="preserve">8.2 Requisitos funcionales</w:t>
       </w:r>
-      <w:bookmarkEnd w:id="59"/>
+      <w:bookmarkEnd w:id="58"/>
     </w:p>
     <w:tbl>
       <w:tblPr>
@@ -11117,11 +11116,11 @@
       <w:pPr>
         <w:pStyle w:val="Heading2"/>
       </w:pPr>
-      <w:bookmarkStart w:id="60" w:name="_49ddc605a55c686252368480f1d3ee80cdaa742"/>
+      <w:bookmarkStart w:id="59" w:name="_49ddc605a55c686252368480f1d3ee80cdaa742"/>
       <w:r>
         <w:t xml:space="preserve">8.3 Requisitos no funcionales</w:t>
       </w:r>
-      <w:bookmarkEnd w:id="60"/>
+      <w:bookmarkEnd w:id="59"/>
     </w:p>
     <w:tbl>
       <w:tblPr>
@@ -11448,11 +11447,11 @@
       <w:pPr>
         <w:pStyle w:val="Heading2"/>
       </w:pPr>
-      <w:bookmarkStart w:id="61" w:name="_bb2ad75e41debda7efce77fd041ab2a1ecee2a3"/>
+      <w:bookmarkStart w:id="60" w:name="_bb2ad75e41debda7efce77fd041ab2a1ecee2a3"/>
       <w:r>
         <w:t xml:space="preserve">8.4 Casos de uso principales</w:t>
       </w:r>
-      <w:bookmarkEnd w:id="61"/>
+      <w:bookmarkEnd w:id="60"/>
     </w:p>
     <w:p>
       <w:pPr>
@@ -11580,11 +11579,11 @@
       <w:pPr>
         <w:pStyle w:val="Heading2"/>
       </w:pPr>
-      <w:bookmarkStart w:id="62" w:name="_688526cc9b244eebbebea09e23b27baae7917b6"/>
+      <w:bookmarkStart w:id="61" w:name="_688526cc9b244eebbebea09e23b27baae7917b6"/>
       <w:r>
         <w:t xml:space="preserve">8.5 Trazabilidad (objetivos → requisitos → pruebas)</w:t>
       </w:r>
-      <w:bookmarkEnd w:id="62"/>
+      <w:bookmarkEnd w:id="61"/>
     </w:p>
     <w:tbl>
       <w:tblPr>
@@ -11912,21 +11911,21 @@
       <w:pPr>
         <w:pStyle w:val="Heading1"/>
       </w:pPr>
-      <w:bookmarkStart w:id="63" w:name="_985d9891fa7e9a48d72994fbef8a866ca46bd84"/>
+      <w:bookmarkStart w:id="62" w:name="_985d9891fa7e9a48d72994fbef8a866ca46bd84"/>
       <w:r>
         <w:t xml:space="preserve">9. Evaluación experimental</w:t>
       </w:r>
+      <w:bookmarkEnd w:id="62"/>
+    </w:p>
+    <w:p>
+      <w:pPr>
+        <w:pStyle w:val="Heading2"/>
+      </w:pPr>
+      <w:bookmarkStart w:id="63" w:name="_configuración"/>
+      <w:r>
+        <w:t xml:space="preserve">9.1 Configuración</w:t>
+      </w:r>
       <w:bookmarkEnd w:id="63"/>
-    </w:p>
-    <w:p>
-      <w:pPr>
-        <w:pStyle w:val="Heading2"/>
-      </w:pPr>
-      <w:bookmarkStart w:id="64" w:name="_configuración"/>
-      <w:r>
-        <w:t xml:space="preserve">9.1 Configuración</w:t>
-      </w:r>
-      <w:bookmarkEnd w:id="64"/>
     </w:p>
     <w:p>
       <w:pPr>
@@ -12426,11 +12425,11 @@
       <w:pPr>
         <w:pStyle w:val="Heading2"/>
       </w:pPr>
-      <w:bookmarkStart w:id="65" w:name="_07c9936a93631a9dad5e0783177944b04b668fe"/>
+      <w:bookmarkStart w:id="64" w:name="_07c9936a93631a9dad5e0783177944b04b668fe"/>
       <w:r>
         <w:t xml:space="preserve">9.1b Configuración de los experimentos</w:t>
       </w:r>
-      <w:bookmarkEnd w:id="65"/>
+      <w:bookmarkEnd w:id="64"/>
     </w:p>
     <w:p>
       <w:pPr>
@@ -12624,11 +12623,11 @@
       <w:pPr>
         <w:pStyle w:val="Heading2"/>
       </w:pPr>
-      <w:bookmarkStart w:id="66" w:name="_931e668b4d97aecc6f28239169c031739845507"/>
+      <w:bookmarkStart w:id="65" w:name="_931e668b4d97aecc6f28239169c031739845507"/>
       <w:r>
         <w:t xml:space="preserve">9.2 Beta cerrada (piloto)</w:t>
       </w:r>
-      <w:bookmarkEnd w:id="66"/>
+      <w:bookmarkEnd w:id="65"/>
     </w:p>
     <w:p>
       <w:pPr>
@@ -12852,42 +12851,42 @@
       <w:pPr>
         <w:pStyle w:val="Heading2"/>
       </w:pPr>
-      <w:bookmarkStart w:id="67" w:name="_fca5f9877a04c1f3247f77a389b84fd992cd8eb"/>
+      <w:bookmarkStart w:id="66" w:name="_fca5f9877a04c1f3247f77a389b84fd992cd8eb"/>
       <w:r>
         <w:t xml:space="preserve">9.3 Retención (D1/D7)</w:t>
       </w:r>
+      <w:bookmarkEnd w:id="66"/>
+    </w:p>
+    <w:p>
+      <w:pPr>
+        <w:pStyle w:val="FirstParagraph"/>
+      </w:pPr>
+      <w:r>
+        <w:t xml:space="preserve">La retención se calcula a partir de las sesiones diarias registradas. Con el tamaño muestral actual, los valores de</w:t>
+      </w:r>
+      <w:r>
+        <w:t xml:space="preserve"> </w:t>
+      </w:r>
+      <w:r>
+        <w:rPr>
+          <w:b/>
+          <w:bCs/>
+        </w:rPr>
+        <w:t xml:space="preserve">D1/D7 son indicativos</w:t>
+      </w:r>
+      <w:r>
+        <w:t xml:space="preserve">, no concluyentes para H2. El sistema está preparado para escalar la muestra (solo requiere más tiempo de uso).</w:t>
+      </w:r>
+    </w:p>
+    <w:p>
+      <w:pPr>
+        <w:pStyle w:val="Heading2"/>
+      </w:pPr>
+      <w:bookmarkStart w:id="67" w:name="_de3458ce16f128060dc89242ff5d93f95940723"/>
+      <w:r>
+        <w:t xml:space="preserve">9.4 Error del modelo (MAE, Brier, AUC-ROC, calibración) y sesgo de programación</w:t>
+      </w:r>
       <w:bookmarkEnd w:id="67"/>
-    </w:p>
-    <w:p>
-      <w:pPr>
-        <w:pStyle w:val="FirstParagraph"/>
-      </w:pPr>
-      <w:r>
-        <w:t xml:space="preserve">La retención se calcula a partir de las sesiones diarias registradas. Con el tamaño muestral actual, los valores de</w:t>
-      </w:r>
-      <w:r>
-        <w:t xml:space="preserve"> </w:t>
-      </w:r>
-      <w:r>
-        <w:rPr>
-          <w:b/>
-          <w:bCs/>
-        </w:rPr>
-        <w:t xml:space="preserve">D1/D7 son indicativos</w:t>
-      </w:r>
-      <w:r>
-        <w:t xml:space="preserve">, no concluyentes para H2. El sistema está preparado para escalar la muestra (solo requiere más tiempo de uso).</w:t>
-      </w:r>
-    </w:p>
-    <w:p>
-      <w:pPr>
-        <w:pStyle w:val="Heading2"/>
-      </w:pPr>
-      <w:bookmarkStart w:id="68" w:name="_de3458ce16f128060dc89242ff5d93f95940723"/>
-      <w:r>
-        <w:t xml:space="preserve">9.4 Error del modelo (MAE, Brier, AUC-ROC, calibración) y sesgo de programación</w:t>
-      </w:r>
-      <w:bookmarkEnd w:id="68"/>
     </w:p>
     <w:p>
       <w:pPr>
@@ -13462,18 +13461,18 @@
           <wp:inline>
             <wp:extent cx="5334000" cy="3556000"/>
             <wp:effectExtent b="0" l="0" r="0" t="0"/>
-            <wp:docPr descr="Error de predicción HLR vs SM-2 (datos reales)" title="" id="70" name="Picture"/>
+            <wp:docPr descr="Error de predicción HLR vs SM-2 (datos reales)" title="" id="69" name="Picture"/>
             <a:graphic>
               <a:graphicData uri="http://schemas.openxmlformats.org/drawingml/2006/picture">
                 <pic:pic>
                   <pic:nvPicPr>
-                    <pic:cNvPr descr="figuras/fig_mae_rmse.png" id="71" name="Picture"/>
+                    <pic:cNvPr descr="figuras/fig_mae_rmse.png" id="70" name="Picture"/>
                     <pic:cNvPicPr>
                       <a:picLocks noChangeArrowheads="1" noChangeAspect="1"/>
                     </pic:cNvPicPr>
                   </pic:nvPicPr>
                   <pic:blipFill>
-                    <a:blip r:embed="rId69"/>
+                    <a:blip r:embed="rId68"/>
                     <a:stretch>
                       <a:fillRect/>
                     </a:stretch>
@@ -13517,18 +13516,18 @@
           <wp:inline>
             <wp:extent cx="4572000" cy="4572000"/>
             <wp:effectExtent b="0" l="0" r="0" t="0"/>
-            <wp:docPr descr="Curva ROC (datos reales)" title="" id="73" name="Picture"/>
+            <wp:docPr descr="Curva ROC (datos reales)" title="" id="72" name="Picture"/>
             <a:graphic>
               <a:graphicData uri="http://schemas.openxmlformats.org/drawingml/2006/picture">
                 <pic:pic>
                   <pic:nvPicPr>
-                    <pic:cNvPr descr="figuras/fig_roc.png" id="74" name="Picture"/>
+                    <pic:cNvPr descr="figuras/fig_roc.png" id="73" name="Picture"/>
                     <pic:cNvPicPr>
                       <a:picLocks noChangeArrowheads="1" noChangeAspect="1"/>
                     </pic:cNvPicPr>
                   </pic:nvPicPr>
                   <pic:blipFill>
-                    <a:blip r:embed="rId72"/>
+                    <a:blip r:embed="rId71"/>
                     <a:stretch>
                       <a:fillRect/>
                     </a:stretch>
@@ -13572,18 +13571,18 @@
           <wp:inline>
             <wp:extent cx="4572000" cy="4572000"/>
             <wp:effectExtent b="0" l="0" r="0" t="0"/>
-            <wp:docPr descr="Curva de calibración (datos reales)" title="" id="76" name="Picture"/>
+            <wp:docPr descr="Curva de calibración (datos reales)" title="" id="75" name="Picture"/>
             <a:graphic>
               <a:graphicData uri="http://schemas.openxmlformats.org/drawingml/2006/picture">
                 <pic:pic>
                   <pic:nvPicPr>
-                    <pic:cNvPr descr="figuras/fig_calibracion.png" id="77" name="Picture"/>
+                    <pic:cNvPr descr="figuras/fig_calibracion.png" id="76" name="Picture"/>
                     <pic:cNvPicPr>
                       <a:picLocks noChangeArrowheads="1" noChangeAspect="1"/>
                     </pic:cNvPicPr>
                   </pic:nvPicPr>
                   <pic:blipFill>
-                    <a:blip r:embed="rId75"/>
+                    <a:blip r:embed="rId74"/>
                     <a:stretch>
                       <a:fillRect/>
                     </a:stretch>
@@ -13635,18 +13634,18 @@
           <wp:inline>
             <wp:extent cx="5334000" cy="3556000"/>
             <wp:effectExtent b="0" l="0" r="0" t="0"/>
-            <wp:docPr descr="Curva de olvido observada vs predicha" title="" id="79" name="Picture"/>
+            <wp:docPr descr="Curva de olvido observada vs predicha" title="" id="78" name="Picture"/>
             <a:graphic>
               <a:graphicData uri="http://schemas.openxmlformats.org/drawingml/2006/picture">
                 <pic:pic>
                   <pic:nvPicPr>
-                    <pic:cNvPr descr="figuras/fig_retencion.png" id="80" name="Picture"/>
+                    <pic:cNvPr descr="figuras/fig_retencion.png" id="79" name="Picture"/>
                     <pic:cNvPicPr>
                       <a:picLocks noChangeArrowheads="1" noChangeAspect="1"/>
                     </pic:cNvPicPr>
                   </pic:nvPicPr>
                   <pic:blipFill>
-                    <a:blip r:embed="rId78"/>
+                    <a:blip r:embed="rId77"/>
                     <a:stretch>
                       <a:fillRect/>
                     </a:stretch>
@@ -13698,18 +13697,18 @@
           <wp:inline>
             <wp:extent cx="4572000" cy="4572000"/>
             <wp:effectExtent b="0" l="0" r="0" t="0"/>
-            <wp:docPr descr="Simulación: curva ROC" title="" id="82" name="Picture"/>
+            <wp:docPr descr="Simulación: curva ROC" title="" id="81" name="Picture"/>
             <a:graphic>
               <a:graphicData uri="http://schemas.openxmlformats.org/drawingml/2006/picture">
                 <pic:pic>
                   <pic:nvPicPr>
-                    <pic:cNvPr descr="figuras/sim_roc.png" id="83" name="Picture"/>
+                    <pic:cNvPr descr="figuras/sim_roc.png" id="82" name="Picture"/>
                     <pic:cNvPicPr>
                       <a:picLocks noChangeArrowheads="1" noChangeAspect="1"/>
                     </pic:cNvPicPr>
                   </pic:nvPicPr>
                   <pic:blipFill>
-                    <a:blip r:embed="rId81"/>
+                    <a:blip r:embed="rId80"/>
                     <a:stretch>
                       <a:fillRect/>
                     </a:stretch>
@@ -13753,18 +13752,18 @@
           <wp:inline>
             <wp:extent cx="4572000" cy="4572000"/>
             <wp:effectExtent b="0" l="0" r="0" t="0"/>
-            <wp:docPr descr="Simulación: calibración" title="" id="85" name="Picture"/>
+            <wp:docPr descr="Simulación: calibración" title="" id="84" name="Picture"/>
             <a:graphic>
               <a:graphicData uri="http://schemas.openxmlformats.org/drawingml/2006/picture">
                 <pic:pic>
                   <pic:nvPicPr>
-                    <pic:cNvPr descr="figuras/sim_calibracion.png" id="86" name="Picture"/>
+                    <pic:cNvPr descr="figuras/sim_calibracion.png" id="85" name="Picture"/>
                     <pic:cNvPicPr>
                       <a:picLocks noChangeArrowheads="1" noChangeAspect="1"/>
                     </pic:cNvPicPr>
                   </pic:nvPicPr>
                   <pic:blipFill>
-                    <a:blip r:embed="rId84"/>
+                    <a:blip r:embed="rId83"/>
                     <a:stretch>
                       <a:fillRect/>
                     </a:stretch>
@@ -13827,11 +13826,11 @@
       <w:pPr>
         <w:pStyle w:val="Heading2"/>
       </w:pPr>
-      <w:bookmarkStart w:id="87" w:name="_3346fc10e65fbc61e848ed09a5edc0f67a01927"/>
+      <w:bookmarkStart w:id="86" w:name="_3346fc10e65fbc61e848ed09a5edc0f67a01927"/>
       <w:r>
         <w:t xml:space="preserve">9.5 Validación de la capa de voz</w:t>
       </w:r>
-      <w:bookmarkEnd w:id="87"/>
+      <w:bookmarkEnd w:id="86"/>
     </w:p>
     <w:p>
       <w:pPr>
@@ -14168,11 +14167,11 @@
       <w:pPr>
         <w:pStyle w:val="Heading2"/>
       </w:pPr>
-      <w:bookmarkStart w:id="88" w:name="_5d693d5222d672587b7b7ebddc53209f99f7690"/>
+      <w:bookmarkStart w:id="87" w:name="_5d693d5222d672587b7b7ebddc53209f99f7690"/>
       <w:r>
         <w:t xml:space="preserve">9.6 Estado de las hipótesis</w:t>
       </w:r>
-      <w:bookmarkEnd w:id="88"/>
+      <w:bookmarkEnd w:id="87"/>
     </w:p>
     <w:p>
       <w:pPr>
@@ -14239,11 +14238,11 @@
       <w:pPr>
         <w:pStyle w:val="Heading2"/>
       </w:pPr>
-      <w:bookmarkStart w:id="89" w:name="_f23831c7b6a366a42d7fc1a798d379c198c1953"/>
+      <w:bookmarkStart w:id="88" w:name="_f23831c7b6a366a42d7fc1a798d379c198c1953"/>
       <w:r>
         <w:t xml:space="preserve">9.7 Interpretación y decisiones derivadas</w:t>
       </w:r>
-      <w:bookmarkEnd w:id="89"/>
+      <w:bookmarkEnd w:id="88"/>
     </w:p>
     <w:p>
       <w:pPr>
@@ -14374,21 +14373,21 @@
       <w:pPr>
         <w:pStyle w:val="Heading1"/>
       </w:pPr>
-      <w:bookmarkStart w:id="90" w:name="_2513f1cfafad6e168e691196780263f573f0e3c"/>
+      <w:bookmarkStart w:id="89" w:name="_2513f1cfafad6e168e691196780263f573f0e3c"/>
       <w:r>
         <w:t xml:space="preserve">10. Verificación y calidad del software</w:t>
       </w:r>
+      <w:bookmarkEnd w:id="89"/>
+    </w:p>
+    <w:p>
+      <w:pPr>
+        <w:pStyle w:val="Heading2"/>
+      </w:pPr>
+      <w:bookmarkStart w:id="90" w:name="_a238a5a8cb3f42f967916ed2157f0004aad70b3"/>
+      <w:r>
+        <w:t xml:space="preserve">10.1 Estrategia de verificación</w:t>
+      </w:r>
       <w:bookmarkEnd w:id="90"/>
-    </w:p>
-    <w:p>
-      <w:pPr>
-        <w:pStyle w:val="Heading2"/>
-      </w:pPr>
-      <w:bookmarkStart w:id="91" w:name="_a238a5a8cb3f42f967916ed2157f0004aad70b3"/>
-      <w:r>
-        <w:t xml:space="preserve">10.1 Estrategia de verificación</w:t>
-      </w:r>
-      <w:bookmarkEnd w:id="91"/>
     </w:p>
     <w:p>
       <w:pPr>
@@ -14483,29 +14482,29 @@
       <w:pPr>
         <w:pStyle w:val="Heading2"/>
       </w:pPr>
-      <w:bookmarkStart w:id="92" w:name="_7b7a73e0518380d71791912246da32213184fe5"/>
+      <w:bookmarkStart w:id="91" w:name="_7b7a73e0518380d71791912246da32213184fe5"/>
       <w:r>
         <w:t xml:space="preserve">10.2 Matriz de trazabilidad</w:t>
       </w:r>
+      <w:bookmarkEnd w:id="91"/>
+    </w:p>
+    <w:p>
+      <w:pPr>
+        <w:pStyle w:val="FirstParagraph"/>
+      </w:pPr>
+      <w:r>
+        <w:t xml:space="preserve">La matriz de §8.4 relaciona objetivos, requisitos y pruebas. Cada requisito funcional tiene al menos una prueba o evidencia asociada.</w:t>
+      </w:r>
+    </w:p>
+    <w:p>
+      <w:pPr>
+        <w:pStyle w:val="Heading2"/>
+      </w:pPr>
+      <w:bookmarkStart w:id="92" w:name="_c3afa5a4cc55d0e4e4d7b16bd1a26528b83b09b"/>
+      <w:r>
+        <w:t xml:space="preserve">10.3 Cobertura funcional de las pruebas</w:t>
+      </w:r>
       <w:bookmarkEnd w:id="92"/>
-    </w:p>
-    <w:p>
-      <w:pPr>
-        <w:pStyle w:val="FirstParagraph"/>
-      </w:pPr>
-      <w:r>
-        <w:t xml:space="preserve">La matriz de §8.4 relaciona objetivos, requisitos y pruebas. Cada requisito funcional tiene al menos una prueba o evidencia asociada.</w:t>
-      </w:r>
-    </w:p>
-    <w:p>
-      <w:pPr>
-        <w:pStyle w:val="Heading2"/>
-      </w:pPr>
-      <w:bookmarkStart w:id="93" w:name="_c3afa5a4cc55d0e4e4d7b16bd1a26528b83b09b"/>
-      <w:r>
-        <w:t xml:space="preserve">10.3 Cobertura funcional de las pruebas</w:t>
-      </w:r>
-      <w:bookmarkEnd w:id="93"/>
     </w:p>
     <w:p>
       <w:pPr>
@@ -15026,29 +15025,29 @@
       <w:pPr>
         <w:pStyle w:val="Heading2"/>
       </w:pPr>
-      <w:bookmarkStart w:id="94" w:name="_9efd597a2a2908dec8bfb2d064968508b0643b1"/>
+      <w:bookmarkStart w:id="93" w:name="_9efd597a2a2908dec8bfb2d064968508b0643b1"/>
       <w:r>
         <w:t xml:space="preserve">10.4 Prueba de aceptación</w:t>
       </w:r>
+      <w:bookmarkEnd w:id="93"/>
+    </w:p>
+    <w:p>
+      <w:pPr>
+        <w:pStyle w:val="FirstParagraph"/>
+      </w:pPr>
+      <w:r>
+        <w:t xml:space="preserve">Se verificó el flujo completo en dispositivo real (iPhone): instalación, onboarding, lección, ejercicios de voz (offline), repaso y reporte de incidencias, con la telemetría llegando al backend. Se validó además la actualización de versión sobre la instalación previa y la persistencia del progreso.</w:t>
+      </w:r>
+    </w:p>
+    <w:p>
+      <w:pPr>
+        <w:pStyle w:val="Heading2"/>
+      </w:pPr>
+      <w:bookmarkStart w:id="94" w:name="_d4b3cbf0a100ddc80782ec4a69c34c6ec5e08e3"/>
+      <w:r>
+        <w:t xml:space="preserve">10.5 Reproducibilidad</w:t>
+      </w:r>
       <w:bookmarkEnd w:id="94"/>
-    </w:p>
-    <w:p>
-      <w:pPr>
-        <w:pStyle w:val="FirstParagraph"/>
-      </w:pPr>
-      <w:r>
-        <w:t xml:space="preserve">Se verificó el flujo completo en dispositivo real (iPhone): instalación, onboarding, lección, ejercicios de voz (offline), repaso y reporte de incidencias, con la telemetría llegando al backend. Se validó además la actualización de versión sobre la instalación previa y la persistencia del progreso.</w:t>
-      </w:r>
-    </w:p>
-    <w:p>
-      <w:pPr>
-        <w:pStyle w:val="Heading2"/>
-      </w:pPr>
-      <w:bookmarkStart w:id="95" w:name="_d4b3cbf0a100ddc80782ec4a69c34c6ec5e08e3"/>
-      <w:r>
-        <w:t xml:space="preserve">10.5 Reproducibilidad</w:t>
-      </w:r>
-      <w:bookmarkEnd w:id="95"/>
     </w:p>
     <w:p>
       <w:pPr>
@@ -15075,21 +15074,21 @@
       <w:pPr>
         <w:pStyle w:val="Heading1"/>
       </w:pPr>
-      <w:bookmarkStart w:id="96" w:name="_772b4b57d5248a6aeba453332574a9d19b3abe3"/>
+      <w:bookmarkStart w:id="95" w:name="_772b4b57d5248a6aeba453332574a9d19b3abe3"/>
       <w:r>
         <w:t xml:space="preserve">11. Manual de instalación y uso</w:t>
       </w:r>
+      <w:bookmarkEnd w:id="95"/>
+    </w:p>
+    <w:p>
+      <w:pPr>
+        <w:pStyle w:val="Heading2"/>
+      </w:pPr>
+      <w:bookmarkStart w:id="96" w:name="_32e1c626b6469e8b319d0f628f80b3df4b6c190"/>
+      <w:r>
+        <w:t xml:space="preserve">11.1 Requisitos previos</w:t>
+      </w:r>
       <w:bookmarkEnd w:id="96"/>
-    </w:p>
-    <w:p>
-      <w:pPr>
-        <w:pStyle w:val="Heading2"/>
-      </w:pPr>
-      <w:bookmarkStart w:id="97" w:name="_32e1c626b6469e8b319d0f628f80b3df4b6c190"/>
-      <w:r>
-        <w:t xml:space="preserve">11.1 Requisitos previos</w:t>
-      </w:r>
-      <w:bookmarkEnd w:id="97"/>
     </w:p>
     <w:tbl>
       <w:tblPr>
@@ -15253,11 +15252,11 @@
       <w:pPr>
         <w:pStyle w:val="Heading2"/>
       </w:pPr>
-      <w:bookmarkStart w:id="98" w:name="_26d40383c0ac3a6be887258a6ead949be85ec8e"/>
+      <w:bookmarkStart w:id="97" w:name="_26d40383c0ac3a6be887258a6ead949be85ec8e"/>
       <w:r>
         <w:t xml:space="preserve">11.2 Despliegue del backend</w:t>
       </w:r>
-      <w:bookmarkEnd w:id="98"/>
+      <w:bookmarkEnd w:id="97"/>
     </w:p>
     <w:p>
       <w:pPr>
@@ -15376,230 +15375,230 @@
       <w:pPr>
         <w:pStyle w:val="Heading2"/>
       </w:pPr>
-      <w:bookmarkStart w:id="99" w:name="_a09dc28ef2429b9a8b307ba71f5944e6f01a75d"/>
+      <w:bookmarkStart w:id="98" w:name="_a09dc28ef2429b9a8b307ba71f5944e6f01a75d"/>
       <w:r>
         <w:t xml:space="preserve">11.3 Compilación y distribución de la app</w:t>
       </w:r>
+      <w:bookmarkEnd w:id="98"/>
+    </w:p>
+    <w:p>
+      <w:pPr>
+        <w:pStyle w:val="SourceCode"/>
+      </w:pPr>
+      <w:r>
+        <w:rPr>
+          <w:rStyle w:val="ExtensionTok"/>
+        </w:rPr>
+        <w:t xml:space="preserve">flutter</w:t>
+      </w:r>
+      <w:r>
+        <w:rPr>
+          <w:rStyle w:val="NormalTok"/>
+        </w:rPr>
+        <w:t xml:space="preserve"> pub get</w:t>
+      </w:r>
+      <w:r>
+        <w:br/>
+      </w:r>
+      <w:r>
+        <w:rPr>
+          <w:rStyle w:val="FunctionTok"/>
+        </w:rPr>
+        <w:t xml:space="preserve">bash</w:t>
+      </w:r>
+      <w:r>
+        <w:rPr>
+          <w:rStyle w:val="NormalTok"/>
+        </w:rPr>
+        <w:t xml:space="preserve"> tool/fetch_asr_model.sh small        </w:t>
+      </w:r>
+      <w:r>
+        <w:rPr>
+          <w:rStyle w:val="CommentTok"/>
+        </w:rPr>
+        <w:t xml:space="preserve"># descarga el modelo ASR (~370 MB)</w:t>
+      </w:r>
+      <w:r>
+        <w:br/>
+      </w:r>
+      <w:r>
+        <w:rPr>
+          <w:rStyle w:val="ExtensionTok"/>
+        </w:rPr>
+        <w:t xml:space="preserve">flutter</w:t>
+      </w:r>
+      <w:r>
+        <w:rPr>
+          <w:rStyle w:val="NormalTok"/>
+        </w:rPr>
+        <w:t xml:space="preserve"> build apk </w:t>
+      </w:r>
+      <w:r>
+        <w:rPr>
+          <w:rStyle w:val="AttributeTok"/>
+        </w:rPr>
+        <w:t xml:space="preserve">--release</w:t>
+      </w:r>
+      <w:r>
+        <w:rPr>
+          <w:rStyle w:val="NormalTok"/>
+        </w:rPr>
+        <w:t xml:space="preserve"> </w:t>
+      </w:r>
+      <w:r>
+        <w:rPr>
+          <w:rStyle w:val="AttributeTok"/>
+        </w:rPr>
+        <w:t xml:space="preserve">--dart-define</w:t>
+      </w:r>
+      <w:r>
+        <w:rPr>
+          <w:rStyle w:val="OperatorTok"/>
+        </w:rPr>
+        <w:t xml:space="preserve">=</w:t>
+      </w:r>
+      <w:r>
+        <w:rPr>
+          <w:rStyle w:val="NormalTok"/>
+        </w:rPr>
+        <w:t xml:space="preserve">API_BASE_URL=</w:t>
+      </w:r>
+      <w:r>
+        <w:rPr>
+          <w:rStyle w:val="OperatorTok"/>
+        </w:rPr>
+        <w:t xml:space="preserve">&lt;</w:t>
+      </w:r>
+      <w:r>
+        <w:rPr>
+          <w:rStyle w:val="NormalTok"/>
+        </w:rPr>
+        <w:t xml:space="preserve">backend</w:t>
+      </w:r>
+      <w:r>
+        <w:rPr>
+          <w:rStyle w:val="OperatorTok"/>
+        </w:rPr>
+        <w:t xml:space="preserve">&gt;</w:t>
+      </w:r>
+      <w:r>
+        <w:rPr>
+          <w:rStyle w:val="NormalTok"/>
+        </w:rPr>
+        <w:t xml:space="preserve">   </w:t>
+      </w:r>
+      <w:r>
+        <w:rPr>
+          <w:rStyle w:val="CommentTok"/>
+        </w:rPr>
+        <w:t xml:space="preserve"># Android firmado</w:t>
+      </w:r>
+      <w:r>
+        <w:br/>
+      </w:r>
+      <w:r>
+        <w:rPr>
+          <w:rStyle w:val="ExtensionTok"/>
+        </w:rPr>
+        <w:t xml:space="preserve">flutter</w:t>
+      </w:r>
+      <w:r>
+        <w:rPr>
+          <w:rStyle w:val="NormalTok"/>
+        </w:rPr>
+        <w:t xml:space="preserve"> build ios </w:t>
+      </w:r>
+      <w:r>
+        <w:rPr>
+          <w:rStyle w:val="AttributeTok"/>
+        </w:rPr>
+        <w:t xml:space="preserve">--release</w:t>
+      </w:r>
+      <w:r>
+        <w:rPr>
+          <w:rStyle w:val="NormalTok"/>
+        </w:rPr>
+        <w:t xml:space="preserve"> </w:t>
+      </w:r>
+      <w:r>
+        <w:rPr>
+          <w:rStyle w:val="AttributeTok"/>
+        </w:rPr>
+        <w:t xml:space="preserve">--dart-define</w:t>
+      </w:r>
+      <w:r>
+        <w:rPr>
+          <w:rStyle w:val="OperatorTok"/>
+        </w:rPr>
+        <w:t xml:space="preserve">=</w:t>
+      </w:r>
+      <w:r>
+        <w:rPr>
+          <w:rStyle w:val="NormalTok"/>
+        </w:rPr>
+        <w:t xml:space="preserve">API_BASE_URL=</w:t>
+      </w:r>
+      <w:r>
+        <w:rPr>
+          <w:rStyle w:val="OperatorTok"/>
+        </w:rPr>
+        <w:t xml:space="preserve">&lt;</w:t>
+      </w:r>
+      <w:r>
+        <w:rPr>
+          <w:rStyle w:val="NormalTok"/>
+        </w:rPr>
+        <w:t xml:space="preserve">backend</w:t>
+      </w:r>
+      <w:r>
+        <w:rPr>
+          <w:rStyle w:val="OperatorTok"/>
+        </w:rPr>
+        <w:t xml:space="preserve">&gt;</w:t>
+      </w:r>
+      <w:r>
+        <w:rPr>
+          <w:rStyle w:val="NormalTok"/>
+        </w:rPr>
+        <w:t xml:space="preserve">   </w:t>
+      </w:r>
+      <w:r>
+        <w:rPr>
+          <w:rStyle w:val="CommentTok"/>
+        </w:rPr>
+        <w:t xml:space="preserve"># iOS (requiere firma)</w:t>
+      </w:r>
+      <w:r>
+        <w:br/>
+      </w:r>
+      <w:r>
+        <w:rPr>
+          <w:rStyle w:val="ExtensionTok"/>
+        </w:rPr>
+        <w:t xml:space="preserve">flutter</w:t>
+      </w:r>
+      <w:r>
+        <w:rPr>
+          <w:rStyle w:val="NormalTok"/>
+        </w:rPr>
+        <w:t xml:space="preserve"> build macos </w:t>
+      </w:r>
+      <w:r>
+        <w:rPr>
+          <w:rStyle w:val="AttributeTok"/>
+        </w:rPr>
+        <w:t xml:space="preserve">--release</w:t>
+      </w:r>
+    </w:p>
+    <w:p>
+      <w:pPr>
+        <w:pStyle w:val="Heading2"/>
+      </w:pPr>
+      <w:bookmarkStart w:id="99" w:name="_uso"/>
+      <w:r>
+        <w:t xml:space="preserve">11.4 Uso</w:t>
+      </w:r>
       <w:bookmarkEnd w:id="99"/>
-    </w:p>
-    <w:p>
-      <w:pPr>
-        <w:pStyle w:val="SourceCode"/>
-      </w:pPr>
-      <w:r>
-        <w:rPr>
-          <w:rStyle w:val="ExtensionTok"/>
-        </w:rPr>
-        <w:t xml:space="preserve">flutter</w:t>
-      </w:r>
-      <w:r>
-        <w:rPr>
-          <w:rStyle w:val="NormalTok"/>
-        </w:rPr>
-        <w:t xml:space="preserve"> pub get</w:t>
-      </w:r>
-      <w:r>
-        <w:br/>
-      </w:r>
-      <w:r>
-        <w:rPr>
-          <w:rStyle w:val="FunctionTok"/>
-        </w:rPr>
-        <w:t xml:space="preserve">bash</w:t>
-      </w:r>
-      <w:r>
-        <w:rPr>
-          <w:rStyle w:val="NormalTok"/>
-        </w:rPr>
-        <w:t xml:space="preserve"> tool/fetch_asr_model.sh small        </w:t>
-      </w:r>
-      <w:r>
-        <w:rPr>
-          <w:rStyle w:val="CommentTok"/>
-        </w:rPr>
-        <w:t xml:space="preserve"># descarga el modelo ASR (~370 MB)</w:t>
-      </w:r>
-      <w:r>
-        <w:br/>
-      </w:r>
-      <w:r>
-        <w:rPr>
-          <w:rStyle w:val="ExtensionTok"/>
-        </w:rPr>
-        <w:t xml:space="preserve">flutter</w:t>
-      </w:r>
-      <w:r>
-        <w:rPr>
-          <w:rStyle w:val="NormalTok"/>
-        </w:rPr>
-        <w:t xml:space="preserve"> build apk </w:t>
-      </w:r>
-      <w:r>
-        <w:rPr>
-          <w:rStyle w:val="AttributeTok"/>
-        </w:rPr>
-        <w:t xml:space="preserve">--release</w:t>
-      </w:r>
-      <w:r>
-        <w:rPr>
-          <w:rStyle w:val="NormalTok"/>
-        </w:rPr>
-        <w:t xml:space="preserve"> </w:t>
-      </w:r>
-      <w:r>
-        <w:rPr>
-          <w:rStyle w:val="AttributeTok"/>
-        </w:rPr>
-        <w:t xml:space="preserve">--dart-define</w:t>
-      </w:r>
-      <w:r>
-        <w:rPr>
-          <w:rStyle w:val="OperatorTok"/>
-        </w:rPr>
-        <w:t xml:space="preserve">=</w:t>
-      </w:r>
-      <w:r>
-        <w:rPr>
-          <w:rStyle w:val="NormalTok"/>
-        </w:rPr>
-        <w:t xml:space="preserve">API_BASE_URL=</w:t>
-      </w:r>
-      <w:r>
-        <w:rPr>
-          <w:rStyle w:val="OperatorTok"/>
-        </w:rPr>
-        <w:t xml:space="preserve">&lt;</w:t>
-      </w:r>
-      <w:r>
-        <w:rPr>
-          <w:rStyle w:val="NormalTok"/>
-        </w:rPr>
-        <w:t xml:space="preserve">backend</w:t>
-      </w:r>
-      <w:r>
-        <w:rPr>
-          <w:rStyle w:val="OperatorTok"/>
-        </w:rPr>
-        <w:t xml:space="preserve">&gt;</w:t>
-      </w:r>
-      <w:r>
-        <w:rPr>
-          <w:rStyle w:val="NormalTok"/>
-        </w:rPr>
-        <w:t xml:space="preserve">   </w:t>
-      </w:r>
-      <w:r>
-        <w:rPr>
-          <w:rStyle w:val="CommentTok"/>
-        </w:rPr>
-        <w:t xml:space="preserve"># Android firmado</w:t>
-      </w:r>
-      <w:r>
-        <w:br/>
-      </w:r>
-      <w:r>
-        <w:rPr>
-          <w:rStyle w:val="ExtensionTok"/>
-        </w:rPr>
-        <w:t xml:space="preserve">flutter</w:t>
-      </w:r>
-      <w:r>
-        <w:rPr>
-          <w:rStyle w:val="NormalTok"/>
-        </w:rPr>
-        <w:t xml:space="preserve"> build ios </w:t>
-      </w:r>
-      <w:r>
-        <w:rPr>
-          <w:rStyle w:val="AttributeTok"/>
-        </w:rPr>
-        <w:t xml:space="preserve">--release</w:t>
-      </w:r>
-      <w:r>
-        <w:rPr>
-          <w:rStyle w:val="NormalTok"/>
-        </w:rPr>
-        <w:t xml:space="preserve"> </w:t>
-      </w:r>
-      <w:r>
-        <w:rPr>
-          <w:rStyle w:val="AttributeTok"/>
-        </w:rPr>
-        <w:t xml:space="preserve">--dart-define</w:t>
-      </w:r>
-      <w:r>
-        <w:rPr>
-          <w:rStyle w:val="OperatorTok"/>
-        </w:rPr>
-        <w:t xml:space="preserve">=</w:t>
-      </w:r>
-      <w:r>
-        <w:rPr>
-          <w:rStyle w:val="NormalTok"/>
-        </w:rPr>
-        <w:t xml:space="preserve">API_BASE_URL=</w:t>
-      </w:r>
-      <w:r>
-        <w:rPr>
-          <w:rStyle w:val="OperatorTok"/>
-        </w:rPr>
-        <w:t xml:space="preserve">&lt;</w:t>
-      </w:r>
-      <w:r>
-        <w:rPr>
-          <w:rStyle w:val="NormalTok"/>
-        </w:rPr>
-        <w:t xml:space="preserve">backend</w:t>
-      </w:r>
-      <w:r>
-        <w:rPr>
-          <w:rStyle w:val="OperatorTok"/>
-        </w:rPr>
-        <w:t xml:space="preserve">&gt;</w:t>
-      </w:r>
-      <w:r>
-        <w:rPr>
-          <w:rStyle w:val="NormalTok"/>
-        </w:rPr>
-        <w:t xml:space="preserve">   </w:t>
-      </w:r>
-      <w:r>
-        <w:rPr>
-          <w:rStyle w:val="CommentTok"/>
-        </w:rPr>
-        <w:t xml:space="preserve"># iOS (requiere firma)</w:t>
-      </w:r>
-      <w:r>
-        <w:br/>
-      </w:r>
-      <w:r>
-        <w:rPr>
-          <w:rStyle w:val="ExtensionTok"/>
-        </w:rPr>
-        <w:t xml:space="preserve">flutter</w:t>
-      </w:r>
-      <w:r>
-        <w:rPr>
-          <w:rStyle w:val="NormalTok"/>
-        </w:rPr>
-        <w:t xml:space="preserve"> build macos </w:t>
-      </w:r>
-      <w:r>
-        <w:rPr>
-          <w:rStyle w:val="AttributeTok"/>
-        </w:rPr>
-        <w:t xml:space="preserve">--release</w:t>
-      </w:r>
-    </w:p>
-    <w:p>
-      <w:pPr>
-        <w:pStyle w:val="Heading2"/>
-      </w:pPr>
-      <w:bookmarkStart w:id="100" w:name="_uso"/>
-      <w:r>
-        <w:t xml:space="preserve">11.4 Uso</w:t>
-      </w:r>
-      <w:bookmarkEnd w:id="100"/>
     </w:p>
     <w:p>
       <w:pPr>
@@ -15729,11 +15728,11 @@
       <w:pPr>
         <w:pStyle w:val="Heading2"/>
       </w:pPr>
-      <w:bookmarkStart w:id="101" w:name="_f9d7979f00a12ac70d6679942d53aabef91c136"/>
+      <w:bookmarkStart w:id="100" w:name="_f9d7979f00a12ac70d6679942d53aabef91c136"/>
       <w:r>
         <w:t xml:space="preserve">11.5 Resolución de problemas frecuentes</w:t>
       </w:r>
-      <w:bookmarkEnd w:id="101"/>
+      <w:bookmarkEnd w:id="100"/>
     </w:p>
     <w:p>
       <w:pPr>
@@ -15823,11 +15822,11 @@
       <w:pPr>
         <w:pStyle w:val="Heading2"/>
       </w:pPr>
-      <w:bookmarkStart w:id="102" w:name="_bb9cfa87be9c3cbef0faa0d199aa14ac3fc8c0f"/>
+      <w:bookmarkStart w:id="101" w:name="_bb9cfa87be9c3cbef0faa0d199aa14ac3fc8c0f"/>
       <w:r>
         <w:t xml:space="preserve">11.6 Distribución y firma</w:t>
       </w:r>
-      <w:bookmarkEnd w:id="102"/>
+      <w:bookmarkEnd w:id="101"/>
     </w:p>
     <w:p>
       <w:pPr>
@@ -16054,11 +16053,11 @@
       <w:pPr>
         <w:pStyle w:val="Heading2"/>
       </w:pPr>
-      <w:bookmarkStart w:id="103" w:name="_859bc4fee679c939f43223e32d461b92caf4d09"/>
+      <w:bookmarkStart w:id="102" w:name="_859bc4fee679c939f43223e32d461b92caf4d09"/>
       <w:r>
         <w:t xml:space="preserve">11.7 Mantenimiento y operación</w:t>
       </w:r>
-      <w:bookmarkEnd w:id="103"/>
+      <w:bookmarkEnd w:id="102"/>
     </w:p>
     <w:p>
       <w:pPr>
@@ -16259,21 +16258,21 @@
       <w:pPr>
         <w:pStyle w:val="Heading1"/>
       </w:pPr>
-      <w:bookmarkStart w:id="104" w:name="_discusión"/>
+      <w:bookmarkStart w:id="103" w:name="_discusión"/>
       <w:r>
         <w:t xml:space="preserve">12. Discusión</w:t>
       </w:r>
+      <w:bookmarkEnd w:id="103"/>
+    </w:p>
+    <w:p>
+      <w:pPr>
+        <w:pStyle w:val="Heading2"/>
+      </w:pPr>
+      <w:bookmarkStart w:id="104" w:name="_fd7f77e59bf56272a41e63540ba2d26cf5734a4"/>
+      <w:r>
+        <w:t xml:space="preserve">12.1 Lectura conjunta de los resultados</w:t>
+      </w:r>
       <w:bookmarkEnd w:id="104"/>
-    </w:p>
-    <w:p>
-      <w:pPr>
-        <w:pStyle w:val="Heading2"/>
-      </w:pPr>
-      <w:bookmarkStart w:id="105" w:name="_fd7f77e59bf56272a41e63540ba2d26cf5734a4"/>
-      <w:r>
-        <w:t xml:space="preserve">12.1 Lectura conjunta de los resultados</w:t>
-      </w:r>
-      <w:bookmarkEnd w:id="105"/>
     </w:p>
     <w:p>
       <w:pPr>
@@ -16366,11 +16365,11 @@
       <w:pPr>
         <w:pStyle w:val="Heading2"/>
       </w:pPr>
-      <w:bookmarkStart w:id="106" w:name="_c1e80dd9fe2710ea138294612f911dc1203dd13"/>
+      <w:bookmarkStart w:id="105" w:name="_c1e80dd9fe2710ea138294612f911dc1203dd13"/>
       <w:r>
         <w:t xml:space="preserve">12.2 Aportación científica</w:t>
       </w:r>
-      <w:bookmarkEnd w:id="106"/>
+      <w:bookmarkEnd w:id="105"/>
     </w:p>
     <w:p>
       <w:pPr>
@@ -16474,11 +16473,11 @@
       <w:pPr>
         <w:pStyle w:val="Heading2"/>
       </w:pPr>
-      <w:bookmarkStart w:id="107" w:name="_97377cd795e45fa9c1c369ac746690c52bfbbca"/>
+      <w:bookmarkStart w:id="106" w:name="_97377cd795e45fa9c1c369ac746690c52bfbbca"/>
       <w:r>
         <w:t xml:space="preserve">12.3 Aportación de ingeniería</w:t>
       </w:r>
-      <w:bookmarkEnd w:id="107"/>
+      <w:bookmarkEnd w:id="106"/>
     </w:p>
     <w:p>
       <w:pPr>
@@ -16582,11 +16581,11 @@
       <w:pPr>
         <w:pStyle w:val="Heading2"/>
       </w:pPr>
-      <w:bookmarkStart w:id="108" w:name="_limitaciones"/>
+      <w:bookmarkStart w:id="107" w:name="_limitaciones"/>
       <w:r>
         <w:t xml:space="preserve">12.4 Limitaciones</w:t>
       </w:r>
-      <w:bookmarkEnd w:id="108"/>
+      <w:bookmarkEnd w:id="107"/>
     </w:p>
     <w:p>
       <w:pPr>
@@ -16776,11 +16775,11 @@
       <w:pPr>
         <w:pStyle w:val="Heading2"/>
       </w:pPr>
-      <w:bookmarkStart w:id="109" w:name="_484754590e6904425b5c945128e94a523b506e1"/>
+      <w:bookmarkStart w:id="108" w:name="_484754590e6904425b5c945128e94a523b506e1"/>
       <w:r>
         <w:t xml:space="preserve">12.5 Amenazas a la validez</w:t>
       </w:r>
-      <w:bookmarkEnd w:id="109"/>
+      <w:bookmarkEnd w:id="108"/>
     </w:p>
     <w:p>
       <w:pPr>
@@ -16898,11 +16897,11 @@
       <w:pPr>
         <w:pStyle w:val="Heading2"/>
       </w:pPr>
-      <w:bookmarkStart w:id="110" w:name="_b3c47eb9e78423996be7da5327757845106028e"/>
+      <w:bookmarkStart w:id="109" w:name="_b3c47eb9e78423996be7da5327757845106028e"/>
       <w:r>
         <w:t xml:space="preserve">12.6 Consideraciones éticas</w:t>
       </w:r>
-      <w:bookmarkEnd w:id="110"/>
+      <w:bookmarkEnd w:id="109"/>
     </w:p>
     <w:p>
       <w:pPr>
@@ -16987,21 +16986,21 @@
       <w:pPr>
         <w:pStyle w:val="Heading1"/>
       </w:pPr>
-      <w:bookmarkStart w:id="111" w:name="_6e51db4bda71573f47e1320a83c5d87f69a1e6c"/>
+      <w:bookmarkStart w:id="110" w:name="_6e51db4bda71573f47e1320a83c5d87f69a1e6c"/>
       <w:r>
         <w:t xml:space="preserve">13. Conclusiones y trabajo futuro</w:t>
       </w:r>
+      <w:bookmarkEnd w:id="110"/>
+    </w:p>
+    <w:p>
+      <w:pPr>
+        <w:pStyle w:val="Heading2"/>
+      </w:pPr>
+      <w:bookmarkStart w:id="111" w:name="_546d1cd1585eb2050ed76988f153a461ff2afc9"/>
+      <w:r>
+        <w:t xml:space="preserve">13.1 Conclusiones técnicas</w:t>
+      </w:r>
       <w:bookmarkEnd w:id="111"/>
-    </w:p>
-    <w:p>
-      <w:pPr>
-        <w:pStyle w:val="Heading2"/>
-      </w:pPr>
-      <w:bookmarkStart w:id="112" w:name="_546d1cd1585eb2050ed76988f153a461ff2afc9"/>
-      <w:r>
-        <w:t xml:space="preserve">13.1 Conclusiones técnicas</w:t>
-      </w:r>
-      <w:bookmarkEnd w:id="112"/>
     </w:p>
     <w:p>
       <w:pPr>
@@ -17139,29 +17138,29 @@
       <w:pPr>
         <w:pStyle w:val="Heading2"/>
       </w:pPr>
-      <w:bookmarkStart w:id="113" w:name="_7e7fc96c71535c476ee013cf3a121b9b6f9675f"/>
+      <w:bookmarkStart w:id="112" w:name="_7e7fc96c71535c476ee013cf3a121b9b6f9675f"/>
       <w:r>
         <w:t xml:space="preserve">13.2 Conclusiones personales</w:t>
       </w:r>
+      <w:bookmarkEnd w:id="112"/>
+    </w:p>
+    <w:p>
+      <w:pPr>
+        <w:pStyle w:val="FirstParagraph"/>
+      </w:pPr>
+      <w:r>
+        <w:t xml:space="preserve">El trabajo ha supuesto un ejercicio completo de ingeniería de producto bajo restricciones reales (coste, memoria, precisión, multiplataforma). La detección de defectos a partir de datos reales —y su corrección— ha sido la parte más formativa, junto con la constatación de que la inteligencia artificial y la ingeniería pueden ponerse al servicio de la inclusión lingüística.</w:t>
+      </w:r>
+    </w:p>
+    <w:p>
+      <w:pPr>
+        <w:pStyle w:val="Heading2"/>
+      </w:pPr>
+      <w:bookmarkStart w:id="113" w:name="_d5950c82479f498c555b2f8a3a996df6d79b37d"/>
+      <w:r>
+        <w:t xml:space="preserve">13.3 Trabajo futuro</w:t>
+      </w:r>
       <w:bookmarkEnd w:id="113"/>
-    </w:p>
-    <w:p>
-      <w:pPr>
-        <w:pStyle w:val="FirstParagraph"/>
-      </w:pPr>
-      <w:r>
-        <w:t xml:space="preserve">El trabajo ha supuesto un ejercicio completo de ingeniería de producto bajo restricciones reales (coste, memoria, precisión, multiplataforma). La detección de defectos a partir de datos reales —y su corrección— ha sido la parte más formativa, junto con la constatación de que la inteligencia artificial y la ingeniería pueden ponerse al servicio de la inclusión lingüística.</w:t>
-      </w:r>
-    </w:p>
-    <w:p>
-      <w:pPr>
-        <w:pStyle w:val="Heading2"/>
-      </w:pPr>
-      <w:bookmarkStart w:id="114" w:name="_d5950c82479f498c555b2f8a3a996df6d79b37d"/>
-      <w:r>
-        <w:t xml:space="preserve">13.3 Trabajo futuro</w:t>
-      </w:r>
-      <w:bookmarkEnd w:id="114"/>
     </w:p>
     <w:p>
       <w:pPr>
@@ -17321,11 +17320,11 @@
       <w:pPr>
         <w:pStyle w:val="Heading1"/>
       </w:pPr>
-      <w:bookmarkStart w:id="115" w:name="_referencias"/>
+      <w:bookmarkStart w:id="114" w:name="_referencias"/>
       <w:r>
         <w:t xml:space="preserve">Referencias</w:t>
       </w:r>
-      <w:bookmarkEnd w:id="115"/>
+      <w:bookmarkEnd w:id="114"/>
     </w:p>
     <w:p>
       <w:pPr>
@@ -17613,225 +17612,225 @@
       <w:pPr>
         <w:pStyle w:val="Heading1"/>
       </w:pPr>
-      <w:bookmarkStart w:id="116" w:name="_anexos"/>
+      <w:bookmarkStart w:id="115" w:name="_anexos"/>
       <w:r>
         <w:t xml:space="preserve">Anexos</w:t>
       </w:r>
+      <w:bookmarkEnd w:id="115"/>
+    </w:p>
+    <w:p>
+      <w:pPr>
+        <w:pStyle w:val="Heading2"/>
+      </w:pPr>
+      <w:bookmarkStart w:id="116" w:name="_cb06e7e0ea042027c7d6b3cfe3d16c83d28a26e"/>
+      <w:r>
+        <w:t xml:space="preserve">Anexo A. Manual de despliegue</w:t>
+      </w:r>
       <w:bookmarkEnd w:id="116"/>
     </w:p>
     <w:p>
       <w:pPr>
+        <w:pStyle w:val="FirstParagraph"/>
+      </w:pPr>
+      <w:r>
+        <w:t xml:space="preserve">Backend:</w:t>
+      </w:r>
+      <w:r>
+        <w:t xml:space="preserve"> </w:t>
+      </w:r>
+      <w:r>
+        <w:rPr>
+          <w:rStyle w:val="VerbatimChar"/>
+        </w:rPr>
+        <w:t xml:space="preserve">docker compose up --build</w:t>
+      </w:r>
+      <w:r>
+        <w:t xml:space="preserve"> </w:t>
+      </w:r>
+      <w:r>
+        <w:t xml:space="preserve">(API en</w:t>
+      </w:r>
+      <w:r>
+        <w:t xml:space="preserve"> </w:t>
+      </w:r>
+      <w:r>
+        <w:rPr>
+          <w:rStyle w:val="VerbatimChar"/>
+        </w:rPr>
+        <w:t xml:space="preserve">:8000</w:t>
+      </w:r>
+      <w:r>
+        <w:t xml:space="preserve">). Variables:</w:t>
+      </w:r>
+      <w:r>
+        <w:t xml:space="preserve"> </w:t>
+      </w:r>
+      <w:r>
+        <w:rPr>
+          <w:rStyle w:val="VerbatimChar"/>
+        </w:rPr>
+        <w:t xml:space="preserve">DATABASE_URL</w:t>
+      </w:r>
+      <w:r>
+        <w:t xml:space="preserve">,</w:t>
+      </w:r>
+      <w:r>
+        <w:t xml:space="preserve"> </w:t>
+      </w:r>
+      <w:r>
+        <w:rPr>
+          <w:rStyle w:val="VerbatimChar"/>
+        </w:rPr>
+        <w:t xml:space="preserve">EXPORT_TOKEN</w:t>
+      </w:r>
+      <w:r>
+        <w:t xml:space="preserve">. Endpoints en §6.3. Reentrenamiento:</w:t>
+      </w:r>
+      <w:r>
+        <w:t xml:space="preserve"> </w:t>
+      </w:r>
+      <w:r>
+        <w:rPr>
+          <w:rStyle w:val="VerbatimChar"/>
+        </w:rPr>
+        <w:t xml:space="preserve">python train_hlr.py</w:t>
+      </w:r>
+      <w:r>
+        <w:t xml:space="preserve">; análisis:</w:t>
+      </w:r>
+      <w:r>
+        <w:t xml:space="preserve"> </w:t>
+      </w:r>
+      <w:r>
+        <w:rPr>
+          <w:rStyle w:val="VerbatimChar"/>
+        </w:rPr>
+        <w:t xml:space="preserve">python analisis_beta_remote.py</w:t>
+      </w:r>
+      <w:r>
+        <w:t xml:space="preserve"> </w:t>
+      </w:r>
+      <w:r>
+        <w:t xml:space="preserve">(retención D1/D7). Cliente: comandos en §11.3.</w:t>
+      </w:r>
+    </w:p>
+    <w:p>
+      <w:pPr>
         <w:pStyle w:val="Heading2"/>
       </w:pPr>
-      <w:bookmarkStart w:id="117" w:name="_cb06e7e0ea042027c7d6b3cfe3d16c83d28a26e"/>
-      <w:r>
-        <w:t xml:space="preserve">Anexo A. Manual de despliegue</w:t>
+      <w:bookmarkStart w:id="117" w:name="_9462d500f0f59901160d3660486e4af9aa92d48"/>
+      <w:r>
+        <w:t xml:space="preserve">Anexo B. Comandos de reproducción</w:t>
       </w:r>
       <w:bookmarkEnd w:id="117"/>
     </w:p>
     <w:p>
       <w:pPr>
-        <w:pStyle w:val="FirstParagraph"/>
-      </w:pPr>
-      <w:r>
-        <w:t xml:space="preserve">Backend:</w:t>
-      </w:r>
-      <w:r>
-        <w:t xml:space="preserve"> </w:t>
-      </w:r>
-      <w:r>
-        <w:rPr>
-          <w:rStyle w:val="VerbatimChar"/>
-        </w:rPr>
-        <w:t xml:space="preserve">docker compose up --build</w:t>
-      </w:r>
-      <w:r>
-        <w:t xml:space="preserve"> </w:t>
-      </w:r>
-      <w:r>
-        <w:t xml:space="preserve">(API en</w:t>
-      </w:r>
-      <w:r>
-        <w:t xml:space="preserve"> </w:t>
-      </w:r>
-      <w:r>
-        <w:rPr>
-          <w:rStyle w:val="VerbatimChar"/>
-        </w:rPr>
-        <w:t xml:space="preserve">:8000</w:t>
-      </w:r>
-      <w:r>
-        <w:t xml:space="preserve">). Variables:</w:t>
-      </w:r>
-      <w:r>
-        <w:t xml:space="preserve"> </w:t>
-      </w:r>
-      <w:r>
-        <w:rPr>
-          <w:rStyle w:val="VerbatimChar"/>
-        </w:rPr>
-        <w:t xml:space="preserve">DATABASE_URL</w:t>
-      </w:r>
-      <w:r>
-        <w:t xml:space="preserve">,</w:t>
-      </w:r>
-      <w:r>
-        <w:t xml:space="preserve"> </w:t>
-      </w:r>
-      <w:r>
-        <w:rPr>
-          <w:rStyle w:val="VerbatimChar"/>
-        </w:rPr>
-        <w:t xml:space="preserve">EXPORT_TOKEN</w:t>
-      </w:r>
-      <w:r>
-        <w:t xml:space="preserve">. Endpoints en §6.3. Reentrenamiento:</w:t>
-      </w:r>
-      <w:r>
-        <w:t xml:space="preserve"> </w:t>
-      </w:r>
-      <w:r>
-        <w:rPr>
-          <w:rStyle w:val="VerbatimChar"/>
-        </w:rPr>
-        <w:t xml:space="preserve">python train_hlr.py</w:t>
-      </w:r>
-      <w:r>
-        <w:t xml:space="preserve">; análisis:</w:t>
-      </w:r>
-      <w:r>
-        <w:t xml:space="preserve"> </w:t>
-      </w:r>
-      <w:r>
-        <w:rPr>
-          <w:rStyle w:val="VerbatimChar"/>
-        </w:rPr>
-        <w:t xml:space="preserve">python analisis_beta_remote.py</w:t>
-      </w:r>
-      <w:r>
-        <w:t xml:space="preserve"> </w:t>
-      </w:r>
-      <w:r>
-        <w:t xml:space="preserve">(retención D1/D7). Cliente: comandos en §11.3.</w:t>
+        <w:pStyle w:val="SourceCode"/>
+      </w:pPr>
+      <w:r>
+        <w:rPr>
+          <w:rStyle w:val="CommentTok"/>
+        </w:rPr>
+        <w:t xml:space="preserve"># Modelo ASR on-device</w:t>
+      </w:r>
+      <w:r>
+        <w:br/>
+      </w:r>
+      <w:r>
+        <w:rPr>
+          <w:rStyle w:val="FunctionTok"/>
+        </w:rPr>
+        <w:t xml:space="preserve">bash</w:t>
+      </w:r>
+      <w:r>
+        <w:rPr>
+          <w:rStyle w:val="NormalTok"/>
+        </w:rPr>
+        <w:t xml:space="preserve"> tool/fetch_asr_model.sh small</w:t>
+      </w:r>
+      <w:r>
+        <w:br/>
+      </w:r>
+      <w:r>
+        <w:rPr>
+          <w:rStyle w:val="CommentTok"/>
+        </w:rPr>
+        <w:t xml:space="preserve"># Experimento HLR vs SM-2 (datos reales FSRS)</w:t>
+      </w:r>
+      <w:r>
+        <w:br/>
+      </w:r>
+      <w:r>
+        <w:rPr>
+          <w:rStyle w:val="ExtensionTok"/>
+        </w:rPr>
+        <w:t xml:space="preserve">python</w:t>
+      </w:r>
+      <w:r>
+        <w:rPr>
+          <w:rStyle w:val="NormalTok"/>
+        </w:rPr>
+        <w:t xml:space="preserve"> backend/experimentos/hlr_vs_sm2_fsrs.py</w:t>
+      </w:r>
+      <w:r>
+        <w:br/>
+      </w:r>
+      <w:r>
+        <w:rPr>
+          <w:rStyle w:val="CommentTok"/>
+        </w:rPr>
+        <w:t xml:space="preserve"># Simulación con verdad conocida</w:t>
+      </w:r>
+      <w:r>
+        <w:br/>
+      </w:r>
+      <w:r>
+        <w:rPr>
+          <w:rStyle w:val="ExtensionTok"/>
+        </w:rPr>
+        <w:t xml:space="preserve">python</w:t>
+      </w:r>
+      <w:r>
+        <w:rPr>
+          <w:rStyle w:val="NormalTok"/>
+        </w:rPr>
+        <w:t xml:space="preserve"> backend/experimentos/simulacion_hlr.py</w:t>
+      </w:r>
+      <w:r>
+        <w:br/>
+      </w:r>
+      <w:r>
+        <w:rPr>
+          <w:rStyle w:val="CommentTok"/>
+        </w:rPr>
+        <w:t xml:space="preserve"># Traducción de ejercicios (i18n)</w:t>
+      </w:r>
+      <w:r>
+        <w:br/>
+      </w:r>
+      <w:r>
+        <w:rPr>
+          <w:rStyle w:val="ExtensionTok"/>
+        </w:rPr>
+        <w:t xml:space="preserve">python</w:t>
+      </w:r>
+      <w:r>
+        <w:rPr>
+          <w:rStyle w:val="NormalTok"/>
+        </w:rPr>
+        <w:t xml:space="preserve"> tool/i18n_exercises.py</w:t>
       </w:r>
     </w:p>
     <w:p>
       <w:pPr>
         <w:pStyle w:val="Heading2"/>
       </w:pPr>
-      <w:bookmarkStart w:id="118" w:name="_9462d500f0f59901160d3660486e4af9aa92d48"/>
-      <w:r>
-        <w:t xml:space="preserve">Anexo B. Comandos de reproducción</w:t>
+      <w:bookmarkStart w:id="118" w:name="_f9b0b437d285cf7775b1298c5655e81e33a4706"/>
+      <w:r>
+        <w:t xml:space="preserve">Anexo C. Corpus de evaluación</w:t>
       </w:r>
       <w:bookmarkEnd w:id="118"/>
-    </w:p>
-    <w:p>
-      <w:pPr>
-        <w:pStyle w:val="SourceCode"/>
-      </w:pPr>
-      <w:r>
-        <w:rPr>
-          <w:rStyle w:val="CommentTok"/>
-        </w:rPr>
-        <w:t xml:space="preserve"># Modelo ASR on-device</w:t>
-      </w:r>
-      <w:r>
-        <w:br/>
-      </w:r>
-      <w:r>
-        <w:rPr>
-          <w:rStyle w:val="FunctionTok"/>
-        </w:rPr>
-        <w:t xml:space="preserve">bash</w:t>
-      </w:r>
-      <w:r>
-        <w:rPr>
-          <w:rStyle w:val="NormalTok"/>
-        </w:rPr>
-        <w:t xml:space="preserve"> tool/fetch_asr_model.sh small</w:t>
-      </w:r>
-      <w:r>
-        <w:br/>
-      </w:r>
-      <w:r>
-        <w:rPr>
-          <w:rStyle w:val="CommentTok"/>
-        </w:rPr>
-        <w:t xml:space="preserve"># Experimento HLR vs SM-2 (datos reales FSRS)</w:t>
-      </w:r>
-      <w:r>
-        <w:br/>
-      </w:r>
-      <w:r>
-        <w:rPr>
-          <w:rStyle w:val="ExtensionTok"/>
-        </w:rPr>
-        <w:t xml:space="preserve">python</w:t>
-      </w:r>
-      <w:r>
-        <w:rPr>
-          <w:rStyle w:val="NormalTok"/>
-        </w:rPr>
-        <w:t xml:space="preserve"> backend/experimentos/hlr_vs_sm2_fsrs.py</w:t>
-      </w:r>
-      <w:r>
-        <w:br/>
-      </w:r>
-      <w:r>
-        <w:rPr>
-          <w:rStyle w:val="CommentTok"/>
-        </w:rPr>
-        <w:t xml:space="preserve"># Simulación con verdad conocida</w:t>
-      </w:r>
-      <w:r>
-        <w:br/>
-      </w:r>
-      <w:r>
-        <w:rPr>
-          <w:rStyle w:val="ExtensionTok"/>
-        </w:rPr>
-        <w:t xml:space="preserve">python</w:t>
-      </w:r>
-      <w:r>
-        <w:rPr>
-          <w:rStyle w:val="NormalTok"/>
-        </w:rPr>
-        <w:t xml:space="preserve"> backend/experimentos/simulacion_hlr.py</w:t>
-      </w:r>
-      <w:r>
-        <w:br/>
-      </w:r>
-      <w:r>
-        <w:rPr>
-          <w:rStyle w:val="CommentTok"/>
-        </w:rPr>
-        <w:t xml:space="preserve"># Traducción de ejercicios (i18n)</w:t>
-      </w:r>
-      <w:r>
-        <w:br/>
-      </w:r>
-      <w:r>
-        <w:rPr>
-          <w:rStyle w:val="ExtensionTok"/>
-        </w:rPr>
-        <w:t xml:space="preserve">python</w:t>
-      </w:r>
-      <w:r>
-        <w:rPr>
-          <w:rStyle w:val="NormalTok"/>
-        </w:rPr>
-        <w:t xml:space="preserve"> tool/i18n_exercises.py</w:t>
-      </w:r>
-    </w:p>
-    <w:p>
-      <w:pPr>
-        <w:pStyle w:val="Heading2"/>
-      </w:pPr>
-      <w:bookmarkStart w:id="119" w:name="_f9b0b437d285cf7775b1298c5655e81e33a4706"/>
-      <w:r>
-        <w:t xml:space="preserve">Anexo C. Corpus de evaluación</w:t>
-      </w:r>
-      <w:bookmarkEnd w:id="119"/>
     </w:p>
     <w:p>
       <w:pPr>

</xml_diff>

<commit_message>
docs(memoria): citar [12] (dataset FSRS/Anki) no texto (§7.2 e §9.1)
</commit_message>
<xml_diff>
--- a/TFM/TFM Galingo Ver 4.0.docx
+++ b/TFM/TFM Galingo Ver 4.0.docx
@@ -10156,7 +10156,7 @@
         <w:t xml:space="preserve"> </w:t>
       </w:r>
       <w:r>
-        <w:t xml:space="preserve">y los modelos del Proxecto Nós son recursos publicados por la USC; Whisper (OpenAI) se distribuye con licencia permisiva; sherpa-onnx es software libre. El dataset de evaluación de repetición espaciada empleado en §9 (FSRS/Anki revlogs) se distribuye con licencia MIT. Se justifica el uso de cada componente por la</w:t>
+        <w:t xml:space="preserve">y los modelos del Proxecto Nós son recursos publicados por la USC; Whisper (OpenAI) se distribuye con licencia permisiva; sherpa-onnx es software libre. El dataset de evaluación de repetición espaciada empleado en §9 (FSRS/Anki revlogs) [12] se distribuye con licencia MIT. Se justifica el uso de cada componente por la</w:t>
       </w:r>
       <w:r>
         <w:t xml:space="preserve"> </w:t>
@@ -12027,7 +12027,10 @@
         <w:t xml:space="preserve">FSRS/Anki revlogs</w:t>
       </w:r>
       <w:r>
-        <w:t xml:space="preserve">, licencia MIT: 3,17 M de repasos, 30 usuarios, 312 195 tarjetas) y (ii) una</w:t>
+        <w:t xml:space="preserve"> </w:t>
+      </w:r>
+      <w:r>
+        <w:t xml:space="preserve">[12], licencia MIT: 3,17 M de repasos, 30 usuarios, 312 195 tarjetas) y (ii) una</w:t>
       </w:r>
       <w:r>
         <w:t xml:space="preserve"> </w:t>

</xml_diff>

<commit_message>
docs(memoria): revisar referencias (datos completos, 5 novas, renumerar por orde de aparición)
</commit_message>
<xml_diff>
--- a/TFM/TFM Galingo Ver 4.0.docx
+++ b/TFM/TFM Galingo Ver 4.0.docx
@@ -1400,7 +1400,7 @@
         <w:t xml:space="preserve"> </w:t>
       </w:r>
       <w:r>
-        <w:t xml:space="preserve">de Ebbinghaus (1885) describe el decaimiento de la retención a lo largo del tiempo y constituye el fundamento de todos los sistemas de repetición espaciada. Sobre ella se han construido varias generaciones de algoritmos:</w:t>
+        <w:t xml:space="preserve">de Ebbinghaus (1885) [1] describe el decaimiento de la retención a lo largo del tiempo y constituye el fundamento de todos los sistemas de repetición espaciada. Sobre ella se han construido varias generaciones de algoritmos:</w:t>
       </w:r>
     </w:p>
     <w:p>
@@ -1416,13 +1416,13 @@
           <w:b/>
           <w:bCs/>
         </w:rPr>
-        <w:t xml:space="preserve">Leitner (1972).</w:t>
-      </w:r>
-      <w:r>
-        <w:t xml:space="preserve"> </w:t>
-      </w:r>
-      <w:r>
-        <w:t xml:space="preserve">Sistema de cajas: cada acierto promueve la tarjeta a una caja con intervalos mayores; cada fallo la devuelve a la primera. Sencillo y determinista.</w:t>
+        <w:t xml:space="preserve">Leitner (1972)</w:t>
+      </w:r>
+      <w:r>
+        <w:t xml:space="preserve"> </w:t>
+      </w:r>
+      <w:r>
+        <w:t xml:space="preserve">[2]. Sistema de cajas: cada acierto promueve la tarjeta a una caja con intervalos mayores; cada fallo la devuelve a la primera. Sencillo y determinista.</w:t>
       </w:r>
     </w:p>
     <w:p>
@@ -1528,7 +1528,7 @@
         <w:t xml:space="preserve"> </w:t>
       </w:r>
       <w:r>
-        <w:t xml:space="preserve">[2]. Es sensible al historial, pero sus parámetros están</w:t>
+        <w:t xml:space="preserve">[3]. Es sensible al historial, pero sus parámetros están</w:t>
       </w:r>
       <w:r>
         <w:t xml:space="preserve"> </w:t>
@@ -1582,7 +1582,7 @@
         <w:t xml:space="preserve"> </w:t>
       </w:r>
       <w:r>
-        <w:t xml:space="preserve">(FSRS), un modelo basado en la dificultad y la estabilidad de cada tarjeta, estimado por optimización a partir de los</w:t>
+        <w:t xml:space="preserve">(FSRS) [4], un modelo basado en la dificultad y la estabilidad de cada tarjeta, estimado por optimización a partir de los</w:t>
       </w:r>
       <w:r>
         <w:t xml:space="preserve"> </w:t>
@@ -1644,7 +1644,7 @@
         <w:t xml:space="preserve"> </w:t>
       </w:r>
       <w:r>
-        <w:t xml:space="preserve">mediante una regresión sobre características del ítem y del usuario, y deriva de ella la probabilidad de recuerdo [1].</w:t>
+        <w:t xml:space="preserve">mediante una regresión sobre características del ítem y del usuario, y deriva de ella la probabilidad de recuerdo [5].</w:t>
       </w:r>
     </w:p>
     <w:p>
@@ -1696,7 +1696,7 @@
         <w:t xml:space="preserve"> </w:t>
       </w:r>
       <w:r>
-        <w:t xml:space="preserve">Sustituyen la regresión por redes recurrentes capaces de modelar secuencias completas de interacción [3], a costa de más datos y complejidad.</w:t>
+        <w:t xml:space="preserve">Sustituyen la regresión por redes recurrentes capaces de modelar secuencias completas de interacción [6], a costa de más datos y complejidad.</w:t>
       </w:r>
     </w:p>
     <w:tbl>
@@ -2630,7 +2630,7 @@
         <w:t xml:space="preserve"> </w:t>
       </w:r>
       <w:r>
-        <w:t xml:space="preserve">[9] es un modelo</w:t>
+        <w:t xml:space="preserve">[7] es un modelo</w:t>
       </w:r>
       <w:r>
         <w:t xml:space="preserve"> </w:t>
@@ -2700,7 +2700,7 @@
         <w:t xml:space="preserve"> </w:t>
       </w:r>
       <w:r>
-        <w:t xml:space="preserve">afinados para gallego (p. ej. recursos del Proxecto Nós [8]) alcanzan mejor precisión, pero exigen arquitecturas que no siempre están soportadas por los</w:t>
+        <w:t xml:space="preserve">[8] afinados para gallego (p. ej. recursos del Proxecto Nós [9]) alcanzan mejor precisión, pero exigen arquitecturas que no siempre están soportadas por los</w:t>
       </w:r>
       <w:r>
         <w:t xml:space="preserve"> </w:t>
@@ -2818,7 +2818,7 @@
         <w:t xml:space="preserve"> </w:t>
       </w:r>
       <w:r>
-        <w:t xml:space="preserve">[8] publica voces en gallego (entre ellas</w:t>
+        <w:t xml:space="preserve">[9] publica voces en gallego (entre ellas</w:t>
       </w:r>
       <w:r>
         <w:t xml:space="preserve"> </w:t>
@@ -2831,7 +2831,7 @@
         <w:t xml:space="preserve">Celtia</w:t>
       </w:r>
       <w:r>
-        <w:t xml:space="preserve">, basada en VITS) que permiten generar el</w:t>
+        <w:t xml:space="preserve">, basada en VITS [11]) que permiten generar el</w:t>
       </w:r>
       <w:r>
         <w:t xml:space="preserve"> </w:t>
@@ -2893,7 +2893,7 @@
         <w:t xml:space="preserve"> </w:t>
       </w:r>
       <w:r>
-        <w:t xml:space="preserve">(corpus oral) [4] y recursos de generación automática de lenguaje [5], relevantes para futuros dictados con voz natural y para modelar la dificultad léxica real de los ítems.</w:t>
+        <w:t xml:space="preserve">(corpus oral) [12] y recursos de generación automática de lenguaje [13], relevantes para futuros dictados con voz natural y para modelar la dificultad léxica real de los ítems.</w:t>
       </w:r>
     </w:p>
     <w:p>
@@ -2927,7 +2927,7 @@
         <w:t xml:space="preserve"> </w:t>
       </w:r>
       <w:r>
-        <w:t xml:space="preserve">[11] organiza la competencia en seis niveles (A1–C2); Galingo se centra en el</w:t>
+        <w:t xml:space="preserve">[14] organiza la competencia en seis niveles (A1–C2); Galingo se centra en el</w:t>
       </w:r>
       <w:r>
         <w:t xml:space="preserve"> </w:t>
@@ -3095,7 +3095,7 @@
         <w:t xml:space="preserve">idioma del usuario</w:t>
       </w:r>
       <w:r>
-        <w:t xml:space="preserve">. La cercanía entre gallego y portugués, aprovechada en traducción automática [6], informa además la</w:t>
+        <w:t xml:space="preserve">. La cercanía entre gallego y portugués, aprovechada en traducción automática [15], informa además la</w:t>
       </w:r>
       <w:r>
         <w:t xml:space="preserve"> </w:t>
@@ -10156,7 +10156,7 @@
         <w:t xml:space="preserve"> </w:t>
       </w:r>
       <w:r>
-        <w:t xml:space="preserve">y los modelos del Proxecto Nós son recursos publicados por la USC; Whisper (OpenAI) se distribuye con licencia permisiva; sherpa-onnx es software libre. El dataset de evaluación de repetición espaciada empleado en §9 (FSRS/Anki revlogs) [12] se distribuye con licencia MIT. Se justifica el uso de cada componente por la</w:t>
+        <w:t xml:space="preserve">y los modelos del Proxecto Nós son recursos publicados por la USC; Whisper (OpenAI) se distribuye con licencia permisiva; sherpa-onnx es software libre. El dataset de evaluación de repetición espaciada empleado en §9 (FSRS/Anki revlogs) [16] se distribuye con licencia MIT. Se justifica el uso de cada componente por la</w:t>
       </w:r>
       <w:r>
         <w:t xml:space="preserve"> </w:t>
@@ -11202,7 +11202,7 @@
               <w:pStyle w:val="Compact"/>
             </w:pPr>
             <w:r>
-              <w:t xml:space="preserve">Transiciones &lt; 0,1 s (límite &lt; 1 s) [7].</w:t>
+              <w:t xml:space="preserve">Transiciones &lt; 0,1 s (límite &lt; 1 s) [17].</w:t>
             </w:r>
           </w:p>
         </w:tc>
@@ -12030,7 +12030,7 @@
         <w:t xml:space="preserve"> </w:t>
       </w:r>
       <w:r>
-        <w:t xml:space="preserve">[12], licencia MIT: 3,17 M de repasos, 30 usuarios, 312 195 tarjetas) y (ii) una</w:t>
+        <w:t xml:space="preserve">[16], licencia MIT: 3,17 M de repasos, 30 usuarios, 312 195 tarjetas) y (ii) una</w:t>
       </w:r>
       <w:r>
         <w:t xml:space="preserve"> </w:t>
@@ -17228,7 +17228,7 @@
         <w:t xml:space="preserve"> </w:t>
       </w:r>
       <w:r>
-        <w:t xml:space="preserve">[3] como sucesor de HLR.</w:t>
+        <w:t xml:space="preserve">[6] como sucesor de HLR.</w:t>
       </w:r>
     </w:p>
     <w:p>
@@ -17250,7 +17250,7 @@
         <w:t xml:space="preserve"> </w:t>
       </w:r>
       <w:r>
-        <w:t xml:space="preserve">[4] para dictados con voz natural y dificultad léxica real.</w:t>
+        <w:t xml:space="preserve">[12] para dictados con voz natural y dificultad léxica real.</w:t>
       </w:r>
     </w:p>
     <w:p>
@@ -17334,19 +17334,7 @@
         <w:pStyle w:val="FirstParagraph"/>
       </w:pPr>
       <w:r>
-        <w:t xml:space="preserve">[1] B. Settles and B. Meeder,</w:t>
-      </w:r>
-      <w:r>
-        <w:t xml:space="preserve"> </w:t>
-      </w:r>
-      <w:r>
-        <w:t xml:space="preserve">“A Trainable Spaced Repetition Model for Language Learning,”</w:t>
-      </w:r>
-      <w:r>
-        <w:t xml:space="preserve"> </w:t>
-      </w:r>
-      <w:r>
-        <w:t xml:space="preserve">in</w:t>
+        <w:t xml:space="preserve">[1] H. Ebbinghaus,</w:t>
       </w:r>
       <w:r>
         <w:t xml:space="preserve"> </w:t>
@@ -17356,10 +17344,10 @@
           <w:i/>
           <w:iCs/>
         </w:rPr>
-        <w:t xml:space="preserve">Proc. 54th Annual Meeting of the ACL</w:t>
-      </w:r>
-      <w:r>
-        <w:t xml:space="preserve">, Berlin, 2016, pp. 1848–1858.</w:t>
+        <w:t xml:space="preserve">Über das Gedächtnis: Untersuchungen zur experimentellen Psychologie</w:t>
+      </w:r>
+      <w:r>
+        <w:t xml:space="preserve">. Leipzig: Duncker &amp; Humblot, 1885.</w:t>
       </w:r>
     </w:p>
     <w:p>
@@ -17367,39 +17355,7 @@
         <w:pStyle w:val="BodyText"/>
       </w:pPr>
       <w:r>
-        <w:t xml:space="preserve">[2] P. A. Wozniak,</w:t>
-      </w:r>
-      <w:r>
-        <w:t xml:space="preserve"> </w:t>
-      </w:r>
-      <w:r>
-        <w:t xml:space="preserve">“Optimization of learning,”</w:t>
-      </w:r>
-      <w:r>
-        <w:t xml:space="preserve"> </w:t>
-      </w:r>
-      <w:r>
-        <w:t xml:space="preserve">Master’s thesis, University of Technology in Poznan, 1990.</w:t>
-      </w:r>
-    </w:p>
-    <w:p>
-      <w:pPr>
-        <w:pStyle w:val="BodyText"/>
-      </w:pPr>
-      <w:r>
-        <w:t xml:space="preserve">[3] C. Piech et al.,</w:t>
-      </w:r>
-      <w:r>
-        <w:t xml:space="preserve"> </w:t>
-      </w:r>
-      <w:r>
-        <w:t xml:space="preserve">“Deep Knowledge Tracing,”</w:t>
-      </w:r>
-      <w:r>
-        <w:t xml:space="preserve"> </w:t>
-      </w:r>
-      <w:r>
-        <w:t xml:space="preserve">in</w:t>
+        <w:t xml:space="preserve">[2] S. Leitner,</w:t>
       </w:r>
       <w:r>
         <w:t xml:space="preserve"> </w:t>
@@ -17409,10 +17365,10 @@
           <w:i/>
           <w:iCs/>
         </w:rPr>
-        <w:t xml:space="preserve">Advances in Neural Information Processing Systems (NeurIPS)</w:t>
-      </w:r>
-      <w:r>
-        <w:t xml:space="preserve">, vol. 28, 2015.</w:t>
+        <w:t xml:space="preserve">So lernt man lernen</w:t>
+      </w:r>
+      <w:r>
+        <w:t xml:space="preserve">. Freiburg: Herder, 1972.</w:t>
       </w:r>
     </w:p>
     <w:p>
@@ -17420,19 +17376,19 @@
         <w:pStyle w:val="BodyText"/>
       </w:pPr>
       <w:r>
-        <w:t xml:space="preserve">[4] Instituto da Lingua Galega,</w:t>
-      </w:r>
-      <w:r>
-        <w:t xml:space="preserve"> </w:t>
-      </w:r>
-      <w:r>
-        <w:t xml:space="preserve">“CORILGA: Corpus Oral Informatizado da Lingua Galega,”</w:t>
-      </w:r>
-      <w:r>
-        <w:t xml:space="preserve"> </w:t>
-      </w:r>
-      <w:r>
-        <w:t xml:space="preserve">USC. [En línea]. https://ilg.usc.gal</w:t>
+        <w:t xml:space="preserve">[3] P. A. Woźniak,</w:t>
+      </w:r>
+      <w:r>
+        <w:t xml:space="preserve"> </w:t>
+      </w:r>
+      <w:r>
+        <w:t xml:space="preserve">“Optimization of learning,”</w:t>
+      </w:r>
+      <w:r>
+        <w:t xml:space="preserve"> </w:t>
+      </w:r>
+      <w:r>
+        <w:t xml:space="preserve">Master’s thesis, University of Technology in Poznań, Poznań, Poland, 1990.</w:t>
       </w:r>
     </w:p>
     <w:p>
@@ -17440,33 +17396,7 @@
         <w:pStyle w:val="BodyText"/>
       </w:pPr>
       <w:r>
-        <w:t xml:space="preserve">[5] Instituto da Lingua Galega,</w:t>
-      </w:r>
-      <w:r>
-        <w:t xml:space="preserve"> </w:t>
-      </w:r>
-      <w:r>
-        <w:t xml:space="preserve">“Interoperabilidade de recursos e produción automática de linguaxe natural,”</w:t>
-      </w:r>
-      <w:r>
-        <w:t xml:space="preserve"> </w:t>
-      </w:r>
-      <w:r>
-        <w:t xml:space="preserve">USC. [En línea]. https://ilg.usc.gal</w:t>
-      </w:r>
-    </w:p>
-    <w:p>
-      <w:pPr>
-        <w:pStyle w:val="BodyText"/>
-      </w:pPr>
-      <w:r>
-        <w:t xml:space="preserve">[6] J. C. Pichel Campos,</w:t>
-      </w:r>
-      <w:r>
-        <w:t xml:space="preserve"> </w:t>
-      </w:r>
-      <w:r>
-        <w:t xml:space="preserve">“Carvalho: Un sistema de traducción estadística inglés-galego…,”</w:t>
+        <w:t xml:space="preserve">[4] Open Spaced Repetition,</w:t>
       </w:r>
       <w:r>
         <w:t xml:space="preserve"> </w:t>
@@ -17476,10 +17406,10 @@
           <w:i/>
           <w:iCs/>
         </w:rPr>
-        <w:t xml:space="preserve">Procesamiento del Lenguaje Natural</w:t>
-      </w:r>
-      <w:r>
-        <w:t xml:space="preserve">, SEPLN.</w:t>
+        <w:t xml:space="preserve">Free Spaced Repetition Scheduler (FSRS)</w:t>
+      </w:r>
+      <w:r>
+        <w:t xml:space="preserve">. [En línea]. https://github.com/open-spaced-repetition/free-spaced-repetition-scheduler</w:t>
       </w:r>
     </w:p>
     <w:p>
@@ -17487,27 +17417,19 @@
         <w:pStyle w:val="BodyText"/>
       </w:pPr>
       <w:r>
-        <w:t xml:space="preserve">[7] J. Nielsen,</w:t>
-      </w:r>
-      <w:r>
-        <w:t xml:space="preserve"> </w:t>
-      </w:r>
-      <w:r>
-        <w:t xml:space="preserve">“Response Times: The 3 Important Limits,”</w:t>
-      </w:r>
-      <w:r>
-        <w:t xml:space="preserve"> </w:t>
-      </w:r>
-      <w:r>
-        <w:t xml:space="preserve">Nielsen Norman Group, 1993. [En línea]. https://www.nngroup.com/articles/response-times-3-important-limits/</w:t>
-      </w:r>
-    </w:p>
-    <w:p>
-      <w:pPr>
-        <w:pStyle w:val="BodyText"/>
-      </w:pPr>
-      <w:r>
-        <w:t xml:space="preserve">[8] Proxecto Nós, USC. Recursos de voz e lingua para o galego (voz</w:t>
+        <w:t xml:space="preserve">[5] B. Settles and B. Meeder,</w:t>
+      </w:r>
+      <w:r>
+        <w:t xml:space="preserve"> </w:t>
+      </w:r>
+      <w:r>
+        <w:t xml:space="preserve">“A Trainable Spaced Repetition Model for Language Learning,”</w:t>
+      </w:r>
+      <w:r>
+        <w:t xml:space="preserve"> </w:t>
+      </w:r>
+      <w:r>
+        <w:t xml:space="preserve">in</w:t>
       </w:r>
       <w:r>
         <w:t xml:space="preserve"> </w:t>
@@ -17517,10 +17439,10 @@
           <w:i/>
           <w:iCs/>
         </w:rPr>
-        <w:t xml:space="preserve">Celtia</w:t>
-      </w:r>
-      <w:r>
-        <w:t xml:space="preserve">; modelos ASR). [En línea]. https://nos.gal</w:t>
+        <w:t xml:space="preserve">Proc. 54th Annual Meeting of the Association for Computational Linguistics (ACL)</w:t>
+      </w:r>
+      <w:r>
+        <w:t xml:space="preserve">, Berlin, Germany, 2016, pp. 1848–1858.</w:t>
       </w:r>
     </w:p>
     <w:p>
@@ -17528,47 +17450,19 @@
         <w:pStyle w:val="BodyText"/>
       </w:pPr>
       <w:r>
-        <w:t xml:space="preserve">[9] A. Radford et al.,</w:t>
-      </w:r>
-      <w:r>
-        <w:t xml:space="preserve"> </w:t>
-      </w:r>
-      <w:r>
-        <w:t xml:space="preserve">“Robust Speech Recognition via Large-Scale Weak Supervision (Whisper),”</w:t>
-      </w:r>
-      <w:r>
-        <w:t xml:space="preserve"> </w:t>
-      </w:r>
-      <w:r>
-        <w:t xml:space="preserve">OpenAI, 2022.</w:t>
-      </w:r>
-    </w:p>
-    <w:p>
-      <w:pPr>
-        <w:pStyle w:val="BodyText"/>
-      </w:pPr>
-      <w:r>
-        <w:t xml:space="preserve">[10] k2-fsa,</w:t>
-      </w:r>
-      <w:r>
-        <w:t xml:space="preserve"> </w:t>
-      </w:r>
-      <w:r>
-        <w:t xml:space="preserve">“sherpa-onnx: Real-time speech recognition and synthesis without internet.”</w:t>
-      </w:r>
-      <w:r>
-        <w:t xml:space="preserve"> </w:t>
-      </w:r>
-      <w:r>
-        <w:t xml:space="preserve">[En línea]. https://github.com/k2-fsa/sherpa-onnx</w:t>
-      </w:r>
-    </w:p>
-    <w:p>
-      <w:pPr>
-        <w:pStyle w:val="BodyText"/>
-      </w:pPr>
-      <w:r>
-        <w:t xml:space="preserve">[11] Consejo de Europa,</w:t>
+        <w:t xml:space="preserve">[6] C. Piech, J. Bassen, J. Huang, S. Ganguli, M. Sahami, L. J. Guibas, and J. Sohl-Dickstein,</w:t>
+      </w:r>
+      <w:r>
+        <w:t xml:space="preserve"> </w:t>
+      </w:r>
+      <w:r>
+        <w:t xml:space="preserve">“Deep Knowledge Tracing,”</w:t>
+      </w:r>
+      <w:r>
+        <w:t xml:space="preserve"> </w:t>
+      </w:r>
+      <w:r>
+        <w:t xml:space="preserve">in</w:t>
       </w:r>
       <w:r>
         <w:t xml:space="preserve"> </w:t>
@@ -17578,10 +17472,10 @@
           <w:i/>
           <w:iCs/>
         </w:rPr>
-        <w:t xml:space="preserve">Marco Común Europeo de Referencia para las lenguas</w:t>
-      </w:r>
-      <w:r>
-        <w:t xml:space="preserve">. Estrasburgo, 2001.</w:t>
+        <w:t xml:space="preserve">Advances in Neural Information Processing Systems (NeurIPS)</w:t>
+      </w:r>
+      <w:r>
+        <w:t xml:space="preserve">, vol. 28, 2015, pp. 505–513.</w:t>
       </w:r>
     </w:p>
     <w:p>
@@ -17589,283 +17483,19 @@
         <w:pStyle w:val="BodyText"/>
       </w:pPr>
       <w:r>
-        <w:t xml:space="preserve">[12] Open Spaced Repetition,</w:t>
-      </w:r>
-      <w:r>
-        <w:t xml:space="preserve"> </w:t>
-      </w:r>
-      <w:r>
-        <w:t xml:space="preserve">“FSRS/Anki review logs dataset (licencia MIT).”</w:t>
-      </w:r>
-      <w:r>
-        <w:t xml:space="preserve"> </w:t>
-      </w:r>
-      <w:r>
-        <w:t xml:space="preserve">[En línea]. https://huggingface.co/datasets/open-spaced-repetition/fsrs-dataset</w:t>
-      </w:r>
-    </w:p>
-    <w:p>
-      <w:r>
-        <w:pict>
-          <v:rect style="width:0;height:1.5pt" o:hralign="center" o:hrstd="t" o:hr="t"/>
-        </w:pict>
-      </w:r>
-    </w:p>
-    <w:p>
-      <w:pPr>
-        <w:pStyle w:val="Heading1"/>
-      </w:pPr>
-      <w:bookmarkStart w:id="115" w:name="_anexos"/>
-      <w:r>
-        <w:t xml:space="preserve">Anexos</w:t>
-      </w:r>
-      <w:bookmarkEnd w:id="115"/>
-    </w:p>
-    <w:p>
-      <w:pPr>
-        <w:pStyle w:val="Heading2"/>
-      </w:pPr>
-      <w:bookmarkStart w:id="116" w:name="_cb06e7e0ea042027c7d6b3cfe3d16c83d28a26e"/>
-      <w:r>
-        <w:t xml:space="preserve">Anexo A. Manual de despliegue</w:t>
-      </w:r>
-      <w:bookmarkEnd w:id="116"/>
-    </w:p>
-    <w:p>
-      <w:pPr>
-        <w:pStyle w:val="FirstParagraph"/>
-      </w:pPr>
-      <w:r>
-        <w:t xml:space="preserve">Backend:</w:t>
-      </w:r>
-      <w:r>
-        <w:t xml:space="preserve"> </w:t>
-      </w:r>
-      <w:r>
-        <w:rPr>
-          <w:rStyle w:val="VerbatimChar"/>
-        </w:rPr>
-        <w:t xml:space="preserve">docker compose up --build</w:t>
-      </w:r>
-      <w:r>
-        <w:t xml:space="preserve"> </w:t>
-      </w:r>
-      <w:r>
-        <w:t xml:space="preserve">(API en</w:t>
-      </w:r>
-      <w:r>
-        <w:t xml:space="preserve"> </w:t>
-      </w:r>
-      <w:r>
-        <w:rPr>
-          <w:rStyle w:val="VerbatimChar"/>
-        </w:rPr>
-        <w:t xml:space="preserve">:8000</w:t>
-      </w:r>
-      <w:r>
-        <w:t xml:space="preserve">). Variables:</w:t>
-      </w:r>
-      <w:r>
-        <w:t xml:space="preserve"> </w:t>
-      </w:r>
-      <w:r>
-        <w:rPr>
-          <w:rStyle w:val="VerbatimChar"/>
-        </w:rPr>
-        <w:t xml:space="preserve">DATABASE_URL</w:t>
-      </w:r>
-      <w:r>
-        <w:t xml:space="preserve">,</w:t>
-      </w:r>
-      <w:r>
-        <w:t xml:space="preserve"> </w:t>
-      </w:r>
-      <w:r>
-        <w:rPr>
-          <w:rStyle w:val="VerbatimChar"/>
-        </w:rPr>
-        <w:t xml:space="preserve">EXPORT_TOKEN</w:t>
-      </w:r>
-      <w:r>
-        <w:t xml:space="preserve">. Endpoints en §6.3. Reentrenamiento:</w:t>
-      </w:r>
-      <w:r>
-        <w:t xml:space="preserve"> </w:t>
-      </w:r>
-      <w:r>
-        <w:rPr>
-          <w:rStyle w:val="VerbatimChar"/>
-        </w:rPr>
-        <w:t xml:space="preserve">python train_hlr.py</w:t>
-      </w:r>
-      <w:r>
-        <w:t xml:space="preserve">; análisis:</w:t>
-      </w:r>
-      <w:r>
-        <w:t xml:space="preserve"> </w:t>
-      </w:r>
-      <w:r>
-        <w:rPr>
-          <w:rStyle w:val="VerbatimChar"/>
-        </w:rPr>
-        <w:t xml:space="preserve">python analisis_beta_remote.py</w:t>
-      </w:r>
-      <w:r>
-        <w:t xml:space="preserve"> </w:t>
-      </w:r>
-      <w:r>
-        <w:t xml:space="preserve">(retención D1/D7). Cliente: comandos en §11.3.</w:t>
-      </w:r>
-    </w:p>
-    <w:p>
-      <w:pPr>
-        <w:pStyle w:val="Heading2"/>
-      </w:pPr>
-      <w:bookmarkStart w:id="117" w:name="_9462d500f0f59901160d3660486e4af9aa92d48"/>
-      <w:r>
-        <w:t xml:space="preserve">Anexo B. Comandos de reproducción</w:t>
-      </w:r>
-      <w:bookmarkEnd w:id="117"/>
-    </w:p>
-    <w:p>
-      <w:pPr>
-        <w:pStyle w:val="SourceCode"/>
-      </w:pPr>
-      <w:r>
-        <w:rPr>
-          <w:rStyle w:val="CommentTok"/>
-        </w:rPr>
-        <w:t xml:space="preserve"># Modelo ASR on-device</w:t>
-      </w:r>
-      <w:r>
-        <w:br/>
-      </w:r>
-      <w:r>
-        <w:rPr>
-          <w:rStyle w:val="FunctionTok"/>
-        </w:rPr>
-        <w:t xml:space="preserve">bash</w:t>
-      </w:r>
-      <w:r>
-        <w:rPr>
-          <w:rStyle w:val="NormalTok"/>
-        </w:rPr>
-        <w:t xml:space="preserve"> tool/fetch_asr_model.sh small</w:t>
-      </w:r>
-      <w:r>
-        <w:br/>
-      </w:r>
-      <w:r>
-        <w:rPr>
-          <w:rStyle w:val="CommentTok"/>
-        </w:rPr>
-        <w:t xml:space="preserve"># Experimento HLR vs SM-2 (datos reales FSRS)</w:t>
-      </w:r>
-      <w:r>
-        <w:br/>
-      </w:r>
-      <w:r>
-        <w:rPr>
-          <w:rStyle w:val="ExtensionTok"/>
-        </w:rPr>
-        <w:t xml:space="preserve">python</w:t>
-      </w:r>
-      <w:r>
-        <w:rPr>
-          <w:rStyle w:val="NormalTok"/>
-        </w:rPr>
-        <w:t xml:space="preserve"> backend/experimentos/hlr_vs_sm2_fsrs.py</w:t>
-      </w:r>
-      <w:r>
-        <w:br/>
-      </w:r>
-      <w:r>
-        <w:rPr>
-          <w:rStyle w:val="CommentTok"/>
-        </w:rPr>
-        <w:t xml:space="preserve"># Simulación con verdad conocida</w:t>
-      </w:r>
-      <w:r>
-        <w:br/>
-      </w:r>
-      <w:r>
-        <w:rPr>
-          <w:rStyle w:val="ExtensionTok"/>
-        </w:rPr>
-        <w:t xml:space="preserve">python</w:t>
-      </w:r>
-      <w:r>
-        <w:rPr>
-          <w:rStyle w:val="NormalTok"/>
-        </w:rPr>
-        <w:t xml:space="preserve"> backend/experimentos/simulacion_hlr.py</w:t>
-      </w:r>
-      <w:r>
-        <w:br/>
-      </w:r>
-      <w:r>
-        <w:rPr>
-          <w:rStyle w:val="CommentTok"/>
-        </w:rPr>
-        <w:t xml:space="preserve"># Traducción de ejercicios (i18n)</w:t>
-      </w:r>
-      <w:r>
-        <w:br/>
-      </w:r>
-      <w:r>
-        <w:rPr>
-          <w:rStyle w:val="ExtensionTok"/>
-        </w:rPr>
-        <w:t xml:space="preserve">python</w:t>
-      </w:r>
-      <w:r>
-        <w:rPr>
-          <w:rStyle w:val="NormalTok"/>
-        </w:rPr>
-        <w:t xml:space="preserve"> tool/i18n_exercises.py</w:t>
-      </w:r>
-    </w:p>
-    <w:p>
-      <w:pPr>
-        <w:pStyle w:val="Heading2"/>
-      </w:pPr>
-      <w:bookmarkStart w:id="118" w:name="_f9b0b437d285cf7775b1298c5655e81e33a4706"/>
-      <w:r>
-        <w:t xml:space="preserve">Anexo C. Corpus de evaluación</w:t>
-      </w:r>
-      <w:bookmarkEnd w:id="118"/>
-    </w:p>
-    <w:p>
-      <w:pPr>
-        <w:pStyle w:val="FirstParagraph"/>
-      </w:pPr>
-      <w:r>
-        <w:rPr>
-          <w:b/>
-          <w:bCs/>
-        </w:rPr>
-        <w:t xml:space="preserve">Resumen:</w:t>
-      </w:r>
-      <w:r>
-        <w:t xml:space="preserve"> </w:t>
-      </w:r>
-      <w:r>
-        <w:t xml:space="preserve">12 unidades, 70 lecciones, 573 ejercicios (Vocabulario 12, Gramática 11, Escucha 12, Ortografía 12, Lectura 11, Pronuncia 12 lecciones). Tipos: opción múltiple (200), huecos (126), traducción (63), emparejar (56), lectura (54), pronunciación (33), dictado (29), ordenar (6), imagen (6). Ejemplo de ejercicio con</w:t>
-      </w:r>
-      <w:r>
-        <w:t xml:space="preserve"> </w:t>
-      </w:r>
-      <w:r>
-        <w:rPr>
-          <w:rStyle w:val="VerbatimChar"/>
-        </w:rPr>
-        <w:t xml:space="preserve">i18n</w:t>
-      </w:r>
-      <w:r>
-        <w:t xml:space="preserve"> </w:t>
-      </w:r>
-      <w:r>
-        <w:t xml:space="preserve">en §5.6.</w:t>
+        <w:t xml:space="preserve">[7] A. Radford, J. W. Kim, T. Xu, G. Brockman, C. McLeavey, and I. Sutskever,</w:t>
+      </w:r>
+      <w:r>
+        <w:t xml:space="preserve"> </w:t>
+      </w:r>
+      <w:r>
+        <w:t xml:space="preserve">“Robust Speech Recognition via Large-Scale Weak Supervision (Whisper),”</w:t>
+      </w:r>
+      <w:r>
+        <w:t xml:space="preserve"> </w:t>
+      </w:r>
+      <w:r>
+        <w:t xml:space="preserve">OpenAI, 2022. arXiv:2212.04356.</w:t>
       </w:r>
     </w:p>
     <w:p>
@@ -17873,26 +17503,253 @@
         <w:pStyle w:val="BodyText"/>
       </w:pPr>
       <w:r>
-        <w:t xml:space="preserve">Resultados del piloto y de la voz: §9.2 y §9.5.</w:t>
-      </w:r>
-    </w:p>
-    <w:p>
-      <w:r>
-        <w:pict>
-          <v:rect style="width:0;height:1.5pt" o:hralign="center" o:hrstd="t" o:hr="t"/>
-        </w:pict>
-      </w:r>
-    </w:p>
-    <w:p>
-      <w:pPr>
-        <w:pStyle w:val="FirstParagraph"/>
-      </w:pPr>
+        <w:t xml:space="preserve">[8] A. Baevski, H. Zhou, A. Mohamed, and M. Auli,</w:t>
+      </w:r>
+      <w:r>
+        <w:t xml:space="preserve"> </w:t>
+      </w:r>
+      <w:r>
+        <w:t xml:space="preserve">“wav2vec 2.0: A Framework for Self-Supervised Learning of Speech Representations,”</w:t>
+      </w:r>
+      <w:r>
+        <w:t xml:space="preserve"> </w:t>
+      </w:r>
+      <w:r>
+        <w:t xml:space="preserve">in</w:t>
+      </w:r>
+      <w:r>
+        <w:t xml:space="preserve"> </w:t>
+      </w:r>
       <w:r>
         <w:rPr>
           <w:i/>
           <w:iCs/>
         </w:rPr>
-        <w:t xml:space="preserve">Fin de la memoria — Ver 4.0.</w:t>
+        <w:t xml:space="preserve">Advances in Neural Information Processing Systems (NeurIPS)</w:t>
+      </w:r>
+      <w:r>
+        <w:t xml:space="preserve">, vol. 33, 2020, pp. 12449–12460.</w:t>
+      </w:r>
+    </w:p>
+    <w:p>
+      <w:pPr>
+        <w:pStyle w:val="BodyText"/>
+      </w:pPr>
+      <w:r>
+        <w:t xml:space="preserve">[9] Proxecto Nós, Universidade de Santiago de Compostela.</w:t>
+      </w:r>
+      <w:r>
+        <w:t xml:space="preserve"> </w:t>
+      </w:r>
+      <w:r>
+        <w:rPr>
+          <w:i/>
+          <w:iCs/>
+        </w:rPr>
+        <w:t xml:space="preserve">Recursos de voz e lingua para o galego</w:t>
+      </w:r>
+      <w:r>
+        <w:t xml:space="preserve"> </w:t>
+      </w:r>
+      <w:r>
+        <w:t xml:space="preserve">(voz</w:t>
+      </w:r>
+      <w:r>
+        <w:t xml:space="preserve"> </w:t>
+      </w:r>
+      <w:r>
+        <w:rPr>
+          <w:i/>
+          <w:iCs/>
+        </w:rPr>
+        <w:t xml:space="preserve">Celtia</w:t>
+      </w:r>
+      <w:r>
+        <w:t xml:space="preserve">; modelos ASR). [En línea]. https://nos.gal</w:t>
+      </w:r>
+    </w:p>
+    <w:p>
+      <w:pPr>
+        <w:pStyle w:val="BodyText"/>
+      </w:pPr>
+      <w:r>
+        <w:t xml:space="preserve">[10] k2-fsa,</w:t>
+      </w:r>
+      <w:r>
+        <w:t xml:space="preserve"> </w:t>
+      </w:r>
+      <w:r>
+        <w:rPr>
+          <w:i/>
+          <w:iCs/>
+        </w:rPr>
+        <w:t xml:space="preserve">sherpa-onnx: Real-time speech recognition and synthesis without internet</w:t>
+      </w:r>
+      <w:r>
+        <w:t xml:space="preserve">. [En línea]. https://github.com/k2-fsa/sherpa-onnx</w:t>
+      </w:r>
+    </w:p>
+    <w:p>
+      <w:pPr>
+        <w:pStyle w:val="BodyText"/>
+      </w:pPr>
+      <w:r>
+        <w:t xml:space="preserve">[11] J. Kim, J. Kong, and J. Son,</w:t>
+      </w:r>
+      <w:r>
+        <w:t xml:space="preserve"> </w:t>
+      </w:r>
+      <w:r>
+        <w:t xml:space="preserve">“Conditional Variational Autoencoder with Adversarial Learning for End-to-End Text-to-Speech (VITS),”</w:t>
+      </w:r>
+      <w:r>
+        <w:t xml:space="preserve"> </w:t>
+      </w:r>
+      <w:r>
+        <w:t xml:space="preserve">in</w:t>
+      </w:r>
+      <w:r>
+        <w:t xml:space="preserve"> </w:t>
+      </w:r>
+      <w:r>
+        <w:rPr>
+          <w:i/>
+          <w:iCs/>
+        </w:rPr>
+        <w:t xml:space="preserve">Proc. 38th International Conference on Machine Learning (ICML)</w:t>
+      </w:r>
+      <w:r>
+        <w:t xml:space="preserve">, 2021, pp. 5530–5540.</w:t>
+      </w:r>
+    </w:p>
+    <w:p>
+      <w:pPr>
+        <w:pStyle w:val="BodyText"/>
+      </w:pPr>
+      <w:r>
+        <w:t xml:space="preserve">[12] X. L. Regueira (dir.),</w:t>
+      </w:r>
+      <w:r>
+        <w:t xml:space="preserve"> </w:t>
+      </w:r>
+      <w:r>
+        <w:rPr>
+          <w:i/>
+          <w:iCs/>
+        </w:rPr>
+        <w:t xml:space="preserve">Corpus Oral Informatizado da Lingua Galega (CORILGA)</w:t>
+      </w:r>
+      <w:r>
+        <w:t xml:space="preserve">. Santiago de Compostela: Instituto da Lingua Galega. [En línea]. https://ilg.usc.gal/corilga/</w:t>
+      </w:r>
+    </w:p>
+    <w:p>
+      <w:pPr>
+        <w:pStyle w:val="BodyText"/>
+      </w:pPr>
+      <w:r>
+        <w:t xml:space="preserve">[13] M. J. Domínguez Vázquez (dir.),</w:t>
+      </w:r>
+      <w:r>
+        <w:t xml:space="preserve"> </w:t>
+      </w:r>
+      <w:r>
+        <w:t xml:space="preserve">“Interoperabilidade de recursos e produción automática de linguaxe natural,”</w:t>
+      </w:r>
+      <w:r>
+        <w:t xml:space="preserve"> </w:t>
+      </w:r>
+      <w:r>
+        <w:t xml:space="preserve">Instituto da Lingua Galega, Universidade de Santiago de Compostela. [En línea]. https://ilg.usc.gal/gl/proxectos/interoperabilidade-de-recursos-e-producion-automatica-de-linguaxe-natural</w:t>
+      </w:r>
+    </w:p>
+    <w:p>
+      <w:pPr>
+        <w:pStyle w:val="BodyText"/>
+      </w:pPr>
+      <w:r>
+        <w:t xml:space="preserve">[14] Consejo de Europa,</w:t>
+      </w:r>
+      <w:r>
+        <w:t xml:space="preserve"> </w:t>
+      </w:r>
+      <w:r>
+        <w:rPr>
+          <w:i/>
+          <w:iCs/>
+        </w:rPr>
+        <w:t xml:space="preserve">Marco Común Europeo de Referencia para las lenguas: aprendizaje, enseñanza, evaluación</w:t>
+      </w:r>
+      <w:r>
+        <w:t xml:space="preserve">. Estrasburgo: Consejo de Europa, 2001.</w:t>
+      </w:r>
+    </w:p>
+    <w:p>
+      <w:pPr>
+        <w:pStyle w:val="BodyText"/>
+      </w:pPr>
+      <w:r>
+        <w:t xml:space="preserve">[15] J. R. Pichel Campos, P. Malvar Fernández, O. Senra Gómez, P. Gamallo Otero, and A. García,</w:t>
+      </w:r>
+      <w:r>
+        <w:t xml:space="preserve"> </w:t>
+      </w:r>
+      <w:r>
+        <w:t xml:space="preserve">“Carvalho: Un sistema de traducción estadística inglés-galego construído a partir do corpus paralelo inglés-portugués EuroParl,”</w:t>
+      </w:r>
+      <w:r>
+        <w:t xml:space="preserve"> </w:t>
+      </w:r>
+      <w:r>
+        <w:rPr>
+          <w:i/>
+          <w:iCs/>
+        </w:rPr>
+        <w:t xml:space="preserve">Procesamiento del Lenguaje Natural</w:t>
+      </w:r>
+      <w:r>
+        <w:t xml:space="preserve">, no. 43, pp. 379–381, 2009.</w:t>
+      </w:r>
+    </w:p>
+    <w:p>
+      <w:pPr>
+        <w:pStyle w:val="BodyText"/>
+      </w:pPr>
+      <w:r>
+        <w:t xml:space="preserve">[16] Open Spaced Repetition,</w:t>
+      </w:r>
+      <w:r>
+        <w:t xml:space="preserve"> </w:t>
+      </w:r>
+      <w:r>
+        <w:rPr>
+          <w:i/>
+          <w:iCs/>
+        </w:rPr>
+        <w:t xml:space="preserve">FSRS/Anki review logs dataset</w:t>
+      </w:r>
+      <w:r>
+        <w:t xml:space="preserve">. [En línea]. https://huggingface.co/datasets/open-spaced-repetition/fsrs-dataset</w:t>
+      </w:r>
+    </w:p>
+    <w:p>
+      <w:pPr>
+        <w:pStyle w:val="BodyText"/>
+      </w:pPr>
+      <w:r>
+        <w:t xml:space="preserve">[17] J. Nielsen,</w:t>
+      </w:r>
+      <w:r>
+        <w:t xml:space="preserve"> </w:t>
+      </w:r>
+      <w:r>
+        <w:t xml:space="preserve">“Response Times: The 3 Important Limits,”</w:t>
+      </w:r>
+      <w:r>
+        <w:t xml:space="preserve"> </w:t>
+      </w:r>
+      <w:r>
+        <w:t xml:space="preserve">Nielsen Norman Group, 1993. [En línea]. https://www.nngroup.com/articles/response-times-3-important-limits/</w:t>
       </w:r>
     </w:p>
     <w:sectPr>

</xml_diff>

<commit_message>
docs(memoria): coherencia (540+33=573, renumerar §9, corrixir cruzada §8.5)
</commit_message>
<xml_diff>
--- a/TFM/TFM Galingo Ver 4.0.docx
+++ b/TFM/TFM Galingo Ver 4.0.docx
@@ -4362,7 +4362,7 @@
               <w:pStyle w:val="Compact"/>
             </w:pPr>
             <w:r>
-              <w:t xml:space="preserve">Banco de 540 preguntas, 12 unidades, tipos de ejercicio.</w:t>
+              <w:t xml:space="preserve">Banco de 540 preguntas (+ 33 de pronuncia = 573 ejercicios), 12 unidades, tipos de ejercicio.</w:t>
             </w:r>
           </w:p>
         </w:tc>
@@ -11821,7 +11821,7 @@
               <w:pStyle w:val="Compact"/>
             </w:pPr>
             <w:r>
-              <w:t xml:space="preserve">validación de voz (§9.5)</w:t>
+              <w:t xml:space="preserve">validación de voz (§9.6)</w:t>
             </w:r>
           </w:p>
         </w:tc>
@@ -12428,9 +12428,9 @@
       <w:pPr>
         <w:pStyle w:val="Heading2"/>
       </w:pPr>
-      <w:bookmarkStart w:id="64" w:name="_07c9936a93631a9dad5e0783177944b04b668fe"/>
-      <w:r>
-        <w:t xml:space="preserve">9.1b Configuración de los experimentos</w:t>
+      <w:bookmarkStart w:id="64" w:name="_23c69684914ffe6ae6b3858df2558e848e05b81"/>
+      <w:r>
+        <w:t xml:space="preserve">9.2 Configuración de los experimentos</w:t>
       </w:r>
       <w:bookmarkEnd w:id="64"/>
     </w:p>
@@ -12628,7 +12628,7 @@
       </w:pPr>
       <w:bookmarkStart w:id="65" w:name="_931e668b4d97aecc6f28239169c031739845507"/>
       <w:r>
-        <w:t xml:space="preserve">9.2 Beta cerrada (piloto)</w:t>
+        <w:t xml:space="preserve">9.3 Beta cerrada (piloto)</w:t>
       </w:r>
       <w:bookmarkEnd w:id="65"/>
     </w:p>
@@ -12856,7 +12856,7 @@
       </w:pPr>
       <w:bookmarkStart w:id="66" w:name="_fca5f9877a04c1f3247f77a389b84fd992cd8eb"/>
       <w:r>
-        <w:t xml:space="preserve">9.3 Retención (D1/D7)</w:t>
+        <w:t xml:space="preserve">9.4 Retención (D1/D7)</w:t>
       </w:r>
       <w:bookmarkEnd w:id="66"/>
     </w:p>
@@ -12887,7 +12887,7 @@
       </w:pPr>
       <w:bookmarkStart w:id="67" w:name="_de3458ce16f128060dc89242ff5d93f95940723"/>
       <w:r>
-        <w:t xml:space="preserve">9.4 Error del modelo (MAE, Brier, AUC-ROC, calibración) y sesgo de programación</w:t>
+        <w:t xml:space="preserve">9.5 Error del modelo (MAE, Brier, AUC-ROC, calibración) y sesgo de programación</w:t>
       </w:r>
       <w:bookmarkEnd w:id="67"/>
     </w:p>
@@ -13831,7 +13831,7 @@
       </w:pPr>
       <w:bookmarkStart w:id="86" w:name="_3346fc10e65fbc61e848ed09a5edc0f67a01927"/>
       <w:r>
-        <w:t xml:space="preserve">9.5 Validación de la capa de voz</w:t>
+        <w:t xml:space="preserve">9.6 Validación de la capa de voz</w:t>
       </w:r>
       <w:bookmarkEnd w:id="86"/>
     </w:p>
@@ -14172,7 +14172,7 @@
       </w:pPr>
       <w:bookmarkStart w:id="87" w:name="_5d693d5222d672587b7b7ebddc53209f99f7690"/>
       <w:r>
-        <w:t xml:space="preserve">9.6 Estado de las hipótesis</w:t>
+        <w:t xml:space="preserve">9.7 Estado de las hipótesis</w:t>
       </w:r>
       <w:bookmarkEnd w:id="87"/>
     </w:p>
@@ -14243,7 +14243,7 @@
       </w:pPr>
       <w:bookmarkStart w:id="88" w:name="_f23831c7b6a366a42d7fc1a798d379c198c1953"/>
       <w:r>
-        <w:t xml:space="preserve">9.7 Interpretación y decisiones derivadas</w:t>
+        <w:t xml:space="preserve">9.8 Interpretación y decisiones derivadas</w:t>
       </w:r>
       <w:bookmarkEnd w:id="88"/>
     </w:p>
@@ -14496,7 +14496,7 @@
         <w:pStyle w:val="FirstParagraph"/>
       </w:pPr>
       <w:r>
-        <w:t xml:space="preserve">La matriz de §8.4 relaciona objetivos, requisitos y pruebas. Cada requisito funcional tiene al menos una prueba o evidencia asociada.</w:t>
+        <w:t xml:space="preserve">La matriz de §8.5 relaciona objetivos, requisitos y pruebas. Cada requisito funcional tiene al menos una prueba o evidencia asociada.</w:t>
       </w:r>
     </w:p>
     <w:p>

</xml_diff>